<commit_message>
Refresh Configuration Using Spring Cloud Bus and Monitor with Webhook Configuration
</commit_message>
<xml_diff>
--- a/Section_6/Configuration_Management.docx
+++ b/Section_6/Configuration_Management.docx
@@ -32,8 +32,8 @@
           <w:rFonts w:cstheme="minorHAnsi"/>
           <w:b/>
           <w:bCs/>
-          <w:sz w:val="24"/>
-          <w:szCs w:val="24"/>
+          <w:sz w:val="28"/>
+          <w:szCs w:val="28"/>
         </w:rPr>
       </w:pPr>
       <w:r>
@@ -41,30 +41,28 @@
           <w:rFonts w:cstheme="minorHAnsi"/>
           <w:b/>
           <w:bCs/>
-          <w:sz w:val="24"/>
-          <w:szCs w:val="24"/>
+          <w:sz w:val="28"/>
+          <w:szCs w:val="28"/>
         </w:rPr>
         <w:t xml:space="preserve">1) Reading Configuration </w:t>
       </w:r>
-      <w:proofErr w:type="gramStart"/>
       <w:r>
         <w:rPr>
           <w:rFonts w:cstheme="minorHAnsi"/>
           <w:b/>
           <w:bCs/>
-          <w:sz w:val="24"/>
-          <w:szCs w:val="24"/>
-        </w:rPr>
-        <w:t>From</w:t>
-      </w:r>
-      <w:proofErr w:type="gramEnd"/>
+          <w:sz w:val="28"/>
+          <w:szCs w:val="28"/>
+        </w:rPr>
+        <w:t>from</w:t>
+      </w:r>
       <w:r>
         <w:rPr>
           <w:rFonts w:cstheme="minorHAnsi"/>
           <w:b/>
           <w:bCs/>
-          <w:sz w:val="24"/>
-          <w:szCs w:val="24"/>
+          <w:sz w:val="28"/>
+          <w:szCs w:val="28"/>
         </w:rPr>
         <w:t xml:space="preserve"> </w:t>
       </w:r>
@@ -74,8 +72,8 @@
           <w:rFonts w:cstheme="minorHAnsi"/>
           <w:b/>
           <w:bCs/>
-          <w:sz w:val="24"/>
-          <w:szCs w:val="24"/>
+          <w:sz w:val="28"/>
+          <w:szCs w:val="28"/>
         </w:rPr>
         <w:t>Classpath</w:t>
       </w:r>
@@ -87,8 +85,8 @@
         <w:ind w:left="284"/>
         <w:rPr>
           <w:rFonts w:cstheme="minorHAnsi"/>
-          <w:sz w:val="24"/>
-          <w:szCs w:val="24"/>
+          <w:sz w:val="28"/>
+          <w:szCs w:val="28"/>
         </w:rPr>
       </w:pPr>
       <w:r>
@@ -96,8 +94,8 @@
           <w:rFonts w:cstheme="minorHAnsi"/>
           <w:b/>
           <w:bCs/>
-          <w:sz w:val="24"/>
-          <w:szCs w:val="24"/>
+          <w:sz w:val="28"/>
+          <w:szCs w:val="28"/>
         </w:rPr>
         <w:t>Step 1: Create a Spring Boot Project for Config Server</w:t>
       </w:r>
@@ -116,15 +114,15 @@
         <w:ind w:left="568" w:hanging="284"/>
         <w:rPr>
           <w:rFonts w:cstheme="minorHAnsi"/>
-          <w:sz w:val="24"/>
-          <w:szCs w:val="24"/>
-        </w:rPr>
-      </w:pPr>
-      <w:r>
-        <w:rPr>
-          <w:rFonts w:cstheme="minorHAnsi"/>
-          <w:sz w:val="24"/>
-          <w:szCs w:val="24"/>
+          <w:sz w:val="28"/>
+          <w:szCs w:val="28"/>
+        </w:rPr>
+      </w:pPr>
+      <w:r>
+        <w:rPr>
+          <w:rFonts w:cstheme="minorHAnsi"/>
+          <w:sz w:val="28"/>
+          <w:szCs w:val="28"/>
         </w:rPr>
         <w:t>Start by creating a new Spring Boot project and name it “</w:t>
       </w:r>
@@ -132,8 +130,8 @@
       <w:r>
         <w:rPr>
           <w:rFonts w:cstheme="minorHAnsi"/>
-          <w:sz w:val="24"/>
-          <w:szCs w:val="24"/>
+          <w:sz w:val="28"/>
+          <w:szCs w:val="28"/>
         </w:rPr>
         <w:t>ConfigServer</w:t>
       </w:r>
@@ -141,8 +139,8 @@
       <w:r>
         <w:rPr>
           <w:rFonts w:cstheme="minorHAnsi"/>
-          <w:sz w:val="24"/>
-          <w:szCs w:val="24"/>
+          <w:sz w:val="28"/>
+          <w:szCs w:val="28"/>
         </w:rPr>
         <w:t>.” This project will serve as a dedicated configuration server to manage the configurations of all microservices.</w:t>
       </w:r>
@@ -151,11 +149,19 @@
       <w:pPr>
         <w:spacing w:line="360" w:lineRule="auto"/>
         <w:ind w:left="284"/>
-      </w:pPr>
-      <w:r>
-        <w:rPr>
+        <w:rPr>
+          <w:rFonts w:cstheme="minorHAnsi"/>
+          <w:sz w:val="28"/>
+          <w:szCs w:val="28"/>
+        </w:rPr>
+      </w:pPr>
+      <w:r>
+        <w:rPr>
+          <w:rFonts w:cstheme="minorHAnsi"/>
           <w:b/>
           <w:bCs/>
+          <w:sz w:val="28"/>
+          <w:szCs w:val="28"/>
         </w:rPr>
         <w:t>Step 2: Add Dependencies</w:t>
       </w:r>
@@ -172,8 +178,18 @@
         </w:tabs>
         <w:spacing w:line="360" w:lineRule="auto"/>
         <w:ind w:left="568" w:hanging="284"/>
-      </w:pPr>
-      <w:r>
+        <w:rPr>
+          <w:rFonts w:cstheme="minorHAnsi"/>
+          <w:sz w:val="28"/>
+          <w:szCs w:val="28"/>
+        </w:rPr>
+      </w:pPr>
+      <w:r>
+        <w:rPr>
+          <w:rFonts w:cstheme="minorHAnsi"/>
+          <w:sz w:val="28"/>
+          <w:szCs w:val="28"/>
+        </w:rPr>
         <w:t>In the pom.xml file, include dependencies for Spring Cloud and Spring Boot Actuator.</w:t>
       </w:r>
     </w:p>
@@ -183,8 +199,8 @@
         <w:ind w:left="284"/>
         <w:rPr>
           <w:rFonts w:cstheme="minorHAnsi"/>
-          <w:sz w:val="24"/>
-          <w:szCs w:val="24"/>
+          <w:sz w:val="28"/>
+          <w:szCs w:val="28"/>
         </w:rPr>
       </w:pPr>
       <w:r>
@@ -192,8 +208,8 @@
           <w:rFonts w:cstheme="minorHAnsi"/>
           <w:b/>
           <w:bCs/>
-          <w:sz w:val="24"/>
-          <w:szCs w:val="24"/>
+          <w:sz w:val="28"/>
+          <w:szCs w:val="28"/>
         </w:rPr>
         <w:t>Step 3: Enable Config Server</w:t>
       </w:r>
@@ -212,15 +228,15 @@
         <w:ind w:left="568" w:hanging="284"/>
         <w:rPr>
           <w:rFonts w:cstheme="minorHAnsi"/>
-          <w:sz w:val="24"/>
-          <w:szCs w:val="24"/>
-        </w:rPr>
-      </w:pPr>
-      <w:r>
-        <w:rPr>
-          <w:rFonts w:cstheme="minorHAnsi"/>
-          <w:sz w:val="24"/>
-          <w:szCs w:val="24"/>
+          <w:sz w:val="28"/>
+          <w:szCs w:val="28"/>
+        </w:rPr>
+      </w:pPr>
+      <w:r>
+        <w:rPr>
+          <w:rFonts w:cstheme="minorHAnsi"/>
+          <w:sz w:val="28"/>
+          <w:szCs w:val="28"/>
         </w:rPr>
         <w:t xml:space="preserve">In the </w:t>
       </w:r>
@@ -228,8 +244,8 @@
       <w:r>
         <w:rPr>
           <w:rFonts w:cstheme="minorHAnsi"/>
-          <w:sz w:val="24"/>
-          <w:szCs w:val="24"/>
+          <w:sz w:val="28"/>
+          <w:szCs w:val="28"/>
         </w:rPr>
         <w:t>ConfigServer</w:t>
       </w:r>
@@ -237,8 +253,8 @@
       <w:r>
         <w:rPr>
           <w:rFonts w:cstheme="minorHAnsi"/>
-          <w:sz w:val="24"/>
-          <w:szCs w:val="24"/>
+          <w:sz w:val="28"/>
+          <w:szCs w:val="28"/>
         </w:rPr>
         <w:t xml:space="preserve"> application, add the @EnableConfigServer annotation. This annotation designates the application as a configuration server responsible for managing the configurations of other microservices.</w:t>
       </w:r>
@@ -249,16 +265,16 @@
         <w:ind w:left="284"/>
         <w:rPr>
           <w:rFonts w:cstheme="minorHAnsi"/>
-          <w:sz w:val="24"/>
-          <w:szCs w:val="24"/>
+          <w:sz w:val="28"/>
+          <w:szCs w:val="28"/>
         </w:rPr>
       </w:pPr>
       <w:r>
         <w:rPr>
           <w:rFonts w:cstheme="minorHAnsi"/>
           <w:noProof/>
-          <w:sz w:val="24"/>
-          <w:szCs w:val="24"/>
+          <w:sz w:val="28"/>
+          <w:szCs w:val="28"/>
         </w:rPr>
         <w:drawing>
           <wp:inline distT="0" distB="0" distL="0" distR="0" wp14:anchorId="4D009D86" wp14:editId="2BA7F14D">
@@ -303,8 +319,8 @@
         <w:ind w:left="284"/>
         <w:rPr>
           <w:rFonts w:cstheme="minorHAnsi"/>
-          <w:sz w:val="24"/>
-          <w:szCs w:val="24"/>
+          <w:sz w:val="28"/>
+          <w:szCs w:val="28"/>
         </w:rPr>
       </w:pPr>
       <w:r>
@@ -312,8 +328,8 @@
           <w:rFonts w:cstheme="minorHAnsi"/>
           <w:b/>
           <w:bCs/>
-          <w:sz w:val="24"/>
-          <w:szCs w:val="24"/>
+          <w:sz w:val="28"/>
+          <w:szCs w:val="28"/>
         </w:rPr>
         <w:t xml:space="preserve">Step 4: Configure </w:t>
       </w:r>
@@ -323,8 +339,8 @@
           <w:rFonts w:cstheme="minorHAnsi"/>
           <w:b/>
           <w:bCs/>
-          <w:sz w:val="24"/>
-          <w:szCs w:val="24"/>
+          <w:sz w:val="28"/>
+          <w:szCs w:val="28"/>
         </w:rPr>
         <w:t>application.yml</w:t>
       </w:r>
@@ -344,15 +360,15 @@
         <w:ind w:left="568" w:hanging="284"/>
         <w:rPr>
           <w:rFonts w:cstheme="minorHAnsi"/>
-          <w:sz w:val="24"/>
-          <w:szCs w:val="24"/>
-        </w:rPr>
-      </w:pPr>
-      <w:r>
-        <w:rPr>
-          <w:rFonts w:cstheme="minorHAnsi"/>
-          <w:sz w:val="24"/>
-          <w:szCs w:val="24"/>
+          <w:sz w:val="28"/>
+          <w:szCs w:val="28"/>
+        </w:rPr>
+      </w:pPr>
+      <w:r>
+        <w:rPr>
+          <w:rFonts w:cstheme="minorHAnsi"/>
+          <w:sz w:val="28"/>
+          <w:szCs w:val="28"/>
         </w:rPr>
         <w:t xml:space="preserve">Set the </w:t>
       </w:r>
@@ -360,8 +376,8 @@
       <w:r>
         <w:rPr>
           <w:rFonts w:cstheme="minorHAnsi"/>
-          <w:sz w:val="24"/>
-          <w:szCs w:val="24"/>
+          <w:sz w:val="28"/>
+          <w:szCs w:val="28"/>
         </w:rPr>
         <w:t>application.yml</w:t>
       </w:r>
@@ -369,8 +385,8 @@
       <w:r>
         <w:rPr>
           <w:rFonts w:cstheme="minorHAnsi"/>
-          <w:sz w:val="24"/>
-          <w:szCs w:val="24"/>
+          <w:sz w:val="28"/>
+          <w:szCs w:val="28"/>
         </w:rPr>
         <w:t xml:space="preserve"> file with a port number (e.g., 8071) and an application name (</w:t>
       </w:r>
@@ -378,8 +394,8 @@
       <w:r>
         <w:rPr>
           <w:rFonts w:cstheme="minorHAnsi"/>
-          <w:sz w:val="24"/>
-          <w:szCs w:val="24"/>
+          <w:sz w:val="28"/>
+          <w:szCs w:val="28"/>
         </w:rPr>
         <w:t>configserver</w:t>
       </w:r>
@@ -387,8 +403,8 @@
       <w:r>
         <w:rPr>
           <w:rFonts w:cstheme="minorHAnsi"/>
-          <w:sz w:val="24"/>
-          <w:szCs w:val="24"/>
+          <w:sz w:val="28"/>
+          <w:szCs w:val="28"/>
         </w:rPr>
         <w:t>). This name will help other microservices identify which server to connect to for configuration.</w:t>
       </w:r>
@@ -407,15 +423,15 @@
         <w:ind w:left="568" w:hanging="284"/>
         <w:rPr>
           <w:rFonts w:cstheme="minorHAnsi"/>
-          <w:sz w:val="24"/>
-          <w:szCs w:val="24"/>
-        </w:rPr>
-      </w:pPr>
-      <w:r>
-        <w:rPr>
-          <w:rFonts w:cstheme="minorHAnsi"/>
-          <w:sz w:val="24"/>
-          <w:szCs w:val="24"/>
+          <w:sz w:val="28"/>
+          <w:szCs w:val="28"/>
+        </w:rPr>
+      </w:pPr>
+      <w:r>
+        <w:rPr>
+          <w:rFonts w:cstheme="minorHAnsi"/>
+          <w:sz w:val="28"/>
+          <w:szCs w:val="28"/>
         </w:rPr>
         <w:t>Add profile configurations by setting the active profile to native. This informs Spring Boot to use the native profile for local property management.</w:t>
       </w:r>
@@ -434,24 +450,25 @@
         <w:ind w:left="568" w:hanging="284"/>
         <w:rPr>
           <w:rFonts w:cstheme="minorHAnsi"/>
-          <w:sz w:val="24"/>
-          <w:szCs w:val="24"/>
-        </w:rPr>
-      </w:pPr>
-      <w:r>
-        <w:rPr>
-          <w:rFonts w:cstheme="minorHAnsi"/>
-          <w:sz w:val="24"/>
-          <w:szCs w:val="24"/>
-        </w:rPr>
+          <w:sz w:val="28"/>
+          <w:szCs w:val="28"/>
+        </w:rPr>
+      </w:pPr>
+      <w:r>
+        <w:rPr>
+          <w:rFonts w:cstheme="minorHAnsi"/>
+          <w:sz w:val="28"/>
+          <w:szCs w:val="28"/>
+        </w:rPr>
+        <w:lastRenderedPageBreak/>
         <w:t xml:space="preserve">Create a config folder and add environment-specific </w:t>
       </w:r>
       <w:proofErr w:type="spellStart"/>
       <w:r>
         <w:rPr>
           <w:rFonts w:cstheme="minorHAnsi"/>
-          <w:sz w:val="24"/>
-          <w:szCs w:val="24"/>
+          <w:sz w:val="28"/>
+          <w:szCs w:val="28"/>
         </w:rPr>
         <w:t>application.yml</w:t>
       </w:r>
@@ -459,8 +476,8 @@
       <w:r>
         <w:rPr>
           <w:rFonts w:cstheme="minorHAnsi"/>
-          <w:sz w:val="24"/>
-          <w:szCs w:val="24"/>
+          <w:sz w:val="28"/>
+          <w:szCs w:val="28"/>
         </w:rPr>
         <w:t xml:space="preserve"> files for each microservice. Name each file according to the microservice and environment. For instance, if the microservice is named accounts, the configuration file for the production environment should be named accounts-</w:t>
       </w:r>
@@ -468,8 +485,8 @@
       <w:r>
         <w:rPr>
           <w:rFonts w:cstheme="minorHAnsi"/>
-          <w:sz w:val="24"/>
-          <w:szCs w:val="24"/>
+          <w:sz w:val="28"/>
+          <w:szCs w:val="28"/>
         </w:rPr>
         <w:t>prod.yml</w:t>
       </w:r>
@@ -477,8 +494,8 @@
       <w:r>
         <w:rPr>
           <w:rFonts w:cstheme="minorHAnsi"/>
-          <w:sz w:val="24"/>
-          <w:szCs w:val="24"/>
+          <w:sz w:val="28"/>
+          <w:szCs w:val="28"/>
         </w:rPr>
         <w:t>, while the file for the QA environment should be accounts-</w:t>
       </w:r>
@@ -486,8 +503,8 @@
       <w:r>
         <w:rPr>
           <w:rFonts w:cstheme="minorHAnsi"/>
-          <w:sz w:val="24"/>
-          <w:szCs w:val="24"/>
+          <w:sz w:val="28"/>
+          <w:szCs w:val="28"/>
         </w:rPr>
         <w:t>qa.yml</w:t>
       </w:r>
@@ -495,8 +512,8 @@
       <w:r>
         <w:rPr>
           <w:rFonts w:cstheme="minorHAnsi"/>
-          <w:sz w:val="24"/>
-          <w:szCs w:val="24"/>
+          <w:sz w:val="28"/>
+          <w:szCs w:val="28"/>
         </w:rPr>
         <w:t>.</w:t>
       </w:r>
@@ -515,25 +532,24 @@
         <w:ind w:left="568" w:hanging="284"/>
         <w:rPr>
           <w:rFonts w:cstheme="minorHAnsi"/>
-          <w:sz w:val="24"/>
-          <w:szCs w:val="24"/>
-        </w:rPr>
-      </w:pPr>
-      <w:r>
-        <w:rPr>
-          <w:rFonts w:cstheme="minorHAnsi"/>
-          <w:sz w:val="24"/>
-          <w:szCs w:val="24"/>
-        </w:rPr>
-        <w:lastRenderedPageBreak/>
+          <w:sz w:val="28"/>
+          <w:szCs w:val="28"/>
+        </w:rPr>
+      </w:pPr>
+      <w:r>
+        <w:rPr>
+          <w:rFonts w:cstheme="minorHAnsi"/>
+          <w:sz w:val="28"/>
+          <w:szCs w:val="28"/>
+        </w:rPr>
         <w:t xml:space="preserve">Specify the file path where the properties are stored. For example, if the YAML configuration files for different environments (production/QA) are stored under </w:t>
       </w:r>
       <w:proofErr w:type="spellStart"/>
       <w:r>
         <w:rPr>
           <w:rFonts w:cstheme="minorHAnsi"/>
-          <w:sz w:val="24"/>
-          <w:szCs w:val="24"/>
+          <w:sz w:val="28"/>
+          <w:szCs w:val="28"/>
         </w:rPr>
         <w:t>classpath</w:t>
       </w:r>
@@ -541,8 +557,8 @@
       <w:r>
         <w:rPr>
           <w:rFonts w:cstheme="minorHAnsi"/>
-          <w:sz w:val="24"/>
-          <w:szCs w:val="24"/>
+          <w:sz w:val="28"/>
+          <w:szCs w:val="28"/>
         </w:rPr>
         <w:t>, add this location in the search-locations variable. This setup enables the configuration server to locate and serve the necessary properties to each microservice.</w:t>
       </w:r>
@@ -553,16 +569,16 @@
         <w:ind w:left="284"/>
         <w:rPr>
           <w:rFonts w:cstheme="minorHAnsi"/>
-          <w:sz w:val="24"/>
-          <w:szCs w:val="24"/>
+          <w:sz w:val="28"/>
+          <w:szCs w:val="28"/>
         </w:rPr>
       </w:pPr>
       <w:r>
         <w:rPr>
           <w:rFonts w:cstheme="minorHAnsi"/>
           <w:noProof/>
-          <w:sz w:val="24"/>
-          <w:szCs w:val="24"/>
+          <w:sz w:val="28"/>
+          <w:szCs w:val="28"/>
         </w:rPr>
         <w:drawing>
           <wp:inline distT="0" distB="0" distL="0" distR="0" wp14:anchorId="64E0E5B8" wp14:editId="22D9C060">
@@ -607,8 +623,8 @@
         <w:ind w:left="284"/>
         <w:rPr>
           <w:rFonts w:cstheme="minorHAnsi"/>
-          <w:sz w:val="24"/>
-          <w:szCs w:val="24"/>
+          <w:sz w:val="28"/>
+          <w:szCs w:val="28"/>
         </w:rPr>
       </w:pPr>
       <w:r>
@@ -616,8 +632,8 @@
           <w:rFonts w:cstheme="minorHAnsi"/>
           <w:b/>
           <w:bCs/>
-          <w:sz w:val="24"/>
-          <w:szCs w:val="24"/>
+          <w:sz w:val="28"/>
+          <w:szCs w:val="28"/>
         </w:rPr>
         <w:t>Step 5: Remove Unnecessary Configuration from Microservices</w:t>
       </w:r>
@@ -636,15 +652,15 @@
         <w:ind w:left="568" w:hanging="284"/>
         <w:rPr>
           <w:rFonts w:cstheme="minorHAnsi"/>
-          <w:sz w:val="24"/>
-          <w:szCs w:val="24"/>
-        </w:rPr>
-      </w:pPr>
-      <w:r>
-        <w:rPr>
-          <w:rFonts w:cstheme="minorHAnsi"/>
-          <w:sz w:val="24"/>
-          <w:szCs w:val="24"/>
+          <w:sz w:val="28"/>
+          <w:szCs w:val="28"/>
+        </w:rPr>
+      </w:pPr>
+      <w:r>
+        <w:rPr>
+          <w:rFonts w:cstheme="minorHAnsi"/>
+          <w:sz w:val="28"/>
+          <w:szCs w:val="28"/>
         </w:rPr>
         <w:t xml:space="preserve">In this step, remove any redundant configuration settings from all microservices, such as </w:t>
       </w:r>
@@ -652,8 +668,8 @@
       <w:r>
         <w:rPr>
           <w:rFonts w:cstheme="minorHAnsi"/>
-          <w:sz w:val="24"/>
-          <w:szCs w:val="24"/>
+          <w:sz w:val="28"/>
+          <w:szCs w:val="28"/>
         </w:rPr>
         <w:t>spring.</w:t>
       </w:r>
@@ -661,8 +677,8 @@
       <w:r>
         <w:rPr>
           <w:rFonts w:cstheme="minorHAnsi"/>
-          <w:sz w:val="24"/>
-          <w:szCs w:val="24"/>
+          <w:sz w:val="28"/>
+          <w:szCs w:val="28"/>
         </w:rPr>
         <w:t>config.activate</w:t>
       </w:r>
@@ -670,8 +686,8 @@
       <w:r>
         <w:rPr>
           <w:rFonts w:cstheme="minorHAnsi"/>
-          <w:sz w:val="24"/>
-          <w:szCs w:val="24"/>
+          <w:sz w:val="28"/>
+          <w:szCs w:val="28"/>
         </w:rPr>
         <w:t>.on</w:t>
       </w:r>
@@ -679,8 +695,8 @@
       <w:r>
         <w:rPr>
           <w:rFonts w:cstheme="minorHAnsi"/>
-          <w:sz w:val="24"/>
-          <w:szCs w:val="24"/>
+          <w:sz w:val="28"/>
+          <w:szCs w:val="28"/>
         </w:rPr>
         <w:t>-profile: “</w:t>
       </w:r>
@@ -688,8 +704,8 @@
       <w:r>
         <w:rPr>
           <w:rFonts w:cstheme="minorHAnsi"/>
-          <w:sz w:val="24"/>
-          <w:szCs w:val="24"/>
+          <w:sz w:val="28"/>
+          <w:szCs w:val="28"/>
         </w:rPr>
         <w:t>qa</w:t>
       </w:r>
@@ -697,8 +713,8 @@
       <w:r>
         <w:rPr>
           <w:rFonts w:cstheme="minorHAnsi"/>
-          <w:sz w:val="24"/>
-          <w:szCs w:val="24"/>
+          <w:sz w:val="28"/>
+          <w:szCs w:val="28"/>
         </w:rPr>
         <w:t>”. Since we are now using Spring Cloud Config to centralize and manage configurations, these individual settings within each microservice are no longer needed.</w:t>
       </w:r>
@@ -717,16 +733,17 @@
         <w:ind w:left="568" w:hanging="284"/>
         <w:rPr>
           <w:rFonts w:cstheme="minorHAnsi"/>
-          <w:sz w:val="24"/>
-          <w:szCs w:val="24"/>
-        </w:rPr>
-      </w:pPr>
-      <w:r>
-        <w:rPr>
-          <w:rFonts w:cstheme="minorHAnsi"/>
-          <w:sz w:val="24"/>
-          <w:szCs w:val="24"/>
-        </w:rPr>
+          <w:sz w:val="28"/>
+          <w:szCs w:val="28"/>
+        </w:rPr>
+      </w:pPr>
+      <w:r>
+        <w:rPr>
+          <w:rFonts w:cstheme="minorHAnsi"/>
+          <w:sz w:val="28"/>
+          <w:szCs w:val="28"/>
+        </w:rPr>
+        <w:lastRenderedPageBreak/>
         <w:t>By removing these configurations, we ensure that each microservice relies solely on the configuration provided by the central Config Server, streamlining the configuration process across all services.</w:t>
       </w:r>
     </w:p>
@@ -744,15 +761,15 @@
         <w:ind w:left="568" w:hanging="284"/>
         <w:rPr>
           <w:rFonts w:cstheme="minorHAnsi"/>
-          <w:sz w:val="24"/>
-          <w:szCs w:val="24"/>
-        </w:rPr>
-      </w:pPr>
-      <w:r>
-        <w:rPr>
-          <w:rFonts w:cstheme="minorHAnsi"/>
-          <w:sz w:val="24"/>
-          <w:szCs w:val="24"/>
+          <w:sz w:val="28"/>
+          <w:szCs w:val="28"/>
+        </w:rPr>
+      </w:pPr>
+      <w:r>
+        <w:rPr>
+          <w:rFonts w:cstheme="minorHAnsi"/>
+          <w:sz w:val="28"/>
+          <w:szCs w:val="28"/>
         </w:rPr>
         <w:t>Keep environment-specific properties like build version and contact information, as these will vary based on the environment and should remain unique to each service.</w:t>
       </w:r>
@@ -763,18 +780,17 @@
         <w:ind w:left="284"/>
         <w:rPr>
           <w:rFonts w:cstheme="minorHAnsi"/>
-          <w:sz w:val="24"/>
-          <w:szCs w:val="24"/>
+          <w:sz w:val="28"/>
+          <w:szCs w:val="28"/>
         </w:rPr>
       </w:pPr>
       <w:r>
         <w:rPr>
           <w:rFonts w:cstheme="minorHAnsi"/>
           <w:noProof/>
-          <w:sz w:val="24"/>
-          <w:szCs w:val="24"/>
-        </w:rPr>
-        <w:lastRenderedPageBreak/>
+          <w:sz w:val="28"/>
+          <w:szCs w:val="28"/>
+        </w:rPr>
         <w:drawing>
           <wp:inline distT="0" distB="0" distL="0" distR="0" wp14:anchorId="16B5F85F" wp14:editId="5E0611A7">
             <wp:extent cx="4114800" cy="2648223"/>
@@ -818,8 +834,8 @@
         <w:ind w:left="284"/>
         <w:rPr>
           <w:rFonts w:cstheme="minorHAnsi"/>
-          <w:sz w:val="24"/>
-          <w:szCs w:val="24"/>
+          <w:sz w:val="28"/>
+          <w:szCs w:val="28"/>
         </w:rPr>
       </w:pPr>
       <w:r>
@@ -827,8 +843,8 @@
           <w:rFonts w:cstheme="minorHAnsi"/>
           <w:b/>
           <w:bCs/>
-          <w:sz w:val="24"/>
-          <w:szCs w:val="24"/>
+          <w:sz w:val="28"/>
+          <w:szCs w:val="28"/>
         </w:rPr>
         <w:t>Step 6: Run the Config Server</w:t>
       </w:r>
@@ -847,15 +863,15 @@
         <w:ind w:left="568" w:hanging="284"/>
         <w:rPr>
           <w:rFonts w:cstheme="minorHAnsi"/>
-          <w:sz w:val="24"/>
-          <w:szCs w:val="24"/>
-        </w:rPr>
-      </w:pPr>
-      <w:r>
-        <w:rPr>
-          <w:rFonts w:cstheme="minorHAnsi"/>
-          <w:sz w:val="24"/>
-          <w:szCs w:val="24"/>
+          <w:sz w:val="28"/>
+          <w:szCs w:val="28"/>
+        </w:rPr>
+      </w:pPr>
+      <w:r>
+        <w:rPr>
+          <w:rFonts w:cstheme="minorHAnsi"/>
+          <w:sz w:val="28"/>
+          <w:szCs w:val="28"/>
         </w:rPr>
         <w:t>Start the Config Server on port 8071.</w:t>
       </w:r>
@@ -874,15 +890,15 @@
         <w:ind w:left="568" w:hanging="284"/>
         <w:rPr>
           <w:rFonts w:cstheme="minorHAnsi"/>
-          <w:sz w:val="24"/>
-          <w:szCs w:val="24"/>
-        </w:rPr>
-      </w:pPr>
-      <w:r>
-        <w:rPr>
-          <w:rFonts w:cstheme="minorHAnsi"/>
-          <w:sz w:val="24"/>
-          <w:szCs w:val="24"/>
+          <w:sz w:val="28"/>
+          <w:szCs w:val="28"/>
+        </w:rPr>
+      </w:pPr>
+      <w:r>
+        <w:rPr>
+          <w:rFonts w:cstheme="minorHAnsi"/>
+          <w:sz w:val="28"/>
+          <w:szCs w:val="28"/>
         </w:rPr>
         <w:t>To verify the setup, navigate to http://localhost:8071/accounts/prod in your browser. This URL requests the configuration details (such as contact-info) for the accounts microservice in the prod environment.</w:t>
       </w:r>
@@ -901,15 +917,15 @@
         <w:ind w:left="568" w:hanging="284"/>
         <w:rPr>
           <w:rFonts w:cstheme="minorHAnsi"/>
-          <w:sz w:val="24"/>
-          <w:szCs w:val="24"/>
-        </w:rPr>
-      </w:pPr>
-      <w:r>
-        <w:rPr>
-          <w:rFonts w:cstheme="minorHAnsi"/>
-          <w:sz w:val="24"/>
-          <w:szCs w:val="24"/>
+          <w:sz w:val="28"/>
+          <w:szCs w:val="28"/>
+        </w:rPr>
+      </w:pPr>
+      <w:r>
+        <w:rPr>
+          <w:rFonts w:cstheme="minorHAnsi"/>
+          <w:sz w:val="28"/>
+          <w:szCs w:val="28"/>
         </w:rPr>
         <w:t>If configured correctly, this endpoint should return the configuration details specific to the requested microservice and environment.</w:t>
       </w:r>
@@ -920,17 +936,18 @@
         <w:ind w:left="644"/>
         <w:rPr>
           <w:rFonts w:cstheme="minorHAnsi"/>
-          <w:sz w:val="24"/>
-          <w:szCs w:val="24"/>
+          <w:sz w:val="28"/>
+          <w:szCs w:val="28"/>
         </w:rPr>
       </w:pPr>
       <w:r>
         <w:rPr>
           <w:rFonts w:cstheme="minorHAnsi"/>
           <w:noProof/>
-          <w:sz w:val="24"/>
-          <w:szCs w:val="24"/>
-        </w:rPr>
+          <w:sz w:val="28"/>
+          <w:szCs w:val="28"/>
+        </w:rPr>
+        <w:lastRenderedPageBreak/>
         <w:drawing>
           <wp:inline distT="0" distB="0" distL="0" distR="0" wp14:anchorId="29E015E7" wp14:editId="14B4F76B">
             <wp:extent cx="4559935" cy="3641481"/>
@@ -974,8 +991,8 @@
         <w:ind w:left="284"/>
         <w:rPr>
           <w:rFonts w:cstheme="minorHAnsi"/>
-          <w:sz w:val="24"/>
-          <w:szCs w:val="24"/>
+          <w:sz w:val="28"/>
+          <w:szCs w:val="28"/>
         </w:rPr>
       </w:pPr>
       <w:r>
@@ -983,10 +1000,9 @@
           <w:rFonts w:cstheme="minorHAnsi"/>
           <w:b/>
           <w:bCs/>
-          <w:sz w:val="24"/>
-          <w:szCs w:val="24"/>
-        </w:rPr>
-        <w:lastRenderedPageBreak/>
+          <w:sz w:val="28"/>
+          <w:szCs w:val="28"/>
+        </w:rPr>
         <w:t>Step 7: Add Config Server Details to Other Microservices</w:t>
       </w:r>
     </w:p>
@@ -1004,15 +1020,15 @@
         <w:ind w:left="1004"/>
         <w:rPr>
           <w:rFonts w:cstheme="minorHAnsi"/>
-          <w:sz w:val="24"/>
-          <w:szCs w:val="24"/>
-        </w:rPr>
-      </w:pPr>
-      <w:r>
-        <w:rPr>
-          <w:rFonts w:cstheme="minorHAnsi"/>
-          <w:sz w:val="24"/>
-          <w:szCs w:val="24"/>
+          <w:sz w:val="28"/>
+          <w:szCs w:val="28"/>
+        </w:rPr>
+      </w:pPr>
+      <w:r>
+        <w:rPr>
+          <w:rFonts w:cstheme="minorHAnsi"/>
+          <w:sz w:val="28"/>
+          <w:szCs w:val="28"/>
         </w:rPr>
         <w:t xml:space="preserve">In the </w:t>
       </w:r>
@@ -1020,8 +1036,8 @@
       <w:r>
         <w:rPr>
           <w:rFonts w:cstheme="minorHAnsi"/>
-          <w:sz w:val="24"/>
-          <w:szCs w:val="24"/>
+          <w:sz w:val="28"/>
+          <w:szCs w:val="28"/>
         </w:rPr>
         <w:t>application.yml</w:t>
       </w:r>
@@ -1029,8 +1045,8 @@
       <w:r>
         <w:rPr>
           <w:rFonts w:cstheme="minorHAnsi"/>
-          <w:sz w:val="24"/>
-          <w:szCs w:val="24"/>
+          <w:sz w:val="28"/>
+          <w:szCs w:val="28"/>
         </w:rPr>
         <w:t xml:space="preserve"> file of each microservice, add the configuration details of the Config Server. This setup ensures that each microservice connects to the Config Server to fetch its configuration upon startup.</w:t>
       </w:r>
@@ -1049,15 +1065,15 @@
         <w:ind w:left="1004"/>
         <w:rPr>
           <w:rFonts w:cstheme="minorHAnsi"/>
-          <w:sz w:val="24"/>
-          <w:szCs w:val="24"/>
-        </w:rPr>
-      </w:pPr>
-      <w:r>
-        <w:rPr>
-          <w:rFonts w:cstheme="minorHAnsi"/>
-          <w:sz w:val="24"/>
-          <w:szCs w:val="24"/>
+          <w:sz w:val="28"/>
+          <w:szCs w:val="28"/>
+        </w:rPr>
+      </w:pPr>
+      <w:r>
+        <w:rPr>
+          <w:rFonts w:cstheme="minorHAnsi"/>
+          <w:sz w:val="28"/>
+          <w:szCs w:val="28"/>
         </w:rPr>
         <w:t xml:space="preserve">To control startup dependencies, ensure the Config Server starts before other microservices by specifying it in the configuration. You can make this connection optional by adding optional: true to the </w:t>
       </w:r>
@@ -1065,8 +1081,8 @@
       <w:r>
         <w:rPr>
           <w:rFonts w:cstheme="minorHAnsi"/>
-          <w:sz w:val="24"/>
-          <w:szCs w:val="24"/>
+          <w:sz w:val="28"/>
+          <w:szCs w:val="28"/>
         </w:rPr>
         <w:t>spring.</w:t>
       </w:r>
@@ -1074,8 +1090,8 @@
       <w:r>
         <w:rPr>
           <w:rFonts w:cstheme="minorHAnsi"/>
-          <w:sz w:val="24"/>
-          <w:szCs w:val="24"/>
+          <w:sz w:val="28"/>
+          <w:szCs w:val="28"/>
         </w:rPr>
         <w:t>config.import</w:t>
       </w:r>
@@ -1084,8 +1100,8 @@
       <w:r>
         <w:rPr>
           <w:rFonts w:cstheme="minorHAnsi"/>
-          <w:sz w:val="24"/>
-          <w:szCs w:val="24"/>
+          <w:sz w:val="28"/>
+          <w:szCs w:val="28"/>
         </w:rPr>
         <w:t xml:space="preserve"> statement, allowing microservices to start even if the Config Server is temporarily unavailable.</w:t>
       </w:r>
@@ -1096,16 +1112,16 @@
         <w:ind w:left="1004"/>
         <w:rPr>
           <w:rFonts w:cstheme="minorHAnsi"/>
-          <w:sz w:val="24"/>
-          <w:szCs w:val="24"/>
+          <w:sz w:val="28"/>
+          <w:szCs w:val="28"/>
         </w:rPr>
       </w:pPr>
       <w:r>
         <w:rPr>
           <w:rFonts w:cstheme="minorHAnsi"/>
           <w:noProof/>
-          <w:sz w:val="24"/>
-          <w:szCs w:val="24"/>
+          <w:sz w:val="28"/>
+          <w:szCs w:val="28"/>
         </w:rPr>
         <w:drawing>
           <wp:inline distT="0" distB="0" distL="0" distR="0" wp14:anchorId="7D8475B2" wp14:editId="5DA425D9">
@@ -1158,15 +1174,15 @@
         <w:ind w:left="1004"/>
         <w:rPr>
           <w:rFonts w:cstheme="minorHAnsi"/>
-          <w:sz w:val="24"/>
-          <w:szCs w:val="24"/>
-        </w:rPr>
-      </w:pPr>
-      <w:r>
-        <w:rPr>
-          <w:rFonts w:cstheme="minorHAnsi"/>
-          <w:sz w:val="24"/>
-          <w:szCs w:val="24"/>
+          <w:sz w:val="28"/>
+          <w:szCs w:val="28"/>
+        </w:rPr>
+      </w:pPr>
+      <w:r>
+        <w:rPr>
+          <w:rFonts w:cstheme="minorHAnsi"/>
+          <w:sz w:val="28"/>
+          <w:szCs w:val="28"/>
         </w:rPr>
         <w:t xml:space="preserve">Specify a unique application name for each microservice in the </w:t>
       </w:r>
@@ -1174,8 +1190,8 @@
       <w:r>
         <w:rPr>
           <w:rFonts w:cstheme="minorHAnsi"/>
-          <w:sz w:val="24"/>
-          <w:szCs w:val="24"/>
+          <w:sz w:val="28"/>
+          <w:szCs w:val="28"/>
         </w:rPr>
         <w:t>application.yml</w:t>
       </w:r>
@@ -1183,17 +1199,26 @@
       <w:r>
         <w:rPr>
           <w:rFonts w:cstheme="minorHAnsi"/>
-          <w:sz w:val="24"/>
-          <w:szCs w:val="24"/>
-        </w:rPr>
-        <w:t xml:space="preserve"> file, matching the file name format used in the config folder of the Config Server. For example, for the accounts microservice, set application.name: accounts so the Config Server can correctly identify and serve the matching configuration file (like accounts-</w:t>
+          <w:sz w:val="28"/>
+          <w:szCs w:val="28"/>
+        </w:rPr>
+        <w:t xml:space="preserve"> file, matching the file name format used in the config folder of the Config Server. For example, for the accounts </w:t>
+      </w:r>
+      <w:r>
+        <w:rPr>
+          <w:rFonts w:cstheme="minorHAnsi"/>
+          <w:sz w:val="28"/>
+          <w:szCs w:val="28"/>
+        </w:rPr>
+        <w:lastRenderedPageBreak/>
+        <w:t>microservice, set application.name: accounts so the Config Server can correctly identify and serve the matching configuration file (like accounts-</w:t>
       </w:r>
       <w:proofErr w:type="spellStart"/>
       <w:r>
         <w:rPr>
           <w:rFonts w:cstheme="minorHAnsi"/>
-          <w:sz w:val="24"/>
-          <w:szCs w:val="24"/>
+          <w:sz w:val="28"/>
+          <w:szCs w:val="28"/>
         </w:rPr>
         <w:t>prod.yml</w:t>
       </w:r>
@@ -1201,8 +1226,8 @@
       <w:r>
         <w:rPr>
           <w:rFonts w:cstheme="minorHAnsi"/>
-          <w:sz w:val="24"/>
-          <w:szCs w:val="24"/>
+          <w:sz w:val="28"/>
+          <w:szCs w:val="28"/>
         </w:rPr>
         <w:t xml:space="preserve"> or accounts-</w:t>
       </w:r>
@@ -1210,8 +1235,8 @@
       <w:r>
         <w:rPr>
           <w:rFonts w:cstheme="minorHAnsi"/>
-          <w:sz w:val="24"/>
-          <w:szCs w:val="24"/>
+          <w:sz w:val="28"/>
+          <w:szCs w:val="28"/>
         </w:rPr>
         <w:t>qa.yml</w:t>
       </w:r>
@@ -1219,8 +1244,8 @@
       <w:r>
         <w:rPr>
           <w:rFonts w:cstheme="minorHAnsi"/>
-          <w:sz w:val="24"/>
-          <w:szCs w:val="24"/>
+          <w:sz w:val="28"/>
+          <w:szCs w:val="28"/>
         </w:rPr>
         <w:t>) based on the environment.</w:t>
       </w:r>
@@ -1228,8 +1253,8 @@
         <w:rPr>
           <w:rFonts w:cstheme="minorHAnsi"/>
           <w:noProof/>
-          <w:sz w:val="24"/>
-          <w:szCs w:val="24"/>
+          <w:sz w:val="28"/>
+          <w:szCs w:val="28"/>
         </w:rPr>
         <w:drawing>
           <wp:inline distT="0" distB="0" distL="0" distR="0" wp14:anchorId="7D4CDD28" wp14:editId="08CD33E2">
@@ -1275,8 +1300,8 @@
           <w:rFonts w:cstheme="minorHAnsi"/>
           <w:b/>
           <w:bCs/>
-          <w:sz w:val="24"/>
-          <w:szCs w:val="24"/>
+          <w:sz w:val="28"/>
+          <w:szCs w:val="28"/>
         </w:rPr>
       </w:pPr>
       <w:r>
@@ -1284,8 +1309,8 @@
           <w:rFonts w:cstheme="minorHAnsi"/>
           <w:b/>
           <w:bCs/>
-          <w:sz w:val="24"/>
-          <w:szCs w:val="24"/>
+          <w:sz w:val="28"/>
+          <w:szCs w:val="28"/>
         </w:rPr>
         <w:t xml:space="preserve">2) Reading Configuration </w:t>
       </w:r>
@@ -1295,8 +1320,8 @@
           <w:rFonts w:cstheme="minorHAnsi"/>
           <w:b/>
           <w:bCs/>
-          <w:sz w:val="24"/>
-          <w:szCs w:val="24"/>
+          <w:sz w:val="28"/>
+          <w:szCs w:val="28"/>
         </w:rPr>
         <w:t>From</w:t>
       </w:r>
@@ -1306,8 +1331,8 @@
           <w:rFonts w:cstheme="minorHAnsi"/>
           <w:b/>
           <w:bCs/>
-          <w:sz w:val="24"/>
-          <w:szCs w:val="24"/>
+          <w:sz w:val="28"/>
+          <w:szCs w:val="28"/>
         </w:rPr>
         <w:t xml:space="preserve"> Git</w:t>
       </w:r>
@@ -1320,8 +1345,8 @@
           <w:rFonts w:cstheme="minorHAnsi"/>
           <w:b/>
           <w:bCs/>
-          <w:sz w:val="24"/>
-          <w:szCs w:val="24"/>
+          <w:sz w:val="28"/>
+          <w:szCs w:val="28"/>
         </w:rPr>
       </w:pPr>
       <w:r>
@@ -1329,8 +1354,8 @@
           <w:rFonts w:cstheme="minorHAnsi"/>
           <w:b/>
           <w:bCs/>
-          <w:sz w:val="24"/>
-          <w:szCs w:val="24"/>
+          <w:sz w:val="28"/>
+          <w:szCs w:val="28"/>
         </w:rPr>
         <w:t>Step 8: Push All Configuration to GitHub</w:t>
       </w:r>
@@ -1344,15 +1369,15 @@
         <w:spacing w:line="360" w:lineRule="auto"/>
         <w:rPr>
           <w:rFonts w:cstheme="minorHAnsi"/>
-          <w:sz w:val="24"/>
-          <w:szCs w:val="24"/>
-        </w:rPr>
-      </w:pPr>
-      <w:r>
-        <w:rPr>
-          <w:rFonts w:cstheme="minorHAnsi"/>
-          <w:sz w:val="24"/>
-          <w:szCs w:val="24"/>
+          <w:sz w:val="28"/>
+          <w:szCs w:val="28"/>
+        </w:rPr>
+      </w:pPr>
+      <w:r>
+        <w:rPr>
+          <w:rFonts w:cstheme="minorHAnsi"/>
+          <w:sz w:val="28"/>
+          <w:szCs w:val="28"/>
         </w:rPr>
         <w:t>Push all configuration files to a private GitHub repository to centralize and secure access to configuration files. This setup prevents developers from accessing configuration files locally, keeping sensitive information safe.</w:t>
       </w:r>
@@ -1366,25 +1391,24 @@
         <w:spacing w:line="360" w:lineRule="auto"/>
         <w:rPr>
           <w:rFonts w:cstheme="minorHAnsi"/>
-          <w:sz w:val="24"/>
-          <w:szCs w:val="24"/>
-        </w:rPr>
-      </w:pPr>
-      <w:r>
-        <w:rPr>
-          <w:rFonts w:cstheme="minorHAnsi"/>
-          <w:sz w:val="24"/>
-          <w:szCs w:val="24"/>
-        </w:rPr>
-        <w:lastRenderedPageBreak/>
+          <w:sz w:val="28"/>
+          <w:szCs w:val="28"/>
+        </w:rPr>
+      </w:pPr>
+      <w:r>
+        <w:rPr>
+          <w:rFonts w:cstheme="minorHAnsi"/>
+          <w:sz w:val="28"/>
+          <w:szCs w:val="28"/>
+        </w:rPr>
         <w:t xml:space="preserve">In the </w:t>
       </w:r>
       <w:proofErr w:type="spellStart"/>
       <w:r>
         <w:rPr>
           <w:rFonts w:cstheme="minorHAnsi"/>
-          <w:sz w:val="24"/>
-          <w:szCs w:val="24"/>
+          <w:sz w:val="28"/>
+          <w:szCs w:val="28"/>
         </w:rPr>
         <w:t>application.yml</w:t>
       </w:r>
@@ -1392,8 +1416,8 @@
       <w:r>
         <w:rPr>
           <w:rFonts w:cstheme="minorHAnsi"/>
-          <w:sz w:val="24"/>
-          <w:szCs w:val="24"/>
+          <w:sz w:val="28"/>
+          <w:szCs w:val="28"/>
         </w:rPr>
         <w:t xml:space="preserve"> file of the Config Server application, configure the following properties:</w:t>
       </w:r>
@@ -1407,15 +1431,15 @@
         <w:spacing w:line="360" w:lineRule="auto"/>
         <w:rPr>
           <w:rFonts w:cstheme="minorHAnsi"/>
-          <w:sz w:val="24"/>
-          <w:szCs w:val="24"/>
-        </w:rPr>
-      </w:pPr>
-      <w:r>
-        <w:rPr>
-          <w:rFonts w:cstheme="minorHAnsi"/>
-          <w:sz w:val="24"/>
-          <w:szCs w:val="24"/>
+          <w:sz w:val="28"/>
+          <w:szCs w:val="28"/>
+        </w:rPr>
+      </w:pPr>
+      <w:r>
+        <w:rPr>
+          <w:rFonts w:cstheme="minorHAnsi"/>
+          <w:sz w:val="28"/>
+          <w:szCs w:val="28"/>
         </w:rPr>
         <w:t xml:space="preserve">Activate Git Profile: Set the </w:t>
       </w:r>
@@ -1424,8 +1448,8 @@
       <w:r>
         <w:rPr>
           <w:rFonts w:cstheme="minorHAnsi"/>
-          <w:sz w:val="24"/>
-          <w:szCs w:val="24"/>
+          <w:sz w:val="28"/>
+          <w:szCs w:val="28"/>
         </w:rPr>
         <w:t>spring.profiles</w:t>
       </w:r>
@@ -1433,8 +1457,8 @@
       <w:r>
         <w:rPr>
           <w:rFonts w:cstheme="minorHAnsi"/>
-          <w:sz w:val="24"/>
-          <w:szCs w:val="24"/>
+          <w:sz w:val="28"/>
+          <w:szCs w:val="28"/>
         </w:rPr>
         <w:t>.active</w:t>
       </w:r>
@@ -1442,8 +1466,8 @@
       <w:r>
         <w:rPr>
           <w:rFonts w:cstheme="minorHAnsi"/>
-          <w:sz w:val="24"/>
-          <w:szCs w:val="24"/>
+          <w:sz w:val="28"/>
+          <w:szCs w:val="28"/>
         </w:rPr>
         <w:t xml:space="preserve"> property to git to enable Git-based configuration.</w:t>
       </w:r>
@@ -1457,15 +1481,15 @@
         <w:spacing w:line="360" w:lineRule="auto"/>
         <w:rPr>
           <w:rFonts w:cstheme="minorHAnsi"/>
-          <w:sz w:val="24"/>
-          <w:szCs w:val="24"/>
-        </w:rPr>
-      </w:pPr>
-      <w:r>
-        <w:rPr>
-          <w:rFonts w:cstheme="minorHAnsi"/>
-          <w:sz w:val="24"/>
-          <w:szCs w:val="24"/>
+          <w:sz w:val="28"/>
+          <w:szCs w:val="28"/>
+        </w:rPr>
+      </w:pPr>
+      <w:r>
+        <w:rPr>
+          <w:rFonts w:cstheme="minorHAnsi"/>
+          <w:sz w:val="28"/>
+          <w:szCs w:val="28"/>
         </w:rPr>
         <w:t xml:space="preserve">Git Configuration: In the </w:t>
       </w:r>
@@ -1474,8 +1498,8 @@
       <w:r>
         <w:rPr>
           <w:rFonts w:cstheme="minorHAnsi"/>
-          <w:sz w:val="24"/>
-          <w:szCs w:val="24"/>
+          <w:sz w:val="28"/>
+          <w:szCs w:val="28"/>
         </w:rPr>
         <w:t>spring.cloud</w:t>
       </w:r>
@@ -1483,8 +1507,8 @@
       <w:r>
         <w:rPr>
           <w:rFonts w:cstheme="minorHAnsi"/>
-          <w:sz w:val="24"/>
-          <w:szCs w:val="24"/>
+          <w:sz w:val="28"/>
+          <w:szCs w:val="28"/>
         </w:rPr>
         <w:t>.config.server</w:t>
       </w:r>
@@ -1492,8 +1516,8 @@
       <w:r>
         <w:rPr>
           <w:rFonts w:cstheme="minorHAnsi"/>
-          <w:sz w:val="24"/>
-          <w:szCs w:val="24"/>
+          <w:sz w:val="28"/>
+          <w:szCs w:val="28"/>
         </w:rPr>
         <w:t xml:space="preserve"> section, specify git as a child property. Define the </w:t>
       </w:r>
@@ -1501,8 +1525,8 @@
       <w:r>
         <w:rPr>
           <w:rFonts w:cstheme="minorHAnsi"/>
-          <w:sz w:val="24"/>
-          <w:szCs w:val="24"/>
+          <w:sz w:val="28"/>
+          <w:szCs w:val="28"/>
         </w:rPr>
         <w:t>uri</w:t>
       </w:r>
@@ -1510,256 +1534,1185 @@
       <w:r>
         <w:rPr>
           <w:rFonts w:cstheme="minorHAnsi"/>
-          <w:sz w:val="24"/>
-          <w:szCs w:val="24"/>
+          <w:sz w:val="28"/>
+          <w:szCs w:val="28"/>
         </w:rPr>
         <w:t xml:space="preserve"> as the URL of the GitHub repository where the configuration files are stored. Also, set the branch property to the branch containing the configuration files, such as main or prod.</w:t>
       </w:r>
     </w:p>
-    <w:p/>
-    <w:p>
-      <w:pPr>
-        <w:rPr>
-          <w:sz w:val="30"/>
-          <w:szCs w:val="30"/>
-        </w:rPr>
-      </w:pPr>
-      <w:r>
-        <w:rPr>
+    <w:p>
+      <w:pPr>
+        <w:rPr>
+          <w:rFonts w:cstheme="minorHAnsi"/>
+        </w:rPr>
+      </w:pPr>
+    </w:p>
+    <w:p>
+      <w:pPr>
+        <w:spacing w:line="360" w:lineRule="auto"/>
+        <w:rPr>
+          <w:rFonts w:cstheme="minorHAnsi"/>
+          <w:sz w:val="34"/>
+          <w:szCs w:val="34"/>
+        </w:rPr>
+      </w:pPr>
+      <w:r>
+        <w:rPr>
+          <w:rFonts w:cstheme="minorHAnsi"/>
           <w:b/>
           <w:bCs/>
-          <w:sz w:val="30"/>
-          <w:szCs w:val="30"/>
+          <w:sz w:val="34"/>
+          <w:szCs w:val="34"/>
           <w:highlight w:val="green"/>
         </w:rPr>
         <w:t>Managing Dynamic Configuration Refresh in Spring Cloud</w:t>
       </w:r>
     </w:p>
     <w:p>
-      <w:r>
+      <w:pPr>
+        <w:spacing w:line="360" w:lineRule="auto"/>
+        <w:rPr>
+          <w:rFonts w:cstheme="minorHAnsi"/>
+          <w:sz w:val="28"/>
+          <w:szCs w:val="28"/>
+        </w:rPr>
+      </w:pPr>
+      <w:r>
+        <w:rPr>
+          <w:rFonts w:cstheme="minorHAnsi"/>
+          <w:sz w:val="28"/>
+          <w:szCs w:val="28"/>
+        </w:rPr>
         <w:t>After successfully centralizing and securing configuration management using GitHub and Spring Cloud, a new challenge arises: applying configuration updates without repeatedly restarting the Config Server. To address this, we can use Spring Boot Actuator for runtime configuration refresh. Here are three effective methods:</w:t>
       </w:r>
     </w:p>
     <w:p>
       <w:pPr>
-        <w:rPr>
+        <w:spacing w:line="360" w:lineRule="auto"/>
+        <w:rPr>
+          <w:rFonts w:cstheme="minorHAnsi"/>
           <w:b/>
           <w:bCs/>
-        </w:rPr>
-      </w:pPr>
-      <w:r>
-        <w:rPr>
+          <w:sz w:val="28"/>
+          <w:szCs w:val="28"/>
+        </w:rPr>
+      </w:pPr>
+      <w:r>
+        <w:rPr>
+          <w:rFonts w:cstheme="minorHAnsi"/>
           <w:b/>
           <w:bCs/>
+          <w:sz w:val="28"/>
+          <w:szCs w:val="28"/>
         </w:rPr>
         <w:t>1) Refresh Configuration at Runtime Using the /refresh Actuator Endpoint</w:t>
+      </w:r>
+    </w:p>
+    <w:p>
+      <w:pPr>
+        <w:spacing w:line="360" w:lineRule="auto"/>
+        <w:rPr>
+          <w:rFonts w:cstheme="minorHAnsi"/>
+          <w:sz w:val="28"/>
+          <w:szCs w:val="28"/>
+        </w:rPr>
+      </w:pPr>
+      <w:r>
+        <w:rPr>
+          <w:rFonts w:cstheme="minorHAnsi"/>
+          <w:sz w:val="28"/>
+          <w:szCs w:val="28"/>
+        </w:rPr>
+        <w:t>To dynamically refresh configuration without restarting the application, we can use the /refresh endpoint provided by Spring Boot Actuator. Follow these steps:</w:t>
       </w:r>
     </w:p>
     <w:p>
       <w:pPr>
         <w:numPr>
           <w:ilvl w:val="0"/>
-          <w:numId w:val="9"/>
+          <w:numId w:val="12"/>
         </w:numPr>
-      </w:pPr>
-      <w:r>
-        <w:rPr>
+        <w:spacing w:line="360" w:lineRule="auto"/>
+        <w:rPr>
+          <w:rFonts w:cstheme="minorHAnsi"/>
+          <w:sz w:val="28"/>
+          <w:szCs w:val="28"/>
+        </w:rPr>
+      </w:pPr>
+      <w:r>
+        <w:rPr>
+          <w:rFonts w:cstheme="minorHAnsi"/>
           <w:b/>
           <w:bCs/>
+          <w:sz w:val="28"/>
+          <w:szCs w:val="28"/>
         </w:rPr>
         <w:t>Enable the /refresh Endpoint</w:t>
       </w:r>
       <w:r>
-        <w:t xml:space="preserve">: Include spring-boot-starter-actuator and </w:t>
+        <w:rPr>
+          <w:rFonts w:cstheme="minorHAnsi"/>
+          <w:sz w:val="28"/>
+          <w:szCs w:val="28"/>
+        </w:rPr>
+        <w:t xml:space="preserve">: In the microservice’s </w:t>
       </w:r>
       <w:proofErr w:type="spellStart"/>
-      <w:proofErr w:type="gramStart"/>
-      <w:r>
-        <w:t>management.endpoints.web.exposure</w:t>
-      </w:r>
-      <w:proofErr w:type="gramEnd"/>
-      <w:r>
-        <w:t>.include</w:t>
+      <w:r>
+        <w:rPr>
+          <w:rFonts w:cstheme="minorHAnsi"/>
+          <w:sz w:val="28"/>
+          <w:szCs w:val="28"/>
+        </w:rPr>
+        <w:t>application.yml</w:t>
       </w:r>
       <w:proofErr w:type="spellEnd"/>
       <w:r>
-        <w:t xml:space="preserve">=refresh in the Config Server’s </w:t>
-      </w:r>
-      <w:proofErr w:type="spellStart"/>
-      <w:r>
-        <w:t>application.yml</w:t>
-      </w:r>
-      <w:proofErr w:type="spellEnd"/>
-      <w:r>
-        <w:t xml:space="preserve"> file to expose the /refresh endpoint.</w:t>
-      </w:r>
-    </w:p>
-    <w:p>
-      <w:pPr>
+        <w:rPr>
+          <w:rFonts w:cstheme="minorHAnsi"/>
+          <w:sz w:val="28"/>
+          <w:szCs w:val="28"/>
+        </w:rPr>
+        <w:t xml:space="preserve"> (e.g., accounts microservice), expose the refresh endpoint by adding the following configuration:</w:t>
+      </w:r>
+    </w:p>
+    <w:p>
+      <w:pPr>
+        <w:spacing w:line="360" w:lineRule="auto"/>
+        <w:ind w:left="720"/>
+        <w:rPr>
+          <w:rFonts w:cstheme="minorHAnsi"/>
+          <w:sz w:val="28"/>
+          <w:szCs w:val="28"/>
+        </w:rPr>
+      </w:pPr>
+      <w:r>
+        <w:rPr>
+          <w:rFonts w:cstheme="minorHAnsi"/>
+          <w:sz w:val="28"/>
+          <w:szCs w:val="28"/>
+        </w:rPr>
+        <w:drawing>
+          <wp:inline distT="0" distB="0" distL="0" distR="0" wp14:anchorId="6E6E303E" wp14:editId="143DA7FF">
+            <wp:extent cx="2343477" cy="1409897"/>
+            <wp:effectExtent l="0" t="0" r="0" b="0"/>
+            <wp:docPr id="1586761365" name="Picture 1"/>
+            <wp:cNvGraphicFramePr>
+              <a:graphicFrameLocks xmlns:a="http://schemas.openxmlformats.org/drawingml/2006/main" noChangeAspect="1"/>
+            </wp:cNvGraphicFramePr>
+            <a:graphic xmlns:a="http://schemas.openxmlformats.org/drawingml/2006/main">
+              <a:graphicData uri="http://schemas.openxmlformats.org/drawingml/2006/picture">
+                <pic:pic xmlns:pic="http://schemas.openxmlformats.org/drawingml/2006/picture">
+                  <pic:nvPicPr>
+                    <pic:cNvPr id="1586761365" name=""/>
+                    <pic:cNvPicPr/>
+                  </pic:nvPicPr>
+                  <pic:blipFill>
+                    <a:blip r:embed="rId11"/>
+                    <a:stretch>
+                      <a:fillRect/>
+                    </a:stretch>
+                  </pic:blipFill>
+                  <pic:spPr>
+                    <a:xfrm>
+                      <a:off x="0" y="0"/>
+                      <a:ext cx="2343477" cy="1409897"/>
+                    </a:xfrm>
+                    <a:prstGeom prst="rect">
+                      <a:avLst/>
+                    </a:prstGeom>
+                  </pic:spPr>
+                </pic:pic>
+              </a:graphicData>
+            </a:graphic>
+          </wp:inline>
+        </w:drawing>
+      </w:r>
+    </w:p>
+    <w:p>
+      <w:pPr>
+        <w:pStyle w:val="ListParagraph"/>
         <w:numPr>
           <w:ilvl w:val="0"/>
-          <w:numId w:val="9"/>
+          <w:numId w:val="12"/>
         </w:numPr>
-      </w:pPr>
-      <w:r>
-        <w:rPr>
+        <w:spacing w:before="100" w:beforeAutospacing="1" w:after="100" w:afterAutospacing="1" w:line="360" w:lineRule="auto"/>
+        <w:rPr>
+          <w:rFonts w:eastAsia="Times New Roman" w:cstheme="minorHAnsi"/>
+          <w:kern w:val="0"/>
+          <w:sz w:val="28"/>
+          <w:szCs w:val="28"/>
+          <w:lang w:eastAsia="en-IN"/>
+          <w14:ligatures w14:val="none"/>
+        </w:rPr>
+      </w:pPr>
+      <w:r>
+        <w:rPr>
+          <w:rFonts w:eastAsia="Times New Roman" w:cstheme="minorHAnsi"/>
           <w:b/>
           <w:bCs/>
+          <w:kern w:val="0"/>
+          <w:sz w:val="28"/>
+          <w:szCs w:val="28"/>
+          <w:lang w:eastAsia="en-IN"/>
+          <w14:ligatures w14:val="none"/>
         </w:rPr>
         <w:t>Trigger Configuration Refresh</w:t>
       </w:r>
       <w:r>
-        <w:t>: After making changes to the configuration files in GitHub, send a POST request to the /refresh endpoint (e.g., http://localhost:8071/actuator/refresh) to refresh the configuration without restarting the Config Server. This action updates configurations for any changes detected in the Config Server.</w:t>
-      </w:r>
-    </w:p>
-    <w:p>
-      <w:pPr>
-        <w:rPr>
+        <w:rPr>
+          <w:rFonts w:eastAsia="Times New Roman" w:cstheme="minorHAnsi"/>
+          <w:kern w:val="0"/>
+          <w:sz w:val="28"/>
+          <w:szCs w:val="28"/>
+          <w:lang w:eastAsia="en-IN"/>
+          <w14:ligatures w14:val="none"/>
+        </w:rPr>
+        <w:t>: After making changes to the configuration file in GitHub, send a POST request to the /refresh endpoint (e.g., http://localhost:8080/actuator/refresh), where 8080 is the port number of the microservice (such as accounts).</w:t>
+      </w:r>
+    </w:p>
+    <w:p>
+      <w:pPr>
+        <w:pStyle w:val="ListParagraph"/>
+        <w:numPr>
+          <w:ilvl w:val="0"/>
+          <w:numId w:val="12"/>
+        </w:numPr>
+        <w:spacing w:before="100" w:beforeAutospacing="1" w:after="100" w:afterAutospacing="1" w:line="360" w:lineRule="auto"/>
+        <w:rPr>
+          <w:rFonts w:eastAsia="Times New Roman" w:cstheme="minorHAnsi"/>
+          <w:kern w:val="0"/>
+          <w:sz w:val="28"/>
+          <w:szCs w:val="28"/>
+          <w:lang w:eastAsia="en-IN"/>
+          <w14:ligatures w14:val="none"/>
+        </w:rPr>
+      </w:pPr>
+      <w:r>
+        <w:rPr>
+          <w:rFonts w:eastAsia="Times New Roman" w:cstheme="minorHAnsi"/>
           <w:b/>
           <w:bCs/>
-        </w:rPr>
-      </w:pPr>
-      <w:r>
-        <w:rPr>
+          <w:kern w:val="0"/>
+          <w:sz w:val="28"/>
+          <w:szCs w:val="28"/>
+          <w:lang w:eastAsia="en-IN"/>
+          <w14:ligatures w14:val="none"/>
+        </w:rPr>
+        <w:t>Effect of Refresh</w:t>
+      </w:r>
+      <w:r>
+        <w:rPr>
+          <w:rFonts w:eastAsia="Times New Roman" w:cstheme="minorHAnsi"/>
+          <w:kern w:val="0"/>
+          <w:sz w:val="28"/>
+          <w:szCs w:val="28"/>
+          <w:lang w:eastAsia="en-IN"/>
+          <w14:ligatures w14:val="none"/>
+        </w:rPr>
+        <w:t xml:space="preserve">: This endpoint checks for changes in the configuration specific to the current microservice. If updates are detected, it applies </w:t>
+      </w:r>
+      <w:r>
+        <w:rPr>
+          <w:rFonts w:eastAsia="Times New Roman" w:cstheme="minorHAnsi"/>
+          <w:kern w:val="0"/>
+          <w:sz w:val="28"/>
+          <w:szCs w:val="28"/>
+          <w:lang w:eastAsia="en-IN"/>
+          <w14:ligatures w14:val="none"/>
+        </w:rPr>
+        <w:lastRenderedPageBreak/>
+        <w:t>them without needing to restart the application. After calling /refresh, the next request to the application will reflect the updated configuration values.</w:t>
+      </w:r>
+    </w:p>
+    <w:p>
+      <w:pPr>
+        <w:pStyle w:val="ListParagraph"/>
+        <w:numPr>
+          <w:ilvl w:val="0"/>
+          <w:numId w:val="12"/>
+        </w:numPr>
+        <w:spacing w:before="100" w:beforeAutospacing="1" w:after="100" w:afterAutospacing="1" w:line="360" w:lineRule="auto"/>
+        <w:rPr>
+          <w:rFonts w:eastAsia="Times New Roman" w:cstheme="minorHAnsi"/>
+          <w:kern w:val="0"/>
+          <w:sz w:val="28"/>
+          <w:szCs w:val="28"/>
+          <w:lang w:eastAsia="en-IN"/>
+          <w14:ligatures w14:val="none"/>
+        </w:rPr>
+      </w:pPr>
+      <w:r>
+        <w:rPr>
+          <w:rFonts w:eastAsia="Times New Roman" w:cstheme="minorHAnsi"/>
+          <w:kern w:val="0"/>
+          <w:sz w:val="28"/>
+          <w:szCs w:val="28"/>
+          <w:lang w:eastAsia="en-IN"/>
+          <w14:ligatures w14:val="none"/>
+        </w:rPr>
+        <w:t xml:space="preserve">In this method we’ve to call /refresh </w:t>
+      </w:r>
+      <w:proofErr w:type="spellStart"/>
+      <w:r>
+        <w:rPr>
+          <w:rFonts w:eastAsia="Times New Roman" w:cstheme="minorHAnsi"/>
+          <w:kern w:val="0"/>
+          <w:sz w:val="28"/>
+          <w:szCs w:val="28"/>
+          <w:lang w:eastAsia="en-IN"/>
+          <w14:ligatures w14:val="none"/>
+        </w:rPr>
+        <w:t>api</w:t>
+      </w:r>
+      <w:proofErr w:type="spellEnd"/>
+      <w:r>
+        <w:rPr>
+          <w:rFonts w:eastAsia="Times New Roman" w:cstheme="minorHAnsi"/>
+          <w:kern w:val="0"/>
+          <w:sz w:val="28"/>
+          <w:szCs w:val="28"/>
+          <w:lang w:eastAsia="en-IN"/>
+          <w14:ligatures w14:val="none"/>
+        </w:rPr>
+        <w:t xml:space="preserve"> in each microservice. And that can be tedious job if we’ve 100 Microservices. And hence there’s another approach we can use which is as below</w:t>
+      </w:r>
+    </w:p>
+    <w:p>
+      <w:pPr>
+        <w:spacing w:line="360" w:lineRule="auto"/>
+        <w:rPr>
+          <w:rFonts w:cstheme="minorHAnsi"/>
           <w:b/>
           <w:bCs/>
+          <w:sz w:val="28"/>
+          <w:szCs w:val="28"/>
+        </w:rPr>
+      </w:pPr>
+      <w:r>
+        <w:rPr>
+          <w:rFonts w:cstheme="minorHAnsi"/>
+          <w:b/>
+          <w:bCs/>
+          <w:sz w:val="28"/>
+          <w:szCs w:val="28"/>
         </w:rPr>
         <w:t>2) Refresh Configurations at Runtime Using Spring Cloud Bus</w:t>
       </w:r>
     </w:p>
     <w:p>
       <w:pPr>
+        <w:spacing w:line="360" w:lineRule="auto"/>
+        <w:rPr>
+          <w:rFonts w:cstheme="minorHAnsi"/>
+          <w:sz w:val="28"/>
+          <w:szCs w:val="28"/>
+        </w:rPr>
+      </w:pPr>
+      <w:r>
+        <w:rPr>
+          <w:rFonts w:cstheme="minorHAnsi"/>
+          <w:sz w:val="28"/>
+          <w:szCs w:val="28"/>
+        </w:rPr>
+        <w:t>To avoid manually calling the /refresh endpoint on each microservice (a time-consuming task when managing many microservices), Spring Cloud Bus offers a solution for broadcasting configuration changes across all services. This setup ensures that configuration updates are applied automatically and simultaneously across the system.</w:t>
+      </w:r>
+    </w:p>
+    <w:p>
+      <w:pPr>
+        <w:pStyle w:val="ListParagraph"/>
         <w:numPr>
           <w:ilvl w:val="0"/>
           <w:numId w:val="10"/>
         </w:numPr>
-      </w:pPr>
-      <w:r>
-        <w:rPr>
+        <w:spacing w:before="100" w:beforeAutospacing="1" w:after="100" w:afterAutospacing="1" w:line="360" w:lineRule="auto"/>
+        <w:rPr>
+          <w:rFonts w:eastAsia="Times New Roman" w:cstheme="minorHAnsi"/>
+          <w:kern w:val="0"/>
+          <w:sz w:val="28"/>
+          <w:szCs w:val="28"/>
+          <w:lang w:eastAsia="en-IN"/>
+          <w14:ligatures w14:val="none"/>
+        </w:rPr>
+      </w:pPr>
+      <w:r>
+        <w:rPr>
+          <w:rFonts w:eastAsia="Times New Roman" w:cstheme="minorHAnsi"/>
           <w:b/>
           <w:bCs/>
+          <w:kern w:val="0"/>
+          <w:sz w:val="28"/>
+          <w:szCs w:val="28"/>
+          <w:lang w:eastAsia="en-IN"/>
+          <w14:ligatures w14:val="none"/>
         </w:rPr>
         <w:t>Spring Cloud Bus Integration</w:t>
       </w:r>
       <w:r>
-        <w:t>: Spring Cloud Bus allows microservices to broadcast state changes (such as configuration updates) across distributed systems using a message broker like RabbitMQ or Kafka.</w:t>
-      </w:r>
-    </w:p>
-    <w:p>
-      <w:pPr>
+        <w:rPr>
+          <w:rFonts w:eastAsia="Times New Roman" w:cstheme="minorHAnsi"/>
+          <w:kern w:val="0"/>
+          <w:sz w:val="28"/>
+          <w:szCs w:val="28"/>
+          <w:lang w:eastAsia="en-IN"/>
+          <w14:ligatures w14:val="none"/>
+        </w:rPr>
+        <w:t>: Spring Cloud Bus utilizes a message broker (e.g., RabbitMQ or Kafka) to propagate configuration changes to all microservices. By listening for state changes, Spring Cloud Bus can broadcast a refresh event whenever a configuration update is detected.</w:t>
+      </w:r>
+    </w:p>
+    <w:p>
+      <w:pPr>
+        <w:pStyle w:val="ListParagraph"/>
         <w:numPr>
           <w:ilvl w:val="0"/>
           <w:numId w:val="10"/>
         </w:numPr>
-      </w:pPr>
-      <w:r>
-        <w:rPr>
+        <w:spacing w:before="100" w:beforeAutospacing="1" w:after="100" w:afterAutospacing="1" w:line="360" w:lineRule="auto"/>
+        <w:rPr>
+          <w:rFonts w:eastAsia="Times New Roman" w:cstheme="minorHAnsi"/>
+          <w:kern w:val="0"/>
+          <w:sz w:val="28"/>
+          <w:szCs w:val="28"/>
+          <w:lang w:eastAsia="en-IN"/>
+          <w14:ligatures w14:val="none"/>
+        </w:rPr>
+      </w:pPr>
+      <w:r>
+        <w:rPr>
+          <w:rFonts w:eastAsia="Times New Roman" w:cstheme="minorHAnsi"/>
           <w:b/>
           <w:bCs/>
-        </w:rPr>
-        <w:t>Automatic Refresh</w:t>
-      </w:r>
-      <w:r>
-        <w:t>: When a configuration file is updated in GitHub, triggering a refresh in the Config Server automatically propagates these changes to all subscribed microservices. This method eliminates the need to manually call the /refresh endpoint on each microservice.</w:t>
-      </w:r>
-    </w:p>
-    <w:p>
-      <w:pPr>
+          <w:kern w:val="0"/>
+          <w:sz w:val="28"/>
+          <w:szCs w:val="28"/>
+          <w:lang w:eastAsia="en-IN"/>
+          <w14:ligatures w14:val="none"/>
+        </w:rPr>
+        <w:t>Automatic Refresh Across Microservices</w:t>
+      </w:r>
+      <w:r>
+        <w:rPr>
+          <w:rFonts w:eastAsia="Times New Roman" w:cstheme="minorHAnsi"/>
+          <w:kern w:val="0"/>
+          <w:sz w:val="28"/>
+          <w:szCs w:val="28"/>
+          <w:lang w:eastAsia="en-IN"/>
+          <w14:ligatures w14:val="none"/>
+        </w:rPr>
+        <w:t>: When you push an update to a configuration file in GitHub, a refresh event triggered in the Config Server will automatically notify all subscribed microservices. This approach eliminates the need to call the /refresh endpoint manually on each service, as all services listen for broadcasted refresh events.</w:t>
+      </w:r>
+    </w:p>
+    <w:p>
+      <w:pPr>
+        <w:pStyle w:val="ListParagraph"/>
         <w:numPr>
           <w:ilvl w:val="0"/>
           <w:numId w:val="10"/>
         </w:numPr>
-      </w:pPr>
-      <w:r>
-        <w:rPr>
+        <w:spacing w:before="100" w:beforeAutospacing="1" w:after="100" w:afterAutospacing="1" w:line="360" w:lineRule="auto"/>
+        <w:rPr>
+          <w:rFonts w:eastAsia="Times New Roman" w:cstheme="minorHAnsi"/>
+          <w:kern w:val="0"/>
+          <w:sz w:val="28"/>
+          <w:szCs w:val="28"/>
+          <w:lang w:eastAsia="en-IN"/>
+          <w14:ligatures w14:val="none"/>
+        </w:rPr>
+      </w:pPr>
+      <w:r>
+        <w:rPr>
+          <w:rFonts w:cstheme="minorHAnsi"/>
           <w:b/>
           <w:bCs/>
-        </w:rPr>
-        <w:t>Configuration Setup</w:t>
-      </w:r>
-      <w:r>
-        <w:t xml:space="preserve">: Add Spring Cloud Bus dependencies in the pom.xml file for both the Config Server and all microservices. Also, configure the message broker (RabbitMQ/Kafka) in </w:t>
-      </w:r>
-      <w:proofErr w:type="spellStart"/>
-      <w:r>
-        <w:t>application.yml</w:t>
-      </w:r>
-      <w:proofErr w:type="spellEnd"/>
-      <w:r>
-        <w:t>.</w:t>
-      </w:r>
-    </w:p>
-    <w:p>
-      <w:pPr>
-        <w:rPr>
+          <w:sz w:val="28"/>
+          <w:szCs w:val="28"/>
+        </w:rPr>
+        <w:t>Configuration Setup:</w:t>
+      </w:r>
+    </w:p>
+    <w:p>
+      <w:pPr>
+        <w:numPr>
+          <w:ilvl w:val="0"/>
+          <w:numId w:val="13"/>
+        </w:numPr>
+        <w:spacing w:line="360" w:lineRule="auto"/>
+        <w:rPr>
+          <w:rFonts w:cstheme="minorHAnsi"/>
+          <w:sz w:val="28"/>
+          <w:szCs w:val="28"/>
+        </w:rPr>
+      </w:pPr>
+      <w:r>
+        <w:rPr>
+          <w:rFonts w:cstheme="minorHAnsi"/>
           <w:b/>
           <w:bCs/>
-        </w:rPr>
-      </w:pPr>
-      <w:r>
-        <w:rPr>
+          <w:sz w:val="28"/>
+          <w:szCs w:val="28"/>
+        </w:rPr>
+        <w:lastRenderedPageBreak/>
+        <w:t xml:space="preserve">Dependencies: </w:t>
+      </w:r>
+      <w:r>
+        <w:rPr>
+          <w:rFonts w:cstheme="minorHAnsi"/>
+          <w:sz w:val="28"/>
+          <w:szCs w:val="28"/>
+        </w:rPr>
+        <w:t>In the pom.xml file of both the Config Server and all microservices, add the necessary Spring Cloud Bus dependencies:</w:t>
+      </w:r>
+      <w:r>
+        <w:rPr>
+          <w:rFonts w:cstheme="minorHAnsi"/>
+          <w:noProof/>
+          <w:sz w:val="28"/>
+          <w:szCs w:val="28"/>
+        </w:rPr>
+        <w:t xml:space="preserve"> </w:t>
+      </w:r>
+      <w:r>
+        <w:rPr>
+          <w:rFonts w:cstheme="minorHAnsi"/>
+          <w:sz w:val="28"/>
+          <w:szCs w:val="28"/>
+        </w:rPr>
+        <w:drawing>
+          <wp:inline distT="0" distB="0" distL="0" distR="0" wp14:anchorId="2CBC96FF" wp14:editId="4CB7DDCF">
+            <wp:extent cx="4533900" cy="741920"/>
+            <wp:effectExtent l="0" t="0" r="0" b="1270"/>
+            <wp:docPr id="57746511" name="Picture 1"/>
+            <wp:cNvGraphicFramePr>
+              <a:graphicFrameLocks xmlns:a="http://schemas.openxmlformats.org/drawingml/2006/main" noChangeAspect="1"/>
+            </wp:cNvGraphicFramePr>
+            <a:graphic xmlns:a="http://schemas.openxmlformats.org/drawingml/2006/main">
+              <a:graphicData uri="http://schemas.openxmlformats.org/drawingml/2006/picture">
+                <pic:pic xmlns:pic="http://schemas.openxmlformats.org/drawingml/2006/picture">
+                  <pic:nvPicPr>
+                    <pic:cNvPr id="57746511" name=""/>
+                    <pic:cNvPicPr/>
+                  </pic:nvPicPr>
+                  <pic:blipFill>
+                    <a:blip r:embed="rId12"/>
+                    <a:stretch>
+                      <a:fillRect/>
+                    </a:stretch>
+                  </pic:blipFill>
+                  <pic:spPr>
+                    <a:xfrm>
+                      <a:off x="0" y="0"/>
+                      <a:ext cx="4572222" cy="748191"/>
+                    </a:xfrm>
+                    <a:prstGeom prst="rect">
+                      <a:avLst/>
+                    </a:prstGeom>
+                  </pic:spPr>
+                </pic:pic>
+              </a:graphicData>
+            </a:graphic>
+          </wp:inline>
+        </w:drawing>
+      </w:r>
+    </w:p>
+    <w:p>
+      <w:pPr>
+        <w:numPr>
+          <w:ilvl w:val="0"/>
+          <w:numId w:val="13"/>
+        </w:numPr>
+        <w:spacing w:line="360" w:lineRule="auto"/>
+        <w:rPr>
+          <w:rFonts w:cstheme="minorHAnsi"/>
+          <w:sz w:val="28"/>
+          <w:szCs w:val="28"/>
+        </w:rPr>
+      </w:pPr>
+      <w:r>
+        <w:rPr>
+          <w:rFonts w:cstheme="minorHAnsi"/>
           <w:b/>
           <w:bCs/>
-        </w:rPr>
-        <w:t>3) Refresh Configuration at Runtime Using Spring Cloud Bus &amp; Spring Cloud Config Monitor</w:t>
-      </w:r>
-    </w:p>
-    <w:p>
-      <w:pPr>
+          <w:sz w:val="28"/>
+          <w:szCs w:val="28"/>
+        </w:rPr>
+        <w:t>Message Broker Configuration</w:t>
+      </w:r>
+      <w:r>
+        <w:rPr>
+          <w:rFonts w:cstheme="minorHAnsi"/>
+          <w:sz w:val="28"/>
+          <w:szCs w:val="28"/>
+        </w:rPr>
+        <w:t xml:space="preserve">: In </w:t>
+      </w:r>
+      <w:proofErr w:type="spellStart"/>
+      <w:r>
+        <w:rPr>
+          <w:rFonts w:cstheme="minorHAnsi"/>
+          <w:sz w:val="28"/>
+          <w:szCs w:val="28"/>
+        </w:rPr>
+        <w:t>application.yml</w:t>
+      </w:r>
+      <w:proofErr w:type="spellEnd"/>
+      <w:r>
+        <w:rPr>
+          <w:rFonts w:cstheme="minorHAnsi"/>
+          <w:sz w:val="28"/>
+          <w:szCs w:val="28"/>
+        </w:rPr>
+        <w:t xml:space="preserve"> for both the Config Server and each microservice, configure the message broker (RabbitMQ/Kafka) settings:</w:t>
+      </w:r>
+    </w:p>
+    <w:p>
+      <w:pPr>
+        <w:spacing w:line="360" w:lineRule="auto"/>
+        <w:ind w:left="1080"/>
+        <w:rPr>
+          <w:rFonts w:cstheme="minorHAnsi"/>
+          <w:sz w:val="28"/>
+          <w:szCs w:val="28"/>
+        </w:rPr>
+      </w:pPr>
+      <w:r>
+        <w:rPr>
+          <w:rFonts w:cstheme="minorHAnsi"/>
+          <w:sz w:val="28"/>
+          <w:szCs w:val="28"/>
+        </w:rPr>
+        <w:drawing>
+          <wp:inline distT="0" distB="0" distL="0" distR="0" wp14:anchorId="543E7F8B" wp14:editId="7CAFCB0A">
+            <wp:extent cx="2867425" cy="1438476"/>
+            <wp:effectExtent l="0" t="0" r="0" b="9525"/>
+            <wp:docPr id="1413016248" name="Picture 1"/>
+            <wp:cNvGraphicFramePr>
+              <a:graphicFrameLocks xmlns:a="http://schemas.openxmlformats.org/drawingml/2006/main" noChangeAspect="1"/>
+            </wp:cNvGraphicFramePr>
+            <a:graphic xmlns:a="http://schemas.openxmlformats.org/drawingml/2006/main">
+              <a:graphicData uri="http://schemas.openxmlformats.org/drawingml/2006/picture">
+                <pic:pic xmlns:pic="http://schemas.openxmlformats.org/drawingml/2006/picture">
+                  <pic:nvPicPr>
+                    <pic:cNvPr id="1413016248" name=""/>
+                    <pic:cNvPicPr/>
+                  </pic:nvPicPr>
+                  <pic:blipFill>
+                    <a:blip r:embed="rId13"/>
+                    <a:stretch>
+                      <a:fillRect/>
+                    </a:stretch>
+                  </pic:blipFill>
+                  <pic:spPr>
+                    <a:xfrm>
+                      <a:off x="0" y="0"/>
+                      <a:ext cx="2867425" cy="1438476"/>
+                    </a:xfrm>
+                    <a:prstGeom prst="rect">
+                      <a:avLst/>
+                    </a:prstGeom>
+                  </pic:spPr>
+                </pic:pic>
+              </a:graphicData>
+            </a:graphic>
+          </wp:inline>
+        </w:drawing>
+      </w:r>
+    </w:p>
+    <w:p>
+      <w:pPr>
+        <w:pStyle w:val="ListParagraph"/>
         <w:numPr>
           <w:ilvl w:val="0"/>
-          <w:numId w:val="11"/>
+          <w:numId w:val="13"/>
         </w:numPr>
-      </w:pPr>
-      <w:r>
-        <w:rPr>
+        <w:spacing w:line="360" w:lineRule="auto"/>
+        <w:rPr>
+          <w:rFonts w:cstheme="minorHAnsi"/>
+          <w:sz w:val="28"/>
+          <w:szCs w:val="28"/>
+        </w:rPr>
+      </w:pPr>
+      <w:r>
+        <w:rPr>
+          <w:rFonts w:cstheme="minorHAnsi"/>
           <w:b/>
           <w:bCs/>
-        </w:rPr>
-        <w:t>Config Monitor Integration</w:t>
-      </w:r>
-      <w:r>
-        <w:t>: The Spring Cloud Config Monitor listens for webhook events from GitHub (or other version control systems). When a configuration file is updated in the repository, the monitor automatically triggers a refresh.</w:t>
+          <w:sz w:val="28"/>
+          <w:szCs w:val="28"/>
+        </w:rPr>
+        <w:t>Trigger Refresh</w:t>
+      </w:r>
+      <w:r>
+        <w:rPr>
+          <w:rFonts w:cstheme="minorHAnsi"/>
+          <w:sz w:val="28"/>
+          <w:szCs w:val="28"/>
+        </w:rPr>
+        <w:t>: After updating configurations in GitHub, a single /refresh call on the Config Server (or webhook event) will broadcast the configuration changes to all microservices automatically.</w:t>
+      </w:r>
+    </w:p>
+    <w:p>
+      <w:pPr>
+        <w:spacing w:line="360" w:lineRule="auto"/>
+        <w:ind w:left="1080"/>
+        <w:rPr>
+          <w:rFonts w:cstheme="minorHAnsi"/>
+          <w:sz w:val="28"/>
+          <w:szCs w:val="28"/>
+        </w:rPr>
+      </w:pPr>
+    </w:p>
+    <w:p>
+      <w:pPr>
+        <w:spacing w:line="360" w:lineRule="auto"/>
+        <w:rPr>
+          <w:rFonts w:cstheme="minorHAnsi"/>
+          <w:b/>
+          <w:bCs/>
+          <w:sz w:val="28"/>
+          <w:szCs w:val="28"/>
+        </w:rPr>
+      </w:pPr>
+      <w:r>
+        <w:rPr>
+          <w:rFonts w:cstheme="minorHAnsi"/>
+          <w:b/>
+          <w:bCs/>
+          <w:sz w:val="28"/>
+          <w:szCs w:val="28"/>
+        </w:rPr>
+        <w:t>3) Refresh Configuration at Runtime Using Spring Cloud Bus &amp; Spring Cloud Config Monitor</w:t>
+      </w:r>
+    </w:p>
+    <w:p>
+      <w:pPr>
+        <w:spacing w:line="360" w:lineRule="auto"/>
+        <w:rPr>
+          <w:rFonts w:cstheme="minorHAnsi"/>
+          <w:sz w:val="28"/>
+          <w:szCs w:val="28"/>
+        </w:rPr>
+      </w:pPr>
+      <w:r>
+        <w:rPr>
+          <w:rFonts w:cstheme="minorHAnsi"/>
+          <w:sz w:val="28"/>
+          <w:szCs w:val="28"/>
+        </w:rPr>
+        <w:t>Spring Cloud Config Monitor simplifies configuration updates by listening for webhook events from GitHub (or any other version control system). This setup automatically triggers a refresh across all microservices whenever configuration files are updated in the repository, minimizing the need for manual refresh calls.</w:t>
       </w:r>
     </w:p>
     <w:p>
       <w:pPr>
         <w:numPr>
           <w:ilvl w:val="0"/>
-          <w:numId w:val="11"/>
+          <w:numId w:val="14"/>
         </w:numPr>
-      </w:pPr>
-      <w:r>
-        <w:rPr>
+        <w:tabs>
+          <w:tab w:val="clear" w:pos="720"/>
+          <w:tab w:val="num" w:pos="284"/>
+        </w:tabs>
+        <w:spacing w:line="360" w:lineRule="auto"/>
+        <w:ind w:left="284" w:hanging="284"/>
+        <w:rPr>
+          <w:rFonts w:cstheme="minorHAnsi"/>
+          <w:sz w:val="28"/>
+          <w:szCs w:val="28"/>
+        </w:rPr>
+      </w:pPr>
+      <w:r>
+        <w:rPr>
+          <w:rFonts w:cstheme="minorHAnsi"/>
           <w:b/>
           <w:bCs/>
+          <w:sz w:val="28"/>
+          <w:szCs w:val="28"/>
         </w:rPr>
         <w:lastRenderedPageBreak/>
-        <w:t>Automatic Trigger on Changes</w:t>
-      </w:r>
-      <w:r>
-        <w:t>: Set up a webhook in your GitHub repository to notify the Config Server of changes. When a commit modifies configuration files, this webhook triggers the Spring Cloud Config Monitor to push updates to all microservices via Spring Cloud Bus, ensuring configurations stay up-to-date without manual intervention.</w:t>
+        <w:t xml:space="preserve">How Spring Cloud Config Monitor Works: </w:t>
+      </w:r>
+      <w:r>
+        <w:rPr>
+          <w:rFonts w:cstheme="minorHAnsi"/>
+          <w:sz w:val="28"/>
+          <w:szCs w:val="28"/>
+        </w:rPr>
+        <w:t>The Config Monitor listens for webhooks from your GitHub repository. When you commit a change to any configuration file, the webhook sends a notification to the Config Server, which then triggers a configuration refresh for all microservices via Spring Cloud Bus.</w:t>
       </w:r>
     </w:p>
     <w:p>
       <w:pPr>
         <w:numPr>
           <w:ilvl w:val="0"/>
-          <w:numId w:val="11"/>
+          <w:numId w:val="14"/>
         </w:numPr>
-      </w:pPr>
-      <w:r>
-        <w:rPr>
+        <w:tabs>
+          <w:tab w:val="clear" w:pos="720"/>
+          <w:tab w:val="num" w:pos="284"/>
+        </w:tabs>
+        <w:spacing w:line="360" w:lineRule="auto"/>
+        <w:ind w:left="284" w:hanging="284"/>
+        <w:rPr>
+          <w:rFonts w:cstheme="minorHAnsi"/>
           <w:b/>
           <w:bCs/>
-        </w:rPr>
-        <w:t>Configuration Requirements</w:t>
-      </w:r>
-      <w:r>
-        <w:t>: Add Spring Cloud Bus and Spring Cloud Config Monitor dependencies to the Config Server’s pom.xml. Then configure the webhook in GitHub to point to your Config Server (e.g., http://your-config-server-url/monitor).</w:t>
-      </w:r>
-    </w:p>
-    <w:p/>
+          <w:sz w:val="28"/>
+          <w:szCs w:val="28"/>
+        </w:rPr>
+      </w:pPr>
+      <w:r>
+        <w:rPr>
+          <w:rFonts w:cstheme="minorHAnsi"/>
+          <w:b/>
+          <w:bCs/>
+          <w:sz w:val="28"/>
+          <w:szCs w:val="28"/>
+        </w:rPr>
+        <w:t>Configuration Requirements:</w:t>
+      </w:r>
+    </w:p>
+    <w:p>
+      <w:pPr>
+        <w:numPr>
+          <w:ilvl w:val="1"/>
+          <w:numId w:val="14"/>
+        </w:numPr>
+        <w:tabs>
+          <w:tab w:val="num" w:pos="568"/>
+        </w:tabs>
+        <w:spacing w:line="360" w:lineRule="auto"/>
+        <w:ind w:left="568" w:hanging="284"/>
+        <w:rPr>
+          <w:rFonts w:cstheme="minorHAnsi"/>
+          <w:sz w:val="28"/>
+          <w:szCs w:val="28"/>
+        </w:rPr>
+      </w:pPr>
+      <w:r>
+        <w:rPr>
+          <w:rFonts w:cstheme="minorHAnsi"/>
+          <w:b/>
+          <w:bCs/>
+          <w:sz w:val="28"/>
+          <w:szCs w:val="28"/>
+        </w:rPr>
+        <w:t xml:space="preserve">Add Required Dependencies: </w:t>
+      </w:r>
+      <w:r>
+        <w:rPr>
+          <w:rFonts w:cstheme="minorHAnsi"/>
+          <w:sz w:val="28"/>
+          <w:szCs w:val="28"/>
+        </w:rPr>
+        <w:t>In the pom.xml file of the Config Server, include both Spring Cloud Bus and Spring Cloud Config Monitor dependencies:</w:t>
+      </w:r>
+    </w:p>
+    <w:p>
+      <w:pPr>
+        <w:numPr>
+          <w:ilvl w:val="1"/>
+          <w:numId w:val="14"/>
+        </w:numPr>
+        <w:tabs>
+          <w:tab w:val="num" w:pos="568"/>
+        </w:tabs>
+        <w:spacing w:line="360" w:lineRule="auto"/>
+        <w:ind w:left="568" w:hanging="284"/>
+        <w:rPr>
+          <w:rFonts w:cstheme="minorHAnsi"/>
+          <w:sz w:val="28"/>
+          <w:szCs w:val="28"/>
+        </w:rPr>
+      </w:pPr>
+      <w:r>
+        <w:rPr>
+          <w:rFonts w:cstheme="minorHAnsi"/>
+          <w:b/>
+          <w:bCs/>
+          <w:sz w:val="28"/>
+          <w:szCs w:val="28"/>
+        </w:rPr>
+        <w:t>Webhook Setup</w:t>
+      </w:r>
+      <w:r>
+        <w:rPr>
+          <w:rFonts w:cstheme="minorHAnsi"/>
+          <w:sz w:val="28"/>
+          <w:szCs w:val="28"/>
+        </w:rPr>
+        <w:t xml:space="preserve">: Configure a webhook in your GitHub repository to notify the Config Server whenever configuration changes occur. Set the webhook’s </w:t>
+      </w:r>
+      <w:r>
+        <w:rPr>
+          <w:rFonts w:cstheme="minorHAnsi"/>
+          <w:b/>
+          <w:bCs/>
+          <w:sz w:val="28"/>
+          <w:szCs w:val="28"/>
+        </w:rPr>
+        <w:t>Payload URL</w:t>
+      </w:r>
+      <w:r>
+        <w:rPr>
+          <w:rFonts w:cstheme="minorHAnsi"/>
+          <w:sz w:val="28"/>
+          <w:szCs w:val="28"/>
+        </w:rPr>
+        <w:t xml:space="preserve"> to the monitor endpoint of your Config Server (e.g., http://your-config-server-url/monitor). Note that if you’re developing locally, this URL must be accessible from the internet.</w:t>
+      </w:r>
+    </w:p>
+    <w:p>
+      <w:pPr>
+        <w:numPr>
+          <w:ilvl w:val="3"/>
+          <w:numId w:val="14"/>
+        </w:numPr>
+        <w:tabs>
+          <w:tab w:val="clear" w:pos="2880"/>
+        </w:tabs>
+        <w:spacing w:line="360" w:lineRule="auto"/>
+        <w:ind w:left="851" w:hanging="284"/>
+        <w:rPr>
+          <w:rFonts w:cstheme="minorHAnsi"/>
+          <w:sz w:val="28"/>
+          <w:szCs w:val="28"/>
+        </w:rPr>
+      </w:pPr>
+      <w:r>
+        <w:rPr>
+          <w:rFonts w:cstheme="minorHAnsi"/>
+          <w:b/>
+          <w:bCs/>
+          <w:sz w:val="28"/>
+          <w:szCs w:val="28"/>
+        </w:rPr>
+        <w:t xml:space="preserve">Using </w:t>
+      </w:r>
+      <w:proofErr w:type="spellStart"/>
+      <w:r>
+        <w:rPr>
+          <w:rFonts w:cstheme="minorHAnsi"/>
+          <w:b/>
+          <w:bCs/>
+          <w:sz w:val="28"/>
+          <w:szCs w:val="28"/>
+        </w:rPr>
+        <w:t>Hookdeck</w:t>
+      </w:r>
+      <w:proofErr w:type="spellEnd"/>
+      <w:r>
+        <w:rPr>
+          <w:rFonts w:cstheme="minorHAnsi"/>
+          <w:b/>
+          <w:bCs/>
+          <w:sz w:val="28"/>
+          <w:szCs w:val="28"/>
+        </w:rPr>
+        <w:t xml:space="preserve"> for Local Development</w:t>
+      </w:r>
+      <w:r>
+        <w:rPr>
+          <w:rFonts w:cstheme="minorHAnsi"/>
+          <w:sz w:val="28"/>
+          <w:szCs w:val="28"/>
+        </w:rPr>
+        <w:t xml:space="preserve">: </w:t>
+      </w:r>
+      <w:proofErr w:type="spellStart"/>
+      <w:r>
+        <w:rPr>
+          <w:rFonts w:cstheme="minorHAnsi"/>
+          <w:sz w:val="28"/>
+          <w:szCs w:val="28"/>
+        </w:rPr>
+        <w:t>Hookdeck</w:t>
+      </w:r>
+      <w:proofErr w:type="spellEnd"/>
+      <w:r>
+        <w:rPr>
+          <w:rFonts w:cstheme="minorHAnsi"/>
+          <w:sz w:val="28"/>
+          <w:szCs w:val="28"/>
+        </w:rPr>
+        <w:t xml:space="preserve"> provides an HTTPS URL that can forward incoming webhook requests to your local server, making it easier to work with local environments. Create an HTTPS URL through </w:t>
+      </w:r>
+      <w:proofErr w:type="spellStart"/>
+      <w:r>
+        <w:rPr>
+          <w:rFonts w:cstheme="minorHAnsi"/>
+          <w:sz w:val="28"/>
+          <w:szCs w:val="28"/>
+        </w:rPr>
+        <w:t>Hookdeck</w:t>
+      </w:r>
+      <w:proofErr w:type="spellEnd"/>
+      <w:r>
+        <w:rPr>
+          <w:rFonts w:cstheme="minorHAnsi"/>
+          <w:sz w:val="28"/>
+          <w:szCs w:val="28"/>
+        </w:rPr>
+        <w:t xml:space="preserve"> and specify it as the payload URL in GitHub. </w:t>
+      </w:r>
+      <w:proofErr w:type="spellStart"/>
+      <w:r>
+        <w:rPr>
+          <w:rFonts w:cstheme="minorHAnsi"/>
+          <w:sz w:val="28"/>
+          <w:szCs w:val="28"/>
+        </w:rPr>
+        <w:t>Hookdeck</w:t>
+      </w:r>
+      <w:proofErr w:type="spellEnd"/>
+      <w:r>
+        <w:rPr>
+          <w:rFonts w:cstheme="minorHAnsi"/>
+          <w:sz w:val="28"/>
+          <w:szCs w:val="28"/>
+        </w:rPr>
+        <w:t xml:space="preserve"> will forward GitHub notifications to your local Config Server, even if it’s running on localhost.</w:t>
+      </w:r>
+    </w:p>
+    <w:p>
+      <w:pPr>
+        <w:numPr>
+          <w:ilvl w:val="3"/>
+          <w:numId w:val="14"/>
+        </w:numPr>
+        <w:spacing w:line="360" w:lineRule="auto"/>
+        <w:ind w:left="851" w:hanging="284"/>
+        <w:rPr>
+          <w:rFonts w:cstheme="minorHAnsi"/>
+          <w:sz w:val="28"/>
+          <w:szCs w:val="28"/>
+        </w:rPr>
+      </w:pPr>
+      <w:r>
+        <w:rPr>
+          <w:rFonts w:cstheme="minorHAnsi"/>
+          <w:b/>
+          <w:bCs/>
+          <w:sz w:val="28"/>
+          <w:szCs w:val="28"/>
+        </w:rPr>
+        <w:t>Webhook Payload Configuration</w:t>
+      </w:r>
+      <w:r>
+        <w:rPr>
+          <w:rFonts w:cstheme="minorHAnsi"/>
+          <w:sz w:val="28"/>
+          <w:szCs w:val="28"/>
+        </w:rPr>
+        <w:t>: In the GitHub webhook settings, set the content type to application/</w:t>
+      </w:r>
+      <w:proofErr w:type="spellStart"/>
+      <w:r>
+        <w:rPr>
+          <w:rFonts w:cstheme="minorHAnsi"/>
+          <w:sz w:val="28"/>
+          <w:szCs w:val="28"/>
+        </w:rPr>
+        <w:t>json</w:t>
+      </w:r>
+      <w:proofErr w:type="spellEnd"/>
+      <w:r>
+        <w:rPr>
+          <w:rFonts w:cstheme="minorHAnsi"/>
+          <w:sz w:val="28"/>
+          <w:szCs w:val="28"/>
+        </w:rPr>
+        <w:t>, and select Just the push event to monitor for changes whenever you push updates to the configuration files.</w:t>
+      </w:r>
+    </w:p>
+    <w:p>
+      <w:pPr>
+        <w:spacing w:line="360" w:lineRule="auto"/>
+        <w:ind w:left="851"/>
+        <w:rPr>
+          <w:rFonts w:cstheme="minorHAnsi"/>
+          <w:sz w:val="28"/>
+          <w:szCs w:val="28"/>
+        </w:rPr>
+      </w:pPr>
+      <w:r>
+        <w:rPr>
+          <w:rFonts w:cstheme="minorHAnsi"/>
+          <w:sz w:val="28"/>
+          <w:szCs w:val="28"/>
+        </w:rPr>
+        <w:lastRenderedPageBreak/>
+        <w:drawing>
+          <wp:inline distT="0" distB="0" distL="0" distR="0" wp14:anchorId="137424E5" wp14:editId="05D33287">
+            <wp:extent cx="4854023" cy="4095750"/>
+            <wp:effectExtent l="0" t="0" r="3810" b="0"/>
+            <wp:docPr id="967742467" name="Picture 1"/>
+            <wp:cNvGraphicFramePr>
+              <a:graphicFrameLocks xmlns:a="http://schemas.openxmlformats.org/drawingml/2006/main" noChangeAspect="1"/>
+            </wp:cNvGraphicFramePr>
+            <a:graphic xmlns:a="http://schemas.openxmlformats.org/drawingml/2006/main">
+              <a:graphicData uri="http://schemas.openxmlformats.org/drawingml/2006/picture">
+                <pic:pic xmlns:pic="http://schemas.openxmlformats.org/drawingml/2006/picture">
+                  <pic:nvPicPr>
+                    <pic:cNvPr id="967742467" name=""/>
+                    <pic:cNvPicPr/>
+                  </pic:nvPicPr>
+                  <pic:blipFill>
+                    <a:blip r:embed="rId14"/>
+                    <a:stretch>
+                      <a:fillRect/>
+                    </a:stretch>
+                  </pic:blipFill>
+                  <pic:spPr>
+                    <a:xfrm>
+                      <a:off x="0" y="0"/>
+                      <a:ext cx="4859256" cy="4100166"/>
+                    </a:xfrm>
+                    <a:prstGeom prst="rect">
+                      <a:avLst/>
+                    </a:prstGeom>
+                  </pic:spPr>
+                </pic:pic>
+              </a:graphicData>
+            </a:graphic>
+          </wp:inline>
+        </w:drawing>
+      </w:r>
+    </w:p>
+    <w:p>
+      <w:pPr>
+        <w:numPr>
+          <w:ilvl w:val="1"/>
+          <w:numId w:val="14"/>
+        </w:numPr>
+        <w:tabs>
+          <w:tab w:val="num" w:pos="568"/>
+        </w:tabs>
+        <w:spacing w:line="360" w:lineRule="auto"/>
+        <w:ind w:left="568" w:hanging="284"/>
+        <w:rPr>
+          <w:rFonts w:cstheme="minorHAnsi"/>
+          <w:sz w:val="28"/>
+          <w:szCs w:val="28"/>
+        </w:rPr>
+      </w:pPr>
+      <w:r>
+        <w:rPr>
+          <w:rFonts w:cstheme="minorHAnsi"/>
+          <w:b/>
+          <w:bCs/>
+          <w:sz w:val="28"/>
+          <w:szCs w:val="28"/>
+        </w:rPr>
+        <w:t>Automatic Trigger on Changes</w:t>
+      </w:r>
+      <w:r>
+        <w:rPr>
+          <w:rFonts w:cstheme="minorHAnsi"/>
+          <w:sz w:val="28"/>
+          <w:szCs w:val="28"/>
+        </w:rPr>
+        <w:t>: Once the webhook is configured, any commit that modifies configuration files in the GitHub repository will automatically trigger the Config Monitor, which will then instruct Spring Cloud Bus to propagate these changes across all microservices. This way, configurations are refreshed instantly without requiring any manual refresh requests, ensuring all services remain up-to-date.</w:t>
+      </w:r>
+    </w:p>
     <w:sectPr>
       <w:pgSz w:w="11906" w:h="16838"/>
       <w:pgMar w:top="1440" w:right="1440" w:bottom="1440" w:left="1440" w:header="708" w:footer="708" w:gutter="0"/>
@@ -1773,6 +2726,123 @@
 <file path=word/numbering.xml><?xml version="1.0" encoding="utf-8"?>
 <w:numbering xmlns:wpc="http://schemas.microsoft.com/office/word/2010/wordprocessingCanvas" xmlns:cx="http://schemas.microsoft.com/office/drawing/2014/chartex" xmlns:cx1="http://schemas.microsoft.com/office/drawing/2015/9/8/chartex" xmlns:cx2="http://schemas.microsoft.com/office/drawing/2015/10/21/chartex" xmlns:cx3="http://schemas.microsoft.com/office/drawing/2016/5/9/chartex" xmlns:cx4="http://schemas.microsoft.com/office/drawing/2016/5/10/chartex" xmlns:cx5="http://schemas.microsoft.com/office/drawing/2016/5/11/chartex" xmlns:cx6="http://schemas.microsoft.com/office/drawing/2016/5/12/chartex" xmlns:cx7="http://schemas.microsoft.com/office/drawing/2016/5/13/chartex" xmlns:cx8="http://schemas.microsoft.com/office/drawing/2016/5/14/chartex" xmlns:mc="http://schemas.openxmlformats.org/markup-compatibility/2006" xmlns:aink="http://schemas.microsoft.com/office/drawing/2016/ink" xmlns:am3d="http://schemas.microsoft.com/office/drawing/2017/model3d" xmlns:o="urn:schemas-microsoft-com:office:office" xmlns:oel="http://schemas.microsoft.com/office/2019/extlst" xmlns:r="http://schemas.openxmlformats.org/officeDocument/2006/relationships" xmlns:m="http://schemas.openxmlformats.org/officeDocument/2006/math" xmlns:v="urn:schemas-microsoft-com:vml" xmlns:wp14="http://schemas.microsoft.com/office/word/2010/wordprocessingDrawing" xmlns:wp="http://schemas.openxmlformats.org/drawingml/2006/wordprocessingDrawing" xmlns:w10="urn:schemas-microsoft-com:office:word" xmlns:w="http://schemas.openxmlformats.org/wordprocessingml/2006/main" xmlns:w14="http://schemas.microsoft.com/office/word/2010/wordml" xmlns:w15="http://schemas.microsoft.com/office/word/2012/wordml" xmlns:w16cex="http://schemas.microsoft.com/office/word/2018/wordml/cex" xmlns:w16cid="http://schemas.microsoft.com/office/word/2016/wordml/cid" xmlns:w16="http://schemas.microsoft.com/office/word/2018/wordml" xmlns:w16du="http://schemas.microsoft.com/office/word/2023/wordml/word16du" xmlns:w16sdtdh="http://schemas.microsoft.com/office/word/2020/wordml/sdtdatahash" xmlns:w16se="http://schemas.microsoft.com/office/word/2015/wordml/symex" xmlns:wpg="http://schemas.microsoft.com/office/word/2010/wordprocessingGroup" xmlns:wpi="http://schemas.microsoft.com/office/word/2010/wordprocessingInk" xmlns:wne="http://schemas.microsoft.com/office/word/2006/wordml" xmlns:wps="http://schemas.microsoft.com/office/word/2010/wordprocessingShape" mc:Ignorable="w14 w15 w16se w16cid w16 w16cex w16sdtdh w16du wp14">
   <w:abstractNum w:abstractNumId="0" w15:restartNumberingAfterBreak="0">
+    <w:nsid w:val="0CDC0E64"/>
+    <w:multiLevelType w:val="multilevel"/>
+    <w:tmpl w:val="F078EF34"/>
+    <w:lvl w:ilvl="0">
+      <w:start w:val="1"/>
+      <w:numFmt w:val="decimal"/>
+      <w:lvlText w:val="%1."/>
+      <w:lvlJc w:val="left"/>
+      <w:pPr>
+        <w:tabs>
+          <w:tab w:val="num" w:pos="720"/>
+        </w:tabs>
+        <w:ind w:left="720" w:hanging="360"/>
+      </w:pPr>
+    </w:lvl>
+    <w:lvl w:ilvl="1">
+      <w:start w:val="1"/>
+      <w:numFmt w:val="bullet"/>
+      <w:lvlText w:val="o"/>
+      <w:lvlJc w:val="left"/>
+      <w:pPr>
+        <w:tabs>
+          <w:tab w:val="num" w:pos="1440"/>
+        </w:tabs>
+        <w:ind w:left="1440" w:hanging="360"/>
+      </w:pPr>
+      <w:rPr>
+        <w:rFonts w:ascii="Courier New" w:hAnsi="Courier New" w:hint="default"/>
+        <w:sz w:val="20"/>
+      </w:rPr>
+    </w:lvl>
+    <w:lvl w:ilvl="2">
+      <w:start w:val="1"/>
+      <w:numFmt w:val="bullet"/>
+      <w:lvlText w:val=""/>
+      <w:lvlJc w:val="left"/>
+      <w:pPr>
+        <w:ind w:left="2160" w:hanging="360"/>
+      </w:pPr>
+      <w:rPr>
+        <w:rFonts w:ascii="Symbol" w:hAnsi="Symbol" w:hint="default"/>
+      </w:rPr>
+    </w:lvl>
+    <w:lvl w:ilvl="3">
+      <w:start w:val="1"/>
+      <w:numFmt w:val="bullet"/>
+      <w:lvlText w:val=""/>
+      <w:lvlJc w:val="left"/>
+      <w:pPr>
+        <w:ind w:left="2880" w:hanging="360"/>
+      </w:pPr>
+      <w:rPr>
+        <w:rFonts w:ascii="Symbol" w:hAnsi="Symbol" w:hint="default"/>
+      </w:rPr>
+    </w:lvl>
+    <w:lvl w:ilvl="4" w:tentative="1">
+      <w:start w:val="1"/>
+      <w:numFmt w:val="decimal"/>
+      <w:lvlText w:val="%5."/>
+      <w:lvlJc w:val="left"/>
+      <w:pPr>
+        <w:tabs>
+          <w:tab w:val="num" w:pos="3600"/>
+        </w:tabs>
+        <w:ind w:left="3600" w:hanging="360"/>
+      </w:pPr>
+    </w:lvl>
+    <w:lvl w:ilvl="5" w:tentative="1">
+      <w:start w:val="1"/>
+      <w:numFmt w:val="decimal"/>
+      <w:lvlText w:val="%6."/>
+      <w:lvlJc w:val="left"/>
+      <w:pPr>
+        <w:tabs>
+          <w:tab w:val="num" w:pos="4320"/>
+        </w:tabs>
+        <w:ind w:left="4320" w:hanging="360"/>
+      </w:pPr>
+    </w:lvl>
+    <w:lvl w:ilvl="6" w:tentative="1">
+      <w:start w:val="1"/>
+      <w:numFmt w:val="decimal"/>
+      <w:lvlText w:val="%7."/>
+      <w:lvlJc w:val="left"/>
+      <w:pPr>
+        <w:tabs>
+          <w:tab w:val="num" w:pos="5040"/>
+        </w:tabs>
+        <w:ind w:left="5040" w:hanging="360"/>
+      </w:pPr>
+    </w:lvl>
+    <w:lvl w:ilvl="7" w:tentative="1">
+      <w:start w:val="1"/>
+      <w:numFmt w:val="decimal"/>
+      <w:lvlText w:val="%8."/>
+      <w:lvlJc w:val="left"/>
+      <w:pPr>
+        <w:tabs>
+          <w:tab w:val="num" w:pos="5760"/>
+        </w:tabs>
+        <w:ind w:left="5760" w:hanging="360"/>
+      </w:pPr>
+    </w:lvl>
+    <w:lvl w:ilvl="8" w:tentative="1">
+      <w:start w:val="1"/>
+      <w:numFmt w:val="decimal"/>
+      <w:lvlText w:val="%9."/>
+      <w:lvlJc w:val="left"/>
+      <w:pPr>
+        <w:tabs>
+          <w:tab w:val="num" w:pos="6480"/>
+        </w:tabs>
+        <w:ind w:left="6480" w:hanging="360"/>
+      </w:pPr>
+    </w:lvl>
+  </w:abstractNum>
+  <w:abstractNum w:abstractNumId="1" w15:restartNumberingAfterBreak="0">
     <w:nsid w:val="121F6F54"/>
     <w:multiLevelType w:val="multilevel"/>
     <w:tmpl w:val="69264068"/>
@@ -1921,7 +2991,382 @@
       </w:rPr>
     </w:lvl>
   </w:abstractNum>
-  <w:abstractNum w:abstractNumId="1" w15:restartNumberingAfterBreak="0">
+  <w:abstractNum w:abstractNumId="2" w15:restartNumberingAfterBreak="0">
+    <w:nsid w:val="13927245"/>
+    <w:multiLevelType w:val="multilevel"/>
+    <w:tmpl w:val="C382F58E"/>
+    <w:lvl w:ilvl="0">
+      <w:start w:val="1"/>
+      <w:numFmt w:val="decimal"/>
+      <w:lvlText w:val="%1."/>
+      <w:lvlJc w:val="left"/>
+      <w:pPr>
+        <w:tabs>
+          <w:tab w:val="num" w:pos="720"/>
+        </w:tabs>
+        <w:ind w:left="720" w:hanging="360"/>
+      </w:pPr>
+    </w:lvl>
+    <w:lvl w:ilvl="1">
+      <w:start w:val="1"/>
+      <w:numFmt w:val="bullet"/>
+      <w:lvlText w:val="o"/>
+      <w:lvlJc w:val="left"/>
+      <w:pPr>
+        <w:tabs>
+          <w:tab w:val="num" w:pos="1440"/>
+        </w:tabs>
+        <w:ind w:left="1440" w:hanging="360"/>
+      </w:pPr>
+      <w:rPr>
+        <w:rFonts w:ascii="Courier New" w:hAnsi="Courier New" w:hint="default"/>
+        <w:sz w:val="20"/>
+      </w:rPr>
+    </w:lvl>
+    <w:lvl w:ilvl="2">
+      <w:start w:val="1"/>
+      <w:numFmt w:val="bullet"/>
+      <w:lvlText w:val=""/>
+      <w:lvlJc w:val="left"/>
+      <w:pPr>
+        <w:ind w:left="2160" w:hanging="360"/>
+      </w:pPr>
+      <w:rPr>
+        <w:rFonts w:ascii="Symbol" w:hAnsi="Symbol" w:hint="default"/>
+      </w:rPr>
+    </w:lvl>
+    <w:lvl w:ilvl="3">
+      <w:start w:val="1"/>
+      <w:numFmt w:val="decimal"/>
+      <w:lvlText w:val="%4."/>
+      <w:lvlJc w:val="left"/>
+      <w:pPr>
+        <w:tabs>
+          <w:tab w:val="num" w:pos="2880"/>
+        </w:tabs>
+        <w:ind w:left="2880" w:hanging="360"/>
+      </w:pPr>
+    </w:lvl>
+    <w:lvl w:ilvl="4" w:tentative="1">
+      <w:start w:val="1"/>
+      <w:numFmt w:val="decimal"/>
+      <w:lvlText w:val="%5."/>
+      <w:lvlJc w:val="left"/>
+      <w:pPr>
+        <w:tabs>
+          <w:tab w:val="num" w:pos="3600"/>
+        </w:tabs>
+        <w:ind w:left="3600" w:hanging="360"/>
+      </w:pPr>
+    </w:lvl>
+    <w:lvl w:ilvl="5" w:tentative="1">
+      <w:start w:val="1"/>
+      <w:numFmt w:val="decimal"/>
+      <w:lvlText w:val="%6."/>
+      <w:lvlJc w:val="left"/>
+      <w:pPr>
+        <w:tabs>
+          <w:tab w:val="num" w:pos="4320"/>
+        </w:tabs>
+        <w:ind w:left="4320" w:hanging="360"/>
+      </w:pPr>
+    </w:lvl>
+    <w:lvl w:ilvl="6" w:tentative="1">
+      <w:start w:val="1"/>
+      <w:numFmt w:val="decimal"/>
+      <w:lvlText w:val="%7."/>
+      <w:lvlJc w:val="left"/>
+      <w:pPr>
+        <w:tabs>
+          <w:tab w:val="num" w:pos="5040"/>
+        </w:tabs>
+        <w:ind w:left="5040" w:hanging="360"/>
+      </w:pPr>
+    </w:lvl>
+    <w:lvl w:ilvl="7" w:tentative="1">
+      <w:start w:val="1"/>
+      <w:numFmt w:val="decimal"/>
+      <w:lvlText w:val="%8."/>
+      <w:lvlJc w:val="left"/>
+      <w:pPr>
+        <w:tabs>
+          <w:tab w:val="num" w:pos="5760"/>
+        </w:tabs>
+        <w:ind w:left="5760" w:hanging="360"/>
+      </w:pPr>
+    </w:lvl>
+    <w:lvl w:ilvl="8" w:tentative="1">
+      <w:start w:val="1"/>
+      <w:numFmt w:val="decimal"/>
+      <w:lvlText w:val="%9."/>
+      <w:lvlJc w:val="left"/>
+      <w:pPr>
+        <w:tabs>
+          <w:tab w:val="num" w:pos="6480"/>
+        </w:tabs>
+        <w:ind w:left="6480" w:hanging="360"/>
+      </w:pPr>
+    </w:lvl>
+  </w:abstractNum>
+  <w:abstractNum w:abstractNumId="3" w15:restartNumberingAfterBreak="0">
+    <w:nsid w:val="16CA7C78"/>
+    <w:multiLevelType w:val="multilevel"/>
+    <w:tmpl w:val="B7942ABA"/>
+    <w:lvl w:ilvl="0">
+      <w:start w:val="1"/>
+      <w:numFmt w:val="decimal"/>
+      <w:lvlText w:val="%1."/>
+      <w:lvlJc w:val="left"/>
+      <w:pPr>
+        <w:tabs>
+          <w:tab w:val="num" w:pos="1080"/>
+        </w:tabs>
+        <w:ind w:left="1080" w:hanging="360"/>
+      </w:pPr>
+    </w:lvl>
+    <w:lvl w:ilvl="1" w:tentative="1">
+      <w:start w:val="1"/>
+      <w:numFmt w:val="decimal"/>
+      <w:lvlText w:val="%2."/>
+      <w:lvlJc w:val="left"/>
+      <w:pPr>
+        <w:tabs>
+          <w:tab w:val="num" w:pos="1800"/>
+        </w:tabs>
+        <w:ind w:left="1800" w:hanging="360"/>
+      </w:pPr>
+    </w:lvl>
+    <w:lvl w:ilvl="2" w:tentative="1">
+      <w:start w:val="1"/>
+      <w:numFmt w:val="decimal"/>
+      <w:lvlText w:val="%3."/>
+      <w:lvlJc w:val="left"/>
+      <w:pPr>
+        <w:tabs>
+          <w:tab w:val="num" w:pos="2520"/>
+        </w:tabs>
+        <w:ind w:left="2520" w:hanging="360"/>
+      </w:pPr>
+    </w:lvl>
+    <w:lvl w:ilvl="3" w:tentative="1">
+      <w:start w:val="1"/>
+      <w:numFmt w:val="decimal"/>
+      <w:lvlText w:val="%4."/>
+      <w:lvlJc w:val="left"/>
+      <w:pPr>
+        <w:tabs>
+          <w:tab w:val="num" w:pos="3240"/>
+        </w:tabs>
+        <w:ind w:left="3240" w:hanging="360"/>
+      </w:pPr>
+    </w:lvl>
+    <w:lvl w:ilvl="4" w:tentative="1">
+      <w:start w:val="1"/>
+      <w:numFmt w:val="decimal"/>
+      <w:lvlText w:val="%5."/>
+      <w:lvlJc w:val="left"/>
+      <w:pPr>
+        <w:tabs>
+          <w:tab w:val="num" w:pos="3960"/>
+        </w:tabs>
+        <w:ind w:left="3960" w:hanging="360"/>
+      </w:pPr>
+    </w:lvl>
+    <w:lvl w:ilvl="5" w:tentative="1">
+      <w:start w:val="1"/>
+      <w:numFmt w:val="decimal"/>
+      <w:lvlText w:val="%6."/>
+      <w:lvlJc w:val="left"/>
+      <w:pPr>
+        <w:tabs>
+          <w:tab w:val="num" w:pos="4680"/>
+        </w:tabs>
+        <w:ind w:left="4680" w:hanging="360"/>
+      </w:pPr>
+    </w:lvl>
+    <w:lvl w:ilvl="6" w:tentative="1">
+      <w:start w:val="1"/>
+      <w:numFmt w:val="decimal"/>
+      <w:lvlText w:val="%7."/>
+      <w:lvlJc w:val="left"/>
+      <w:pPr>
+        <w:tabs>
+          <w:tab w:val="num" w:pos="5400"/>
+        </w:tabs>
+        <w:ind w:left="5400" w:hanging="360"/>
+      </w:pPr>
+    </w:lvl>
+    <w:lvl w:ilvl="7" w:tentative="1">
+      <w:start w:val="1"/>
+      <w:numFmt w:val="decimal"/>
+      <w:lvlText w:val="%8."/>
+      <w:lvlJc w:val="left"/>
+      <w:pPr>
+        <w:tabs>
+          <w:tab w:val="num" w:pos="6120"/>
+        </w:tabs>
+        <w:ind w:left="6120" w:hanging="360"/>
+      </w:pPr>
+    </w:lvl>
+    <w:lvl w:ilvl="8" w:tentative="1">
+      <w:start w:val="1"/>
+      <w:numFmt w:val="decimal"/>
+      <w:lvlText w:val="%9."/>
+      <w:lvlJc w:val="left"/>
+      <w:pPr>
+        <w:tabs>
+          <w:tab w:val="num" w:pos="6840"/>
+        </w:tabs>
+        <w:ind w:left="6840" w:hanging="360"/>
+      </w:pPr>
+    </w:lvl>
+  </w:abstractNum>
+  <w:abstractNum w:abstractNumId="4" w15:restartNumberingAfterBreak="0">
+    <w:nsid w:val="233157B4"/>
+    <w:multiLevelType w:val="multilevel"/>
+    <w:tmpl w:val="A6A478C4"/>
+    <w:lvl w:ilvl="0">
+      <w:start w:val="1"/>
+      <w:numFmt w:val="bullet"/>
+      <w:lvlText w:val=""/>
+      <w:lvlJc w:val="left"/>
+      <w:pPr>
+        <w:tabs>
+          <w:tab w:val="num" w:pos="720"/>
+        </w:tabs>
+        <w:ind w:left="720" w:hanging="360"/>
+      </w:pPr>
+      <w:rPr>
+        <w:rFonts w:ascii="Symbol" w:hAnsi="Symbol" w:hint="default"/>
+        <w:sz w:val="20"/>
+      </w:rPr>
+    </w:lvl>
+    <w:lvl w:ilvl="1">
+      <w:start w:val="1"/>
+      <w:numFmt w:val="decimal"/>
+      <w:lvlText w:val="%2."/>
+      <w:lvlJc w:val="left"/>
+      <w:pPr>
+        <w:tabs>
+          <w:tab w:val="num" w:pos="1440"/>
+        </w:tabs>
+        <w:ind w:left="1440" w:hanging="360"/>
+      </w:pPr>
+    </w:lvl>
+    <w:lvl w:ilvl="2" w:tentative="1">
+      <w:start w:val="1"/>
+      <w:numFmt w:val="bullet"/>
+      <w:lvlText w:val=""/>
+      <w:lvlJc w:val="left"/>
+      <w:pPr>
+        <w:tabs>
+          <w:tab w:val="num" w:pos="2160"/>
+        </w:tabs>
+        <w:ind w:left="2160" w:hanging="360"/>
+      </w:pPr>
+      <w:rPr>
+        <w:rFonts w:ascii="Wingdings" w:hAnsi="Wingdings" w:hint="default"/>
+        <w:sz w:val="20"/>
+      </w:rPr>
+    </w:lvl>
+    <w:lvl w:ilvl="3">
+      <w:start w:val="1"/>
+      <w:numFmt w:val="bullet"/>
+      <w:lvlText w:val=""/>
+      <w:lvlJc w:val="left"/>
+      <w:pPr>
+        <w:tabs>
+          <w:tab w:val="num" w:pos="2880"/>
+        </w:tabs>
+        <w:ind w:left="2880" w:hanging="360"/>
+      </w:pPr>
+      <w:rPr>
+        <w:rFonts w:ascii="Wingdings" w:hAnsi="Wingdings" w:hint="default"/>
+        <w:sz w:val="20"/>
+      </w:rPr>
+    </w:lvl>
+    <w:lvl w:ilvl="4" w:tentative="1">
+      <w:start w:val="1"/>
+      <w:numFmt w:val="bullet"/>
+      <w:lvlText w:val=""/>
+      <w:lvlJc w:val="left"/>
+      <w:pPr>
+        <w:tabs>
+          <w:tab w:val="num" w:pos="3600"/>
+        </w:tabs>
+        <w:ind w:left="3600" w:hanging="360"/>
+      </w:pPr>
+      <w:rPr>
+        <w:rFonts w:ascii="Wingdings" w:hAnsi="Wingdings" w:hint="default"/>
+        <w:sz w:val="20"/>
+      </w:rPr>
+    </w:lvl>
+    <w:lvl w:ilvl="5" w:tentative="1">
+      <w:start w:val="1"/>
+      <w:numFmt w:val="bullet"/>
+      <w:lvlText w:val=""/>
+      <w:lvlJc w:val="left"/>
+      <w:pPr>
+        <w:tabs>
+          <w:tab w:val="num" w:pos="4320"/>
+        </w:tabs>
+        <w:ind w:left="4320" w:hanging="360"/>
+      </w:pPr>
+      <w:rPr>
+        <w:rFonts w:ascii="Wingdings" w:hAnsi="Wingdings" w:hint="default"/>
+        <w:sz w:val="20"/>
+      </w:rPr>
+    </w:lvl>
+    <w:lvl w:ilvl="6" w:tentative="1">
+      <w:start w:val="1"/>
+      <w:numFmt w:val="bullet"/>
+      <w:lvlText w:val=""/>
+      <w:lvlJc w:val="left"/>
+      <w:pPr>
+        <w:tabs>
+          <w:tab w:val="num" w:pos="5040"/>
+        </w:tabs>
+        <w:ind w:left="5040" w:hanging="360"/>
+      </w:pPr>
+      <w:rPr>
+        <w:rFonts w:ascii="Wingdings" w:hAnsi="Wingdings" w:hint="default"/>
+        <w:sz w:val="20"/>
+      </w:rPr>
+    </w:lvl>
+    <w:lvl w:ilvl="7" w:tentative="1">
+      <w:start w:val="1"/>
+      <w:numFmt w:val="bullet"/>
+      <w:lvlText w:val=""/>
+      <w:lvlJc w:val="left"/>
+      <w:pPr>
+        <w:tabs>
+          <w:tab w:val="num" w:pos="5760"/>
+        </w:tabs>
+        <w:ind w:left="5760" w:hanging="360"/>
+      </w:pPr>
+      <w:rPr>
+        <w:rFonts w:ascii="Wingdings" w:hAnsi="Wingdings" w:hint="default"/>
+        <w:sz w:val="20"/>
+      </w:rPr>
+    </w:lvl>
+    <w:lvl w:ilvl="8" w:tentative="1">
+      <w:start w:val="1"/>
+      <w:numFmt w:val="bullet"/>
+      <w:lvlText w:val=""/>
+      <w:lvlJc w:val="left"/>
+      <w:pPr>
+        <w:tabs>
+          <w:tab w:val="num" w:pos="6480"/>
+        </w:tabs>
+        <w:ind w:left="6480" w:hanging="360"/>
+      </w:pPr>
+      <w:rPr>
+        <w:rFonts w:ascii="Wingdings" w:hAnsi="Wingdings" w:hint="default"/>
+        <w:sz w:val="20"/>
+      </w:rPr>
+    </w:lvl>
+  </w:abstractNum>
+  <w:abstractNum w:abstractNumId="5" w15:restartNumberingAfterBreak="0">
     <w:nsid w:val="282F539F"/>
     <w:multiLevelType w:val="multilevel"/>
     <w:tmpl w:val="68E0FB54"/>
@@ -2070,7 +3515,7 @@
       </w:rPr>
     </w:lvl>
   </w:abstractNum>
-  <w:abstractNum w:abstractNumId="2" w15:restartNumberingAfterBreak="0">
+  <w:abstractNum w:abstractNumId="6" w15:restartNumberingAfterBreak="0">
     <w:nsid w:val="38794202"/>
     <w:multiLevelType w:val="multilevel"/>
     <w:tmpl w:val="0EA4F932"/>
@@ -2219,7 +3664,7 @@
       </w:rPr>
     </w:lvl>
   </w:abstractNum>
-  <w:abstractNum w:abstractNumId="3" w15:restartNumberingAfterBreak="0">
+  <w:abstractNum w:abstractNumId="7" w15:restartNumberingAfterBreak="0">
     <w:nsid w:val="3A7C7733"/>
     <w:multiLevelType w:val="multilevel"/>
     <w:tmpl w:val="6C6E3ABA"/>
@@ -2368,7 +3813,124 @@
       </w:rPr>
     </w:lvl>
   </w:abstractNum>
-  <w:abstractNum w:abstractNumId="4" w15:restartNumberingAfterBreak="0">
+  <w:abstractNum w:abstractNumId="8" w15:restartNumberingAfterBreak="0">
+    <w:nsid w:val="3F97331A"/>
+    <w:multiLevelType w:val="multilevel"/>
+    <w:tmpl w:val="32321BA6"/>
+    <w:lvl w:ilvl="0">
+      <w:start w:val="1"/>
+      <w:numFmt w:val="decimal"/>
+      <w:lvlText w:val="%1."/>
+      <w:lvlJc w:val="left"/>
+      <w:pPr>
+        <w:tabs>
+          <w:tab w:val="num" w:pos="720"/>
+        </w:tabs>
+        <w:ind w:left="720" w:hanging="360"/>
+      </w:pPr>
+    </w:lvl>
+    <w:lvl w:ilvl="1">
+      <w:start w:val="1"/>
+      <w:numFmt w:val="bullet"/>
+      <w:lvlText w:val="o"/>
+      <w:lvlJc w:val="left"/>
+      <w:pPr>
+        <w:tabs>
+          <w:tab w:val="num" w:pos="1440"/>
+        </w:tabs>
+        <w:ind w:left="1440" w:hanging="360"/>
+      </w:pPr>
+      <w:rPr>
+        <w:rFonts w:ascii="Courier New" w:hAnsi="Courier New" w:hint="default"/>
+        <w:sz w:val="20"/>
+      </w:rPr>
+    </w:lvl>
+    <w:lvl w:ilvl="2">
+      <w:start w:val="1"/>
+      <w:numFmt w:val="decimal"/>
+      <w:lvlText w:val="%3."/>
+      <w:lvlJc w:val="left"/>
+      <w:pPr>
+        <w:tabs>
+          <w:tab w:val="num" w:pos="2160"/>
+        </w:tabs>
+        <w:ind w:left="2160" w:hanging="360"/>
+      </w:pPr>
+    </w:lvl>
+    <w:lvl w:ilvl="3" w:tentative="1">
+      <w:start w:val="1"/>
+      <w:numFmt w:val="decimal"/>
+      <w:lvlText w:val="%4."/>
+      <w:lvlJc w:val="left"/>
+      <w:pPr>
+        <w:tabs>
+          <w:tab w:val="num" w:pos="2880"/>
+        </w:tabs>
+        <w:ind w:left="2880" w:hanging="360"/>
+      </w:pPr>
+    </w:lvl>
+    <w:lvl w:ilvl="4" w:tentative="1">
+      <w:start w:val="1"/>
+      <w:numFmt w:val="decimal"/>
+      <w:lvlText w:val="%5."/>
+      <w:lvlJc w:val="left"/>
+      <w:pPr>
+        <w:tabs>
+          <w:tab w:val="num" w:pos="3600"/>
+        </w:tabs>
+        <w:ind w:left="3600" w:hanging="360"/>
+      </w:pPr>
+    </w:lvl>
+    <w:lvl w:ilvl="5" w:tentative="1">
+      <w:start w:val="1"/>
+      <w:numFmt w:val="decimal"/>
+      <w:lvlText w:val="%6."/>
+      <w:lvlJc w:val="left"/>
+      <w:pPr>
+        <w:tabs>
+          <w:tab w:val="num" w:pos="4320"/>
+        </w:tabs>
+        <w:ind w:left="4320" w:hanging="360"/>
+      </w:pPr>
+    </w:lvl>
+    <w:lvl w:ilvl="6" w:tentative="1">
+      <w:start w:val="1"/>
+      <w:numFmt w:val="decimal"/>
+      <w:lvlText w:val="%7."/>
+      <w:lvlJc w:val="left"/>
+      <w:pPr>
+        <w:tabs>
+          <w:tab w:val="num" w:pos="5040"/>
+        </w:tabs>
+        <w:ind w:left="5040" w:hanging="360"/>
+      </w:pPr>
+    </w:lvl>
+    <w:lvl w:ilvl="7" w:tentative="1">
+      <w:start w:val="1"/>
+      <w:numFmt w:val="decimal"/>
+      <w:lvlText w:val="%8."/>
+      <w:lvlJc w:val="left"/>
+      <w:pPr>
+        <w:tabs>
+          <w:tab w:val="num" w:pos="5760"/>
+        </w:tabs>
+        <w:ind w:left="5760" w:hanging="360"/>
+      </w:pPr>
+    </w:lvl>
+    <w:lvl w:ilvl="8" w:tentative="1">
+      <w:start w:val="1"/>
+      <w:numFmt w:val="decimal"/>
+      <w:lvlText w:val="%9."/>
+      <w:lvlJc w:val="left"/>
+      <w:pPr>
+        <w:tabs>
+          <w:tab w:val="num" w:pos="6480"/>
+        </w:tabs>
+        <w:ind w:left="6480" w:hanging="360"/>
+      </w:pPr>
+    </w:lvl>
+  </w:abstractNum>
+  <w:abstractNum w:abstractNumId="9" w15:restartNumberingAfterBreak="0">
     <w:nsid w:val="50016E34"/>
     <w:multiLevelType w:val="multilevel"/>
     <w:tmpl w:val="020E417A"/>
@@ -2517,7 +4079,7 @@
       </w:rPr>
     </w:lvl>
   </w:abstractNum>
-  <w:abstractNum w:abstractNumId="5" w15:restartNumberingAfterBreak="0">
+  <w:abstractNum w:abstractNumId="10" w15:restartNumberingAfterBreak="0">
     <w:nsid w:val="51D929C3"/>
     <w:multiLevelType w:val="multilevel"/>
     <w:tmpl w:val="A0B6111C"/>
@@ -2666,7 +4228,7 @@
       </w:rPr>
     </w:lvl>
   </w:abstractNum>
-  <w:abstractNum w:abstractNumId="6" w15:restartNumberingAfterBreak="0">
+  <w:abstractNum w:abstractNumId="11" w15:restartNumberingAfterBreak="0">
     <w:nsid w:val="52D916D8"/>
     <w:multiLevelType w:val="multilevel"/>
     <w:tmpl w:val="2C7282FE"/>
@@ -2815,7 +4377,7 @@
       </w:rPr>
     </w:lvl>
   </w:abstractNum>
-  <w:abstractNum w:abstractNumId="7" w15:restartNumberingAfterBreak="0">
+  <w:abstractNum w:abstractNumId="12" w15:restartNumberingAfterBreak="0">
     <w:nsid w:val="5348351D"/>
     <w:multiLevelType w:val="multilevel"/>
     <w:tmpl w:val="C24452C6"/>
@@ -2964,7 +4526,7 @@
       </w:rPr>
     </w:lvl>
   </w:abstractNum>
-  <w:abstractNum w:abstractNumId="8" w15:restartNumberingAfterBreak="0">
+  <w:abstractNum w:abstractNumId="13" w15:restartNumberingAfterBreak="0">
     <w:nsid w:val="57B0336C"/>
     <w:multiLevelType w:val="multilevel"/>
     <w:tmpl w:val="D83C0492"/>
@@ -3113,7 +4675,156 @@
       </w:rPr>
     </w:lvl>
   </w:abstractNum>
-  <w:abstractNum w:abstractNumId="9" w15:restartNumberingAfterBreak="0">
+  <w:abstractNum w:abstractNumId="14" w15:restartNumberingAfterBreak="0">
+    <w:nsid w:val="5A716EEC"/>
+    <w:multiLevelType w:val="multilevel"/>
+    <w:tmpl w:val="3C6E9388"/>
+    <w:lvl w:ilvl="0">
+      <w:start w:val="1"/>
+      <w:numFmt w:val="bullet"/>
+      <w:lvlText w:val=""/>
+      <w:lvlJc w:val="left"/>
+      <w:pPr>
+        <w:tabs>
+          <w:tab w:val="num" w:pos="720"/>
+        </w:tabs>
+        <w:ind w:left="720" w:hanging="360"/>
+      </w:pPr>
+      <w:rPr>
+        <w:rFonts w:ascii="Symbol" w:hAnsi="Symbol" w:hint="default"/>
+        <w:sz w:val="20"/>
+      </w:rPr>
+    </w:lvl>
+    <w:lvl w:ilvl="1" w:tentative="1">
+      <w:start w:val="1"/>
+      <w:numFmt w:val="bullet"/>
+      <w:lvlText w:val="o"/>
+      <w:lvlJc w:val="left"/>
+      <w:pPr>
+        <w:tabs>
+          <w:tab w:val="num" w:pos="1440"/>
+        </w:tabs>
+        <w:ind w:left="1440" w:hanging="360"/>
+      </w:pPr>
+      <w:rPr>
+        <w:rFonts w:ascii="Courier New" w:hAnsi="Courier New" w:hint="default"/>
+        <w:sz w:val="20"/>
+      </w:rPr>
+    </w:lvl>
+    <w:lvl w:ilvl="2" w:tentative="1">
+      <w:start w:val="1"/>
+      <w:numFmt w:val="bullet"/>
+      <w:lvlText w:val=""/>
+      <w:lvlJc w:val="left"/>
+      <w:pPr>
+        <w:tabs>
+          <w:tab w:val="num" w:pos="2160"/>
+        </w:tabs>
+        <w:ind w:left="2160" w:hanging="360"/>
+      </w:pPr>
+      <w:rPr>
+        <w:rFonts w:ascii="Wingdings" w:hAnsi="Wingdings" w:hint="default"/>
+        <w:sz w:val="20"/>
+      </w:rPr>
+    </w:lvl>
+    <w:lvl w:ilvl="3" w:tentative="1">
+      <w:start w:val="1"/>
+      <w:numFmt w:val="bullet"/>
+      <w:lvlText w:val=""/>
+      <w:lvlJc w:val="left"/>
+      <w:pPr>
+        <w:tabs>
+          <w:tab w:val="num" w:pos="2880"/>
+        </w:tabs>
+        <w:ind w:left="2880" w:hanging="360"/>
+      </w:pPr>
+      <w:rPr>
+        <w:rFonts w:ascii="Wingdings" w:hAnsi="Wingdings" w:hint="default"/>
+        <w:sz w:val="20"/>
+      </w:rPr>
+    </w:lvl>
+    <w:lvl w:ilvl="4" w:tentative="1">
+      <w:start w:val="1"/>
+      <w:numFmt w:val="bullet"/>
+      <w:lvlText w:val=""/>
+      <w:lvlJc w:val="left"/>
+      <w:pPr>
+        <w:tabs>
+          <w:tab w:val="num" w:pos="3600"/>
+        </w:tabs>
+        <w:ind w:left="3600" w:hanging="360"/>
+      </w:pPr>
+      <w:rPr>
+        <w:rFonts w:ascii="Wingdings" w:hAnsi="Wingdings" w:hint="default"/>
+        <w:sz w:val="20"/>
+      </w:rPr>
+    </w:lvl>
+    <w:lvl w:ilvl="5" w:tentative="1">
+      <w:start w:val="1"/>
+      <w:numFmt w:val="bullet"/>
+      <w:lvlText w:val=""/>
+      <w:lvlJc w:val="left"/>
+      <w:pPr>
+        <w:tabs>
+          <w:tab w:val="num" w:pos="4320"/>
+        </w:tabs>
+        <w:ind w:left="4320" w:hanging="360"/>
+      </w:pPr>
+      <w:rPr>
+        <w:rFonts w:ascii="Wingdings" w:hAnsi="Wingdings" w:hint="default"/>
+        <w:sz w:val="20"/>
+      </w:rPr>
+    </w:lvl>
+    <w:lvl w:ilvl="6" w:tentative="1">
+      <w:start w:val="1"/>
+      <w:numFmt w:val="bullet"/>
+      <w:lvlText w:val=""/>
+      <w:lvlJc w:val="left"/>
+      <w:pPr>
+        <w:tabs>
+          <w:tab w:val="num" w:pos="5040"/>
+        </w:tabs>
+        <w:ind w:left="5040" w:hanging="360"/>
+      </w:pPr>
+      <w:rPr>
+        <w:rFonts w:ascii="Wingdings" w:hAnsi="Wingdings" w:hint="default"/>
+        <w:sz w:val="20"/>
+      </w:rPr>
+    </w:lvl>
+    <w:lvl w:ilvl="7" w:tentative="1">
+      <w:start w:val="1"/>
+      <w:numFmt w:val="bullet"/>
+      <w:lvlText w:val=""/>
+      <w:lvlJc w:val="left"/>
+      <w:pPr>
+        <w:tabs>
+          <w:tab w:val="num" w:pos="5760"/>
+        </w:tabs>
+        <w:ind w:left="5760" w:hanging="360"/>
+      </w:pPr>
+      <w:rPr>
+        <w:rFonts w:ascii="Wingdings" w:hAnsi="Wingdings" w:hint="default"/>
+        <w:sz w:val="20"/>
+      </w:rPr>
+    </w:lvl>
+    <w:lvl w:ilvl="8" w:tentative="1">
+      <w:start w:val="1"/>
+      <w:numFmt w:val="bullet"/>
+      <w:lvlText w:val=""/>
+      <w:lvlJc w:val="left"/>
+      <w:pPr>
+        <w:tabs>
+          <w:tab w:val="num" w:pos="6480"/>
+        </w:tabs>
+        <w:ind w:left="6480" w:hanging="360"/>
+      </w:pPr>
+      <w:rPr>
+        <w:rFonts w:ascii="Wingdings" w:hAnsi="Wingdings" w:hint="default"/>
+        <w:sz w:val="20"/>
+      </w:rPr>
+    </w:lvl>
+  </w:abstractNum>
+  <w:abstractNum w:abstractNumId="15" w15:restartNumberingAfterBreak="0">
     <w:nsid w:val="5E925DD0"/>
     <w:multiLevelType w:val="multilevel"/>
     <w:tmpl w:val="8F0E83C2"/>
@@ -3262,7 +4973,7 @@
       </w:rPr>
     </w:lvl>
   </w:abstractNum>
-  <w:abstractNum w:abstractNumId="10" w15:restartNumberingAfterBreak="0">
+  <w:abstractNum w:abstractNumId="16" w15:restartNumberingAfterBreak="0">
     <w:nsid w:val="74E30C48"/>
     <w:multiLevelType w:val="multilevel"/>
     <w:tmpl w:val="A90A7CCA"/>
@@ -3412,37 +5123,55 @@
     </w:lvl>
   </w:abstractNum>
   <w:num w:numId="1" w16cid:durableId="1930582642">
+    <w:abstractNumId w:val="11"/>
+  </w:num>
+  <w:num w:numId="2" w16cid:durableId="1769882542">
+    <w:abstractNumId w:val="10"/>
+  </w:num>
+  <w:num w:numId="3" w16cid:durableId="971668531">
+    <w:abstractNumId w:val="7"/>
+  </w:num>
+  <w:num w:numId="4" w16cid:durableId="1032725787">
+    <w:abstractNumId w:val="9"/>
+  </w:num>
+  <w:num w:numId="5" w16cid:durableId="2037344762">
+    <w:abstractNumId w:val="12"/>
+  </w:num>
+  <w:num w:numId="6" w16cid:durableId="322899923">
+    <w:abstractNumId w:val="1"/>
+  </w:num>
+  <w:num w:numId="7" w16cid:durableId="606936184">
+    <w:abstractNumId w:val="15"/>
+  </w:num>
+  <w:num w:numId="8" w16cid:durableId="1513757500">
+    <w:abstractNumId w:val="16"/>
+  </w:num>
+  <w:num w:numId="9" w16cid:durableId="1814717361">
+    <w:abstractNumId w:val="13"/>
+  </w:num>
+  <w:num w:numId="10" w16cid:durableId="1310020153">
     <w:abstractNumId w:val="6"/>
   </w:num>
-  <w:num w:numId="2" w16cid:durableId="1769882542">
+  <w:num w:numId="11" w16cid:durableId="612136019">
     <w:abstractNumId w:val="5"/>
   </w:num>
-  <w:num w:numId="3" w16cid:durableId="971668531">
+  <w:num w:numId="12" w16cid:durableId="451021611">
+    <w:abstractNumId w:val="14"/>
+  </w:num>
+  <w:num w:numId="13" w16cid:durableId="1102992896">
     <w:abstractNumId w:val="3"/>
   </w:num>
-  <w:num w:numId="4" w16cid:durableId="1032725787">
+  <w:num w:numId="14" w16cid:durableId="886379298">
     <w:abstractNumId w:val="4"/>
   </w:num>
-  <w:num w:numId="5" w16cid:durableId="2037344762">
-    <w:abstractNumId w:val="7"/>
-  </w:num>
-  <w:num w:numId="6" w16cid:durableId="322899923">
-    <w:abstractNumId w:val="0"/>
-  </w:num>
-  <w:num w:numId="7" w16cid:durableId="606936184">
-    <w:abstractNumId w:val="9"/>
-  </w:num>
-  <w:num w:numId="8" w16cid:durableId="1513757500">
-    <w:abstractNumId w:val="10"/>
-  </w:num>
-  <w:num w:numId="9" w16cid:durableId="1814717361">
+  <w:num w:numId="15" w16cid:durableId="32467885">
     <w:abstractNumId w:val="8"/>
   </w:num>
-  <w:num w:numId="10" w16cid:durableId="1310020153">
+  <w:num w:numId="16" w16cid:durableId="231699082">
     <w:abstractNumId w:val="2"/>
   </w:num>
-  <w:num w:numId="11" w16cid:durableId="612136019">
-    <w:abstractNumId w:val="1"/>
+  <w:num w:numId="17" w16cid:durableId="1385983069">
+    <w:abstractNumId w:val="0"/>
   </w:num>
 </w:numbering>
 </file>
@@ -3886,6 +5615,66 @@
       <w:contextualSpacing/>
     </w:pPr>
   </w:style>
+  <w:style w:type="character" w:styleId="Hyperlink">
+    <w:name w:val="Hyperlink"/>
+    <w:basedOn w:val="DefaultParagraphFont"/>
+    <w:uiPriority w:val="99"/>
+    <w:unhideWhenUsed/>
+    <w:rsid w:val="001C7E96"/>
+    <w:rPr>
+      <w:color w:val="0563C1" w:themeColor="hyperlink"/>
+      <w:u w:val="single"/>
+    </w:rPr>
+  </w:style>
+  <w:style w:type="character" w:styleId="UnresolvedMention">
+    <w:name w:val="Unresolved Mention"/>
+    <w:basedOn w:val="DefaultParagraphFont"/>
+    <w:uiPriority w:val="99"/>
+    <w:semiHidden/>
+    <w:unhideWhenUsed/>
+    <w:rsid w:val="001C7E96"/>
+    <w:rPr>
+      <w:color w:val="605E5C"/>
+      <w:shd w:val="clear" w:color="auto" w:fill="E1DFDD"/>
+    </w:rPr>
+  </w:style>
+  <w:style w:type="paragraph" w:styleId="NormalWeb">
+    <w:name w:val="Normal (Web)"/>
+    <w:basedOn w:val="Normal"/>
+    <w:uiPriority w:val="99"/>
+    <w:semiHidden/>
+    <w:unhideWhenUsed/>
+    <w:rsid w:val="001C7E96"/>
+    <w:rPr>
+      <w:rFonts w:ascii="Times New Roman" w:hAnsi="Times New Roman" w:cs="Times New Roman"/>
+      <w:sz w:val="24"/>
+      <w:szCs w:val="24"/>
+    </w:rPr>
+  </w:style>
+  <w:style w:type="character" w:styleId="Strong">
+    <w:name w:val="Strong"/>
+    <w:basedOn w:val="DefaultParagraphFont"/>
+    <w:uiPriority w:val="22"/>
+    <w:qFormat/>
+    <w:rsid w:val="001C7E96"/>
+    <w:rPr>
+      <w:b/>
+      <w:bCs/>
+    </w:rPr>
+  </w:style>
+  <w:style w:type="character" w:styleId="HTMLCode">
+    <w:name w:val="HTML Code"/>
+    <w:basedOn w:val="DefaultParagraphFont"/>
+    <w:uiPriority w:val="99"/>
+    <w:semiHidden/>
+    <w:unhideWhenUsed/>
+    <w:rsid w:val="001C7E96"/>
+    <w:rPr>
+      <w:rFonts w:ascii="Courier New" w:eastAsia="Times New Roman" w:hAnsi="Courier New" w:cs="Courier New"/>
+      <w:sz w:val="20"/>
+      <w:szCs w:val="20"/>
+    </w:rPr>
+  </w:style>
 </w:styles>
 </file>
 

</xml_diff>

<commit_message>
Created Docker Compose File for Image/Container Creation
</commit_message>
<xml_diff>
--- a/Section_6/Configuration_Management.docx
+++ b/Section_6/Configuration_Management.docx
@@ -1689,6 +1689,7 @@
       <w:r>
         <w:rPr>
           <w:rFonts w:cstheme="minorHAnsi"/>
+          <w:noProof/>
           <w:sz w:val="28"/>
           <w:szCs w:val="28"/>
         </w:rPr>
@@ -2074,6 +2075,7 @@
       <w:r>
         <w:rPr>
           <w:rFonts w:cstheme="minorHAnsi"/>
+          <w:noProof/>
           <w:sz w:val="28"/>
           <w:szCs w:val="28"/>
         </w:rPr>
@@ -2177,6 +2179,7 @@
       <w:r>
         <w:rPr>
           <w:rFonts w:cstheme="minorHAnsi"/>
+          <w:noProof/>
           <w:sz w:val="28"/>
           <w:szCs w:val="28"/>
         </w:rPr>
@@ -2636,6 +2639,7 @@
       <w:r>
         <w:rPr>
           <w:rFonts w:cstheme="minorHAnsi"/>
+          <w:noProof/>
           <w:sz w:val="28"/>
           <w:szCs w:val="28"/>
         </w:rPr>
@@ -2713,6 +2717,2489 @@
         <w:t>: Once the webhook is configured, any commit that modifies configuration files in the GitHub repository will automatically trigger the Config Monitor, which will then instruct Spring Cloud Bus to propagate these changes across all microservices. This way, configurations are refreshed instantly without requiring any manual refresh requests, ensuring all services remain up-to-date.</w:t>
       </w:r>
     </w:p>
+    <w:p>
+      <w:pPr>
+        <w:tabs>
+          <w:tab w:val="num" w:pos="1440"/>
+        </w:tabs>
+        <w:spacing w:line="360" w:lineRule="auto"/>
+        <w:ind w:left="284"/>
+        <w:rPr>
+          <w:rFonts w:cstheme="minorHAnsi"/>
+          <w:b/>
+          <w:bCs/>
+          <w:sz w:val="28"/>
+          <w:szCs w:val="28"/>
+        </w:rPr>
+      </w:pPr>
+    </w:p>
+    <w:p>
+      <w:pPr>
+        <w:tabs>
+          <w:tab w:val="num" w:pos="1440"/>
+        </w:tabs>
+        <w:spacing w:line="360" w:lineRule="auto"/>
+        <w:ind w:left="284"/>
+        <w:rPr>
+          <w:rFonts w:cstheme="minorHAnsi"/>
+          <w:b/>
+          <w:bCs/>
+          <w:sz w:val="28"/>
+          <w:szCs w:val="28"/>
+        </w:rPr>
+      </w:pPr>
+      <w:r>
+        <w:rPr>
+          <w:rFonts w:cstheme="minorHAnsi"/>
+          <w:b/>
+          <w:bCs/>
+          <w:sz w:val="28"/>
+          <w:szCs w:val="28"/>
+        </w:rPr>
+        <w:t>Docker Compose</w:t>
+      </w:r>
+    </w:p>
+    <w:p>
+      <w:pPr>
+        <w:tabs>
+          <w:tab w:val="num" w:pos="1440"/>
+        </w:tabs>
+        <w:spacing w:line="360" w:lineRule="auto"/>
+        <w:ind w:left="284"/>
+        <w:rPr>
+          <w:rFonts w:cstheme="minorHAnsi"/>
+          <w:sz w:val="28"/>
+          <w:szCs w:val="28"/>
+        </w:rPr>
+      </w:pPr>
+      <w:r>
+        <w:rPr>
+          <w:rFonts w:cstheme="minorHAnsi"/>
+          <w:sz w:val="28"/>
+          <w:szCs w:val="28"/>
+        </w:rPr>
+        <w:t>To containerize your microservices, including the Config Server, and manage them with Docker Compose, you’ll need to ensure that each microservice is configured properly within a Docker environment and that dependencies, like the Config Server, are correctly referenced. Here’s a step-by-step guide to setting this up based on your requirements.</w:t>
+      </w:r>
+    </w:p>
+    <w:p>
+      <w:pPr>
+        <w:tabs>
+          <w:tab w:val="num" w:pos="1440"/>
+        </w:tabs>
+        <w:spacing w:line="360" w:lineRule="auto"/>
+        <w:ind w:left="284"/>
+        <w:rPr>
+          <w:rFonts w:cstheme="minorHAnsi"/>
+          <w:b/>
+          <w:bCs/>
+          <w:sz w:val="30"/>
+          <w:szCs w:val="30"/>
+        </w:rPr>
+      </w:pPr>
+      <w:r>
+        <w:rPr>
+          <w:rFonts w:cstheme="minorHAnsi"/>
+          <w:b/>
+          <w:bCs/>
+          <w:sz w:val="30"/>
+          <w:szCs w:val="30"/>
+        </w:rPr>
+        <w:lastRenderedPageBreak/>
+        <w:t>Step 1: Add Config Server Properties in docker-</w:t>
+      </w:r>
+      <w:proofErr w:type="spellStart"/>
+      <w:r>
+        <w:rPr>
+          <w:rFonts w:cstheme="minorHAnsi"/>
+          <w:b/>
+          <w:bCs/>
+          <w:sz w:val="30"/>
+          <w:szCs w:val="30"/>
+        </w:rPr>
+        <w:t>compose.yml</w:t>
+      </w:r>
+      <w:proofErr w:type="spellEnd"/>
+    </w:p>
+    <w:p>
+      <w:pPr>
+        <w:tabs>
+          <w:tab w:val="num" w:pos="1440"/>
+        </w:tabs>
+        <w:spacing w:line="360" w:lineRule="auto"/>
+        <w:ind w:left="284"/>
+        <w:rPr>
+          <w:rFonts w:cstheme="minorHAnsi"/>
+          <w:sz w:val="28"/>
+          <w:szCs w:val="28"/>
+        </w:rPr>
+      </w:pPr>
+      <w:r>
+        <w:rPr>
+          <w:rFonts w:cstheme="minorHAnsi"/>
+          <w:sz w:val="28"/>
+          <w:szCs w:val="28"/>
+        </w:rPr>
+        <w:t>First, define the Config Server in docker-</w:t>
+      </w:r>
+      <w:proofErr w:type="spellStart"/>
+      <w:r>
+        <w:rPr>
+          <w:rFonts w:cstheme="minorHAnsi"/>
+          <w:sz w:val="28"/>
+          <w:szCs w:val="28"/>
+        </w:rPr>
+        <w:t>compose.yml</w:t>
+      </w:r>
+      <w:proofErr w:type="spellEnd"/>
+      <w:r>
+        <w:rPr>
+          <w:rFonts w:cstheme="minorHAnsi"/>
+          <w:sz w:val="28"/>
+          <w:szCs w:val="28"/>
+        </w:rPr>
+        <w:t xml:space="preserve"> with appropriate configuration settings, including port mappings, environment variables, and health checks.</w:t>
+      </w:r>
+      <w:r>
+        <w:rPr>
+          <w:rFonts w:cstheme="minorHAnsi"/>
+          <w:noProof/>
+          <w:sz w:val="28"/>
+          <w:szCs w:val="28"/>
+        </w:rPr>
+        <w:drawing>
+          <wp:inline distT="0" distB="0" distL="0" distR="0" wp14:anchorId="1F35B5BC" wp14:editId="6A89BD3E">
+            <wp:extent cx="5572903" cy="3238952"/>
+            <wp:effectExtent l="0" t="0" r="8890" b="0"/>
+            <wp:docPr id="1478916096" name="Picture 1"/>
+            <wp:cNvGraphicFramePr>
+              <a:graphicFrameLocks xmlns:a="http://schemas.openxmlformats.org/drawingml/2006/main" noChangeAspect="1"/>
+            </wp:cNvGraphicFramePr>
+            <a:graphic xmlns:a="http://schemas.openxmlformats.org/drawingml/2006/main">
+              <a:graphicData uri="http://schemas.openxmlformats.org/drawingml/2006/picture">
+                <pic:pic xmlns:pic="http://schemas.openxmlformats.org/drawingml/2006/picture">
+                  <pic:nvPicPr>
+                    <pic:cNvPr id="1478916096" name=""/>
+                    <pic:cNvPicPr/>
+                  </pic:nvPicPr>
+                  <pic:blipFill>
+                    <a:blip r:embed="rId15"/>
+                    <a:stretch>
+                      <a:fillRect/>
+                    </a:stretch>
+                  </pic:blipFill>
+                  <pic:spPr>
+                    <a:xfrm>
+                      <a:off x="0" y="0"/>
+                      <a:ext cx="5572903" cy="3238952"/>
+                    </a:xfrm>
+                    <a:prstGeom prst="rect">
+                      <a:avLst/>
+                    </a:prstGeom>
+                  </pic:spPr>
+                </pic:pic>
+              </a:graphicData>
+            </a:graphic>
+          </wp:inline>
+        </w:drawing>
+      </w:r>
+    </w:p>
+    <w:p>
+      <w:pPr>
+        <w:tabs>
+          <w:tab w:val="num" w:pos="1440"/>
+        </w:tabs>
+        <w:spacing w:line="360" w:lineRule="auto"/>
+        <w:ind w:left="284"/>
+        <w:rPr>
+          <w:rFonts w:cstheme="minorHAnsi"/>
+          <w:b/>
+          <w:bCs/>
+          <w:sz w:val="30"/>
+          <w:szCs w:val="30"/>
+        </w:rPr>
+      </w:pPr>
+      <w:r>
+        <w:rPr>
+          <w:rFonts w:cstheme="minorHAnsi"/>
+          <w:b/>
+          <w:bCs/>
+          <w:sz w:val="30"/>
+          <w:szCs w:val="30"/>
+        </w:rPr>
+        <w:t>Step 2: Add Configuration Server URL in Each Microservice</w:t>
+      </w:r>
+    </w:p>
+    <w:p>
+      <w:pPr>
+        <w:tabs>
+          <w:tab w:val="num" w:pos="1440"/>
+        </w:tabs>
+        <w:spacing w:line="360" w:lineRule="auto"/>
+        <w:ind w:left="284"/>
+        <w:rPr>
+          <w:rFonts w:cstheme="minorHAnsi"/>
+          <w:sz w:val="28"/>
+          <w:szCs w:val="28"/>
+        </w:rPr>
+      </w:pPr>
+      <w:r>
+        <w:rPr>
+          <w:rFonts w:cstheme="minorHAnsi"/>
+          <w:sz w:val="28"/>
+          <w:szCs w:val="28"/>
+        </w:rPr>
+        <w:t>In each microservice’s configuration within docker-</w:t>
+      </w:r>
+      <w:proofErr w:type="spellStart"/>
+      <w:r>
+        <w:rPr>
+          <w:rFonts w:cstheme="minorHAnsi"/>
+          <w:sz w:val="28"/>
+          <w:szCs w:val="28"/>
+        </w:rPr>
+        <w:t>compose.yml</w:t>
+      </w:r>
+      <w:proofErr w:type="spellEnd"/>
+      <w:r>
+        <w:rPr>
+          <w:rFonts w:cstheme="minorHAnsi"/>
+          <w:sz w:val="28"/>
+          <w:szCs w:val="28"/>
+        </w:rPr>
+        <w:t xml:space="preserve">, set up environment variables for SPRING_APPLICATION_NAME and SPRING_PROFILES_ACTIVE, and configure them to point to the Config Server. Instead of using localhost, use the </w:t>
+      </w:r>
+      <w:proofErr w:type="spellStart"/>
+      <w:r>
+        <w:rPr>
+          <w:rFonts w:cstheme="minorHAnsi"/>
+          <w:sz w:val="28"/>
+          <w:szCs w:val="28"/>
+        </w:rPr>
+        <w:t>configserver</w:t>
+      </w:r>
+      <w:proofErr w:type="spellEnd"/>
+      <w:r>
+        <w:rPr>
+          <w:rFonts w:cstheme="minorHAnsi"/>
+          <w:sz w:val="28"/>
+          <w:szCs w:val="28"/>
+        </w:rPr>
+        <w:t xml:space="preserve"> service name defined in Docker Compose.</w:t>
+      </w:r>
+    </w:p>
+    <w:p>
+      <w:pPr>
+        <w:tabs>
+          <w:tab w:val="num" w:pos="1440"/>
+        </w:tabs>
+        <w:spacing w:line="360" w:lineRule="auto"/>
+        <w:ind w:left="284"/>
+        <w:rPr>
+          <w:rFonts w:cstheme="minorHAnsi"/>
+          <w:sz w:val="28"/>
+          <w:szCs w:val="28"/>
+        </w:rPr>
+      </w:pPr>
+      <w:r>
+        <w:rPr>
+          <w:rFonts w:cstheme="minorHAnsi"/>
+          <w:sz w:val="28"/>
+          <w:szCs w:val="28"/>
+        </w:rPr>
+        <w:t>For example, for a microservice called accounts:</w:t>
+      </w:r>
+    </w:p>
+    <w:p>
+      <w:pPr>
+        <w:tabs>
+          <w:tab w:val="num" w:pos="1440"/>
+        </w:tabs>
+        <w:spacing w:line="360" w:lineRule="auto"/>
+        <w:ind w:left="284"/>
+        <w:rPr>
+          <w:rFonts w:cstheme="minorHAnsi"/>
+          <w:sz w:val="28"/>
+          <w:szCs w:val="28"/>
+        </w:rPr>
+      </w:pPr>
+      <w:r>
+        <w:rPr>
+          <w:rFonts w:cstheme="minorHAnsi"/>
+          <w:noProof/>
+          <w:sz w:val="28"/>
+          <w:szCs w:val="28"/>
+        </w:rPr>
+        <w:lastRenderedPageBreak/>
+        <w:drawing>
+          <wp:inline distT="0" distB="0" distL="0" distR="0" wp14:anchorId="001F3049" wp14:editId="7706D185">
+            <wp:extent cx="5731510" cy="3220085"/>
+            <wp:effectExtent l="0" t="0" r="2540" b="0"/>
+            <wp:docPr id="683099354" name="Picture 1"/>
+            <wp:cNvGraphicFramePr>
+              <a:graphicFrameLocks xmlns:a="http://schemas.openxmlformats.org/drawingml/2006/main" noChangeAspect="1"/>
+            </wp:cNvGraphicFramePr>
+            <a:graphic xmlns:a="http://schemas.openxmlformats.org/drawingml/2006/main">
+              <a:graphicData uri="http://schemas.openxmlformats.org/drawingml/2006/picture">
+                <pic:pic xmlns:pic="http://schemas.openxmlformats.org/drawingml/2006/picture">
+                  <pic:nvPicPr>
+                    <pic:cNvPr id="683099354" name=""/>
+                    <pic:cNvPicPr/>
+                  </pic:nvPicPr>
+                  <pic:blipFill>
+                    <a:blip r:embed="rId16"/>
+                    <a:stretch>
+                      <a:fillRect/>
+                    </a:stretch>
+                  </pic:blipFill>
+                  <pic:spPr>
+                    <a:xfrm>
+                      <a:off x="0" y="0"/>
+                      <a:ext cx="5731510" cy="3220085"/>
+                    </a:xfrm>
+                    <a:prstGeom prst="rect">
+                      <a:avLst/>
+                    </a:prstGeom>
+                  </pic:spPr>
+                </pic:pic>
+              </a:graphicData>
+            </a:graphic>
+          </wp:inline>
+        </w:drawing>
+      </w:r>
+    </w:p>
+    <w:p>
+      <w:pPr>
+        <w:tabs>
+          <w:tab w:val="num" w:pos="1440"/>
+        </w:tabs>
+        <w:spacing w:line="360" w:lineRule="auto"/>
+        <w:ind w:left="284"/>
+        <w:rPr>
+          <w:rFonts w:cstheme="minorHAnsi"/>
+          <w:b/>
+          <w:bCs/>
+          <w:sz w:val="28"/>
+          <w:szCs w:val="28"/>
+        </w:rPr>
+      </w:pPr>
+      <w:r>
+        <w:rPr>
+          <w:rFonts w:cstheme="minorHAnsi"/>
+          <w:b/>
+          <w:bCs/>
+          <w:sz w:val="28"/>
+          <w:szCs w:val="28"/>
+        </w:rPr>
+        <w:t>Explanation</w:t>
+      </w:r>
+    </w:p>
+    <w:p>
+      <w:pPr>
+        <w:numPr>
+          <w:ilvl w:val="0"/>
+          <w:numId w:val="23"/>
+        </w:numPr>
+        <w:tabs>
+          <w:tab w:val="num" w:pos="1440"/>
+        </w:tabs>
+        <w:spacing w:line="360" w:lineRule="auto"/>
+        <w:rPr>
+          <w:rFonts w:cstheme="minorHAnsi"/>
+          <w:sz w:val="28"/>
+          <w:szCs w:val="28"/>
+        </w:rPr>
+      </w:pPr>
+      <w:r>
+        <w:rPr>
+          <w:rFonts w:cstheme="minorHAnsi"/>
+          <w:b/>
+          <w:bCs/>
+          <w:sz w:val="28"/>
+          <w:szCs w:val="28"/>
+        </w:rPr>
+        <w:t>SPRING_PROFILES_ACTIVE=docker</w:t>
+      </w:r>
+      <w:r>
+        <w:rPr>
+          <w:rFonts w:cstheme="minorHAnsi"/>
+          <w:sz w:val="28"/>
+          <w:szCs w:val="28"/>
+        </w:rPr>
+        <w:t>: Sets the active profile to docker, ensuring that the configuration properties are compatible with Docker Compose.</w:t>
+      </w:r>
+    </w:p>
+    <w:p>
+      <w:pPr>
+        <w:numPr>
+          <w:ilvl w:val="0"/>
+          <w:numId w:val="23"/>
+        </w:numPr>
+        <w:tabs>
+          <w:tab w:val="num" w:pos="1440"/>
+        </w:tabs>
+        <w:spacing w:line="360" w:lineRule="auto"/>
+        <w:rPr>
+          <w:rFonts w:cstheme="minorHAnsi"/>
+          <w:sz w:val="28"/>
+          <w:szCs w:val="28"/>
+        </w:rPr>
+      </w:pPr>
+      <w:r>
+        <w:rPr>
+          <w:rFonts w:cstheme="minorHAnsi"/>
+          <w:b/>
+          <w:bCs/>
+          <w:sz w:val="28"/>
+          <w:szCs w:val="28"/>
+        </w:rPr>
+        <w:t>SPRING_CONFIG_IMPORT=optional:configserver:http://configserver:8071/</w:t>
+      </w:r>
+      <w:r>
+        <w:rPr>
+          <w:rFonts w:cstheme="minorHAnsi"/>
+          <w:sz w:val="28"/>
+          <w:szCs w:val="28"/>
+        </w:rPr>
+        <w:t xml:space="preserve">: Specifies the Config Server’s URL, using the </w:t>
+      </w:r>
+      <w:proofErr w:type="spellStart"/>
+      <w:r>
+        <w:rPr>
+          <w:rFonts w:cstheme="minorHAnsi"/>
+          <w:sz w:val="28"/>
+          <w:szCs w:val="28"/>
+        </w:rPr>
+        <w:t>configserver</w:t>
+      </w:r>
+      <w:proofErr w:type="spellEnd"/>
+      <w:r>
+        <w:rPr>
+          <w:rFonts w:cstheme="minorHAnsi"/>
+          <w:sz w:val="28"/>
+          <w:szCs w:val="28"/>
+        </w:rPr>
+        <w:t xml:space="preserve"> service name instead of localhost. This makes the connection work in a Docker network, where services communicate by name.</w:t>
+      </w:r>
+    </w:p>
+    <w:p>
+      <w:pPr>
+        <w:numPr>
+          <w:ilvl w:val="0"/>
+          <w:numId w:val="23"/>
+        </w:numPr>
+        <w:tabs>
+          <w:tab w:val="num" w:pos="1440"/>
+        </w:tabs>
+        <w:spacing w:line="360" w:lineRule="auto"/>
+        <w:rPr>
+          <w:rFonts w:cstheme="minorHAnsi"/>
+          <w:sz w:val="28"/>
+          <w:szCs w:val="28"/>
+        </w:rPr>
+      </w:pPr>
+      <w:proofErr w:type="spellStart"/>
+      <w:r>
+        <w:rPr>
+          <w:rFonts w:cstheme="minorHAnsi"/>
+          <w:b/>
+          <w:bCs/>
+          <w:sz w:val="28"/>
+          <w:szCs w:val="28"/>
+        </w:rPr>
+        <w:t>depends_on</w:t>
+      </w:r>
+      <w:proofErr w:type="spellEnd"/>
+      <w:r>
+        <w:rPr>
+          <w:rFonts w:cstheme="minorHAnsi"/>
+          <w:b/>
+          <w:bCs/>
+          <w:sz w:val="28"/>
+          <w:szCs w:val="28"/>
+        </w:rPr>
+        <w:t xml:space="preserve"> with condition: </w:t>
+      </w:r>
+      <w:proofErr w:type="spellStart"/>
+      <w:r>
+        <w:rPr>
+          <w:rFonts w:cstheme="minorHAnsi"/>
+          <w:b/>
+          <w:bCs/>
+          <w:sz w:val="28"/>
+          <w:szCs w:val="28"/>
+        </w:rPr>
+        <w:t>service_healthy</w:t>
+      </w:r>
+      <w:proofErr w:type="spellEnd"/>
+      <w:r>
+        <w:rPr>
+          <w:rFonts w:cstheme="minorHAnsi"/>
+          <w:sz w:val="28"/>
+          <w:szCs w:val="28"/>
+        </w:rPr>
+        <w:t xml:space="preserve">: Ensures the accounts service waits until </w:t>
+      </w:r>
+      <w:proofErr w:type="spellStart"/>
+      <w:r>
+        <w:rPr>
+          <w:rFonts w:cstheme="minorHAnsi"/>
+          <w:sz w:val="28"/>
+          <w:szCs w:val="28"/>
+        </w:rPr>
+        <w:t>configserver</w:t>
+      </w:r>
+      <w:proofErr w:type="spellEnd"/>
+      <w:r>
+        <w:rPr>
+          <w:rFonts w:cstheme="minorHAnsi"/>
+          <w:sz w:val="28"/>
+          <w:szCs w:val="28"/>
+        </w:rPr>
+        <w:t xml:space="preserve"> is healthy before starting.</w:t>
+      </w:r>
+    </w:p>
+    <w:p>
+      <w:pPr>
+        <w:tabs>
+          <w:tab w:val="num" w:pos="1440"/>
+        </w:tabs>
+        <w:spacing w:line="360" w:lineRule="auto"/>
+        <w:rPr>
+          <w:rFonts w:cstheme="minorHAnsi"/>
+          <w:sz w:val="28"/>
+          <w:szCs w:val="28"/>
+        </w:rPr>
+      </w:pPr>
+    </w:p>
+    <w:p>
+      <w:pPr>
+        <w:tabs>
+          <w:tab w:val="num" w:pos="1440"/>
+        </w:tabs>
+        <w:spacing w:line="360" w:lineRule="auto"/>
+        <w:rPr>
+          <w:rFonts w:cstheme="minorHAnsi"/>
+          <w:b/>
+          <w:bCs/>
+          <w:sz w:val="30"/>
+          <w:szCs w:val="30"/>
+        </w:rPr>
+      </w:pPr>
+      <w:r>
+        <w:rPr>
+          <w:rFonts w:cstheme="minorHAnsi"/>
+          <w:b/>
+          <w:bCs/>
+          <w:sz w:val="30"/>
+          <w:szCs w:val="30"/>
+        </w:rPr>
+        <w:t>Step 3: Add Health Check to Each Microservice</w:t>
+      </w:r>
+    </w:p>
+    <w:p>
+      <w:pPr>
+        <w:tabs>
+          <w:tab w:val="num" w:pos="1440"/>
+        </w:tabs>
+        <w:spacing w:line="360" w:lineRule="auto"/>
+        <w:rPr>
+          <w:rFonts w:cstheme="minorHAnsi"/>
+          <w:sz w:val="28"/>
+          <w:szCs w:val="28"/>
+        </w:rPr>
+      </w:pPr>
+      <w:r>
+        <w:rPr>
+          <w:rFonts w:cstheme="minorHAnsi"/>
+          <w:sz w:val="28"/>
+          <w:szCs w:val="28"/>
+        </w:rPr>
+        <w:t xml:space="preserve">Add health checks to your microservices to monitor their readiness and liveness, enabling Docker to determine their status. You can configure each </w:t>
+      </w:r>
+      <w:r>
+        <w:rPr>
+          <w:rFonts w:cstheme="minorHAnsi"/>
+          <w:sz w:val="28"/>
+          <w:szCs w:val="28"/>
+        </w:rPr>
+        <w:lastRenderedPageBreak/>
+        <w:t xml:space="preserve">microservice to have a similar </w:t>
+      </w:r>
+      <w:proofErr w:type="spellStart"/>
+      <w:r>
+        <w:rPr>
+          <w:rFonts w:cstheme="minorHAnsi"/>
+          <w:sz w:val="28"/>
+          <w:szCs w:val="28"/>
+        </w:rPr>
+        <w:t>healthcheck</w:t>
+      </w:r>
+      <w:proofErr w:type="spellEnd"/>
+      <w:r>
+        <w:rPr>
+          <w:rFonts w:cstheme="minorHAnsi"/>
+          <w:sz w:val="28"/>
+          <w:szCs w:val="28"/>
+        </w:rPr>
+        <w:t xml:space="preserve"> section as the Config Server.</w:t>
+      </w:r>
+      <w:r>
+        <w:rPr>
+          <w:rFonts w:cstheme="minorHAnsi"/>
+          <w:noProof/>
+          <w:sz w:val="28"/>
+          <w:szCs w:val="28"/>
+        </w:rPr>
+        <w:drawing>
+          <wp:inline distT="0" distB="0" distL="0" distR="0" wp14:anchorId="0575D61B" wp14:editId="72786C72">
+            <wp:extent cx="5731510" cy="2835275"/>
+            <wp:effectExtent l="0" t="0" r="2540" b="3175"/>
+            <wp:docPr id="2101087920" name="Picture 1"/>
+            <wp:cNvGraphicFramePr>
+              <a:graphicFrameLocks xmlns:a="http://schemas.openxmlformats.org/drawingml/2006/main" noChangeAspect="1"/>
+            </wp:cNvGraphicFramePr>
+            <a:graphic xmlns:a="http://schemas.openxmlformats.org/drawingml/2006/main">
+              <a:graphicData uri="http://schemas.openxmlformats.org/drawingml/2006/picture">
+                <pic:pic xmlns:pic="http://schemas.openxmlformats.org/drawingml/2006/picture">
+                  <pic:nvPicPr>
+                    <pic:cNvPr id="2101087920" name=""/>
+                    <pic:cNvPicPr/>
+                  </pic:nvPicPr>
+                  <pic:blipFill>
+                    <a:blip r:embed="rId17"/>
+                    <a:stretch>
+                      <a:fillRect/>
+                    </a:stretch>
+                  </pic:blipFill>
+                  <pic:spPr>
+                    <a:xfrm>
+                      <a:off x="0" y="0"/>
+                      <a:ext cx="5731510" cy="2835275"/>
+                    </a:xfrm>
+                    <a:prstGeom prst="rect">
+                      <a:avLst/>
+                    </a:prstGeom>
+                  </pic:spPr>
+                </pic:pic>
+              </a:graphicData>
+            </a:graphic>
+          </wp:inline>
+        </w:drawing>
+      </w:r>
+    </w:p>
+    <w:p>
+      <w:pPr>
+        <w:tabs>
+          <w:tab w:val="num" w:pos="1440"/>
+        </w:tabs>
+        <w:spacing w:line="360" w:lineRule="auto"/>
+        <w:rPr>
+          <w:rFonts w:cstheme="minorHAnsi"/>
+          <w:b/>
+          <w:bCs/>
+          <w:sz w:val="28"/>
+          <w:szCs w:val="28"/>
+        </w:rPr>
+      </w:pPr>
+      <w:r>
+        <w:rPr>
+          <w:rFonts w:cstheme="minorHAnsi"/>
+          <w:b/>
+          <w:bCs/>
+          <w:sz w:val="28"/>
+          <w:szCs w:val="28"/>
+        </w:rPr>
+        <w:t>Testing Config Server Health</w:t>
+      </w:r>
+    </w:p>
+    <w:p>
+      <w:pPr>
+        <w:tabs>
+          <w:tab w:val="num" w:pos="1440"/>
+        </w:tabs>
+        <w:spacing w:line="360" w:lineRule="auto"/>
+        <w:rPr>
+          <w:rFonts w:cstheme="minorHAnsi"/>
+          <w:sz w:val="28"/>
+          <w:szCs w:val="28"/>
+        </w:rPr>
+      </w:pPr>
+      <w:r>
+        <w:rPr>
+          <w:rFonts w:cstheme="minorHAnsi"/>
+          <w:sz w:val="28"/>
+          <w:szCs w:val="28"/>
+        </w:rPr>
+        <w:t>You can check if the Config Server is running and healthy by calling:</w:t>
+      </w:r>
+    </w:p>
+    <w:p>
+      <w:pPr>
+        <w:numPr>
+          <w:ilvl w:val="0"/>
+          <w:numId w:val="24"/>
+        </w:numPr>
+        <w:tabs>
+          <w:tab w:val="num" w:pos="1440"/>
+        </w:tabs>
+        <w:spacing w:line="360" w:lineRule="auto"/>
+        <w:rPr>
+          <w:rFonts w:cstheme="minorHAnsi"/>
+          <w:sz w:val="28"/>
+          <w:szCs w:val="28"/>
+        </w:rPr>
+      </w:pPr>
+      <w:r>
+        <w:rPr>
+          <w:rFonts w:cstheme="minorHAnsi"/>
+          <w:sz w:val="28"/>
+          <w:szCs w:val="28"/>
+        </w:rPr>
+        <w:t>http://localhost:8071/actuator/health/readiness</w:t>
+      </w:r>
+    </w:p>
+    <w:p>
+      <w:pPr>
+        <w:numPr>
+          <w:ilvl w:val="0"/>
+          <w:numId w:val="24"/>
+        </w:numPr>
+        <w:tabs>
+          <w:tab w:val="num" w:pos="1440"/>
+        </w:tabs>
+        <w:spacing w:line="360" w:lineRule="auto"/>
+        <w:rPr>
+          <w:rFonts w:cstheme="minorHAnsi"/>
+          <w:sz w:val="28"/>
+          <w:szCs w:val="28"/>
+        </w:rPr>
+      </w:pPr>
+      <w:r>
+        <w:rPr>
+          <w:rFonts w:cstheme="minorHAnsi"/>
+          <w:sz w:val="28"/>
+          <w:szCs w:val="28"/>
+        </w:rPr>
+        <w:t>http://localhost:8071/actuator/health/liveness</w:t>
+      </w:r>
+    </w:p>
+    <w:p>
+      <w:pPr>
+        <w:tabs>
+          <w:tab w:val="num" w:pos="1440"/>
+        </w:tabs>
+        <w:spacing w:line="360" w:lineRule="auto"/>
+        <w:rPr>
+          <w:rFonts w:cstheme="minorHAnsi"/>
+          <w:sz w:val="28"/>
+          <w:szCs w:val="28"/>
+        </w:rPr>
+      </w:pPr>
+      <w:r>
+        <w:rPr>
+          <w:rFonts w:cstheme="minorHAnsi"/>
+          <w:sz w:val="28"/>
+          <w:szCs w:val="28"/>
+        </w:rPr>
+        <w:t>This will confirm whether the Config Server and other microservices are up and ready to serve requests.</w:t>
+      </w:r>
+    </w:p>
+    <w:p>
+      <w:pPr>
+        <w:tabs>
+          <w:tab w:val="num" w:pos="1440"/>
+        </w:tabs>
+        <w:spacing w:line="360" w:lineRule="auto"/>
+        <w:rPr>
+          <w:rFonts w:cstheme="minorHAnsi"/>
+          <w:sz w:val="28"/>
+          <w:szCs w:val="28"/>
+        </w:rPr>
+      </w:pPr>
+      <w:r>
+        <w:rPr>
+          <w:rFonts w:cstheme="minorHAnsi"/>
+          <w:sz w:val="28"/>
+          <w:szCs w:val="28"/>
+        </w:rPr>
+        <w:t>By following these steps, your microservices and Config Server are containerized and properly orchestrated with Docker Compose, ready for local testing and deployment into environments like Kubernetes.</w:t>
+      </w:r>
+    </w:p>
+    <w:p>
+      <w:pPr>
+        <w:tabs>
+          <w:tab w:val="num" w:pos="1440"/>
+        </w:tabs>
+        <w:spacing w:line="360" w:lineRule="auto"/>
+        <w:rPr>
+          <w:rFonts w:cstheme="minorHAnsi"/>
+          <w:sz w:val="28"/>
+          <w:szCs w:val="28"/>
+        </w:rPr>
+      </w:pPr>
+      <w:r>
+        <w:rPr>
+          <w:rFonts w:cstheme="minorHAnsi"/>
+          <w:noProof/>
+          <w:sz w:val="28"/>
+          <w:szCs w:val="28"/>
+        </w:rPr>
+        <w:lastRenderedPageBreak/>
+        <w:drawing>
+          <wp:inline distT="0" distB="0" distL="0" distR="0" wp14:anchorId="51F0F3B6" wp14:editId="13C09285">
+            <wp:extent cx="5731510" cy="2729865"/>
+            <wp:effectExtent l="0" t="0" r="2540" b="0"/>
+            <wp:docPr id="1798263093" name="Picture 1"/>
+            <wp:cNvGraphicFramePr>
+              <a:graphicFrameLocks xmlns:a="http://schemas.openxmlformats.org/drawingml/2006/main" noChangeAspect="1"/>
+            </wp:cNvGraphicFramePr>
+            <a:graphic xmlns:a="http://schemas.openxmlformats.org/drawingml/2006/main">
+              <a:graphicData uri="http://schemas.openxmlformats.org/drawingml/2006/picture">
+                <pic:pic xmlns:pic="http://schemas.openxmlformats.org/drawingml/2006/picture">
+                  <pic:nvPicPr>
+                    <pic:cNvPr id="1798263093" name=""/>
+                    <pic:cNvPicPr/>
+                  </pic:nvPicPr>
+                  <pic:blipFill>
+                    <a:blip r:embed="rId18"/>
+                    <a:stretch>
+                      <a:fillRect/>
+                    </a:stretch>
+                  </pic:blipFill>
+                  <pic:spPr>
+                    <a:xfrm>
+                      <a:off x="0" y="0"/>
+                      <a:ext cx="5731510" cy="2729865"/>
+                    </a:xfrm>
+                    <a:prstGeom prst="rect">
+                      <a:avLst/>
+                    </a:prstGeom>
+                  </pic:spPr>
+                </pic:pic>
+              </a:graphicData>
+            </a:graphic>
+          </wp:inline>
+        </w:drawing>
+      </w:r>
+    </w:p>
+    <w:p>
+      <w:pPr>
+        <w:tabs>
+          <w:tab w:val="num" w:pos="1440"/>
+        </w:tabs>
+        <w:spacing w:line="360" w:lineRule="auto"/>
+        <w:rPr>
+          <w:rFonts w:cstheme="minorHAnsi"/>
+          <w:sz w:val="28"/>
+          <w:szCs w:val="28"/>
+        </w:rPr>
+      </w:pPr>
+      <w:r>
+        <w:rPr>
+          <w:rFonts w:cstheme="minorHAnsi"/>
+          <w:sz w:val="28"/>
+          <w:szCs w:val="28"/>
+        </w:rPr>
+        <w:t xml:space="preserve">Now we’ve added above piece of code for </w:t>
+      </w:r>
+      <w:proofErr w:type="spellStart"/>
+      <w:r>
+        <w:rPr>
+          <w:rFonts w:cstheme="minorHAnsi"/>
+          <w:sz w:val="28"/>
+          <w:szCs w:val="28"/>
+        </w:rPr>
+        <w:t>healthcheck</w:t>
+      </w:r>
+      <w:proofErr w:type="spellEnd"/>
+      <w:r>
+        <w:rPr>
+          <w:rFonts w:cstheme="minorHAnsi"/>
+          <w:sz w:val="28"/>
+          <w:szCs w:val="28"/>
+        </w:rPr>
+        <w:t xml:space="preserve"> under docker-</w:t>
+      </w:r>
+      <w:proofErr w:type="spellStart"/>
+      <w:r>
+        <w:rPr>
+          <w:rFonts w:cstheme="minorHAnsi"/>
+          <w:sz w:val="28"/>
+          <w:szCs w:val="28"/>
+        </w:rPr>
+        <w:t>compose.yml</w:t>
+      </w:r>
+      <w:proofErr w:type="spellEnd"/>
+      <w:r>
+        <w:rPr>
+          <w:rFonts w:cstheme="minorHAnsi"/>
+          <w:sz w:val="28"/>
+          <w:szCs w:val="28"/>
+        </w:rPr>
+        <w:t xml:space="preserve"> file to check readiness of the </w:t>
+      </w:r>
+      <w:proofErr w:type="spellStart"/>
+      <w:r>
+        <w:rPr>
+          <w:rFonts w:cstheme="minorHAnsi"/>
+          <w:sz w:val="28"/>
+          <w:szCs w:val="28"/>
+        </w:rPr>
+        <w:t>configserver</w:t>
+      </w:r>
+      <w:proofErr w:type="spellEnd"/>
+      <w:r>
+        <w:rPr>
+          <w:rFonts w:cstheme="minorHAnsi"/>
+          <w:sz w:val="28"/>
+          <w:szCs w:val="28"/>
+        </w:rPr>
+        <w:t>.</w:t>
+      </w:r>
+    </w:p>
+    <w:p>
+      <w:pPr>
+        <w:tabs>
+          <w:tab w:val="num" w:pos="1440"/>
+        </w:tabs>
+        <w:spacing w:line="360" w:lineRule="auto"/>
+        <w:rPr>
+          <w:rFonts w:cstheme="minorHAnsi"/>
+          <w:b/>
+          <w:bCs/>
+          <w:sz w:val="28"/>
+          <w:szCs w:val="28"/>
+        </w:rPr>
+      </w:pPr>
+      <w:r>
+        <w:rPr>
+          <w:rFonts w:cstheme="minorHAnsi"/>
+          <w:b/>
+          <w:bCs/>
+          <w:sz w:val="28"/>
+          <w:szCs w:val="28"/>
+        </w:rPr>
+        <w:t xml:space="preserve">Explanation of </w:t>
+      </w:r>
+      <w:proofErr w:type="spellStart"/>
+      <w:r>
+        <w:rPr>
+          <w:rFonts w:cstheme="minorHAnsi"/>
+          <w:b/>
+          <w:bCs/>
+          <w:sz w:val="28"/>
+          <w:szCs w:val="28"/>
+        </w:rPr>
+        <w:t>healthcheck</w:t>
+      </w:r>
+      <w:proofErr w:type="spellEnd"/>
+      <w:r>
+        <w:rPr>
+          <w:rFonts w:cstheme="minorHAnsi"/>
+          <w:b/>
+          <w:bCs/>
+          <w:sz w:val="28"/>
+          <w:szCs w:val="28"/>
+        </w:rPr>
+        <w:t xml:space="preserve"> Configuration</w:t>
+      </w:r>
+    </w:p>
+    <w:p>
+      <w:pPr>
+        <w:numPr>
+          <w:ilvl w:val="0"/>
+          <w:numId w:val="18"/>
+        </w:numPr>
+        <w:tabs>
+          <w:tab w:val="num" w:pos="1440"/>
+        </w:tabs>
+        <w:spacing w:line="360" w:lineRule="auto"/>
+        <w:rPr>
+          <w:rFonts w:cstheme="minorHAnsi"/>
+          <w:sz w:val="28"/>
+          <w:szCs w:val="28"/>
+        </w:rPr>
+      </w:pPr>
+      <w:r>
+        <w:rPr>
+          <w:rFonts w:cstheme="minorHAnsi"/>
+          <w:b/>
+          <w:bCs/>
+          <w:sz w:val="28"/>
+          <w:szCs w:val="28"/>
+        </w:rPr>
+        <w:t>test: "curl --fail --silent http://localhost:8071/actuator/health/readiness | grep UP || exit 1"</w:t>
+      </w:r>
+    </w:p>
+    <w:p>
+      <w:pPr>
+        <w:numPr>
+          <w:ilvl w:val="1"/>
+          <w:numId w:val="18"/>
+        </w:numPr>
+        <w:spacing w:line="360" w:lineRule="auto"/>
+        <w:rPr>
+          <w:rFonts w:cstheme="minorHAnsi"/>
+          <w:sz w:val="28"/>
+          <w:szCs w:val="28"/>
+        </w:rPr>
+      </w:pPr>
+      <w:r>
+        <w:rPr>
+          <w:rFonts w:cstheme="minorHAnsi"/>
+          <w:sz w:val="28"/>
+          <w:szCs w:val="28"/>
+        </w:rPr>
+        <w:t>This command checks the container's readiness by making an HTTP request to the endpoint http://localhost:8071/actuator/health/readiness.</w:t>
+      </w:r>
+    </w:p>
+    <w:p>
+      <w:pPr>
+        <w:numPr>
+          <w:ilvl w:val="1"/>
+          <w:numId w:val="18"/>
+        </w:numPr>
+        <w:spacing w:line="360" w:lineRule="auto"/>
+        <w:rPr>
+          <w:rFonts w:cstheme="minorHAnsi"/>
+          <w:sz w:val="28"/>
+          <w:szCs w:val="28"/>
+        </w:rPr>
+      </w:pPr>
+      <w:r>
+        <w:rPr>
+          <w:rFonts w:cstheme="minorHAnsi"/>
+          <w:sz w:val="28"/>
+          <w:szCs w:val="28"/>
+        </w:rPr>
+        <w:t>curl --fail --silent:</w:t>
+      </w:r>
+    </w:p>
+    <w:p>
+      <w:pPr>
+        <w:numPr>
+          <w:ilvl w:val="2"/>
+          <w:numId w:val="18"/>
+        </w:numPr>
+        <w:tabs>
+          <w:tab w:val="num" w:pos="1440"/>
+        </w:tabs>
+        <w:spacing w:line="360" w:lineRule="auto"/>
+        <w:rPr>
+          <w:rFonts w:cstheme="minorHAnsi"/>
+          <w:sz w:val="28"/>
+          <w:szCs w:val="28"/>
+        </w:rPr>
+      </w:pPr>
+      <w:r>
+        <w:rPr>
+          <w:rFonts w:cstheme="minorHAnsi"/>
+          <w:sz w:val="28"/>
+          <w:szCs w:val="28"/>
+        </w:rPr>
+        <w:t>--fail: curl will exit with a non-zero status if the HTTP request fails (e.g., if the server returns a 4xx or 5xx status).</w:t>
+      </w:r>
+    </w:p>
+    <w:p>
+      <w:pPr>
+        <w:numPr>
+          <w:ilvl w:val="2"/>
+          <w:numId w:val="18"/>
+        </w:numPr>
+        <w:tabs>
+          <w:tab w:val="num" w:pos="1440"/>
+        </w:tabs>
+        <w:spacing w:line="360" w:lineRule="auto"/>
+        <w:rPr>
+          <w:rFonts w:cstheme="minorHAnsi"/>
+          <w:sz w:val="28"/>
+          <w:szCs w:val="28"/>
+        </w:rPr>
+      </w:pPr>
+      <w:r>
+        <w:rPr>
+          <w:rFonts w:cstheme="minorHAnsi"/>
+          <w:sz w:val="28"/>
+          <w:szCs w:val="28"/>
+        </w:rPr>
+        <w:t>--silent: suppresses any output except for errors.</w:t>
+      </w:r>
+    </w:p>
+    <w:p>
+      <w:pPr>
+        <w:numPr>
+          <w:ilvl w:val="1"/>
+          <w:numId w:val="18"/>
+        </w:numPr>
+        <w:spacing w:line="360" w:lineRule="auto"/>
+        <w:rPr>
+          <w:rFonts w:cstheme="minorHAnsi"/>
+          <w:sz w:val="28"/>
+          <w:szCs w:val="28"/>
+        </w:rPr>
+      </w:pPr>
+      <w:r>
+        <w:rPr>
+          <w:rFonts w:cstheme="minorHAnsi"/>
+          <w:sz w:val="28"/>
+          <w:szCs w:val="28"/>
+        </w:rPr>
+        <w:t>The response is piped to grep UP, searching for the text "UP" in the response (typically, a healthy status from a Spring Boot actuator endpoint).</w:t>
+      </w:r>
+    </w:p>
+    <w:p>
+      <w:pPr>
+        <w:numPr>
+          <w:ilvl w:val="1"/>
+          <w:numId w:val="18"/>
+        </w:numPr>
+        <w:spacing w:line="360" w:lineRule="auto"/>
+        <w:rPr>
+          <w:rFonts w:cstheme="minorHAnsi"/>
+          <w:sz w:val="28"/>
+          <w:szCs w:val="28"/>
+        </w:rPr>
+      </w:pPr>
+      <w:r>
+        <w:rPr>
+          <w:rFonts w:cstheme="minorHAnsi"/>
+          <w:sz w:val="28"/>
+          <w:szCs w:val="28"/>
+        </w:rPr>
+        <w:lastRenderedPageBreak/>
+        <w:t>|| exit 1: If "UP" is not found, the command exits with status 1, marking the health check as failed.</w:t>
+      </w:r>
+    </w:p>
+    <w:p>
+      <w:pPr>
+        <w:tabs>
+          <w:tab w:val="num" w:pos="1440"/>
+        </w:tabs>
+        <w:spacing w:line="360" w:lineRule="auto"/>
+        <w:rPr>
+          <w:rFonts w:cstheme="minorHAnsi"/>
+          <w:sz w:val="28"/>
+          <w:szCs w:val="28"/>
+        </w:rPr>
+      </w:pPr>
+      <w:r>
+        <w:rPr>
+          <w:rFonts w:cstheme="minorHAnsi"/>
+          <w:sz w:val="28"/>
+          <w:szCs w:val="28"/>
+        </w:rPr>
+        <w:t>2.</w:t>
+      </w:r>
+      <w:r>
+        <w:rPr>
+          <w:rFonts w:cstheme="minorHAnsi"/>
+          <w:sz w:val="28"/>
+          <w:szCs w:val="28"/>
+        </w:rPr>
+        <w:t xml:space="preserve">  </w:t>
+      </w:r>
+      <w:r>
+        <w:rPr>
+          <w:rFonts w:cstheme="minorHAnsi"/>
+          <w:b/>
+          <w:bCs/>
+          <w:sz w:val="28"/>
+          <w:szCs w:val="28"/>
+        </w:rPr>
+        <w:t>interval: 10s</w:t>
+      </w:r>
+    </w:p>
+    <w:p>
+      <w:pPr>
+        <w:numPr>
+          <w:ilvl w:val="0"/>
+          <w:numId w:val="19"/>
+        </w:numPr>
+        <w:tabs>
+          <w:tab w:val="num" w:pos="1440"/>
+        </w:tabs>
+        <w:spacing w:line="360" w:lineRule="auto"/>
+        <w:rPr>
+          <w:rFonts w:cstheme="minorHAnsi"/>
+          <w:sz w:val="28"/>
+          <w:szCs w:val="28"/>
+        </w:rPr>
+      </w:pPr>
+      <w:r>
+        <w:rPr>
+          <w:rFonts w:cstheme="minorHAnsi"/>
+          <w:sz w:val="28"/>
+          <w:szCs w:val="28"/>
+        </w:rPr>
+        <w:t>Docker waits 10 seconds between each health check attempt. This is how often Docker checks the health status.</w:t>
+      </w:r>
+    </w:p>
+    <w:p>
+      <w:pPr>
+        <w:tabs>
+          <w:tab w:val="num" w:pos="1440"/>
+        </w:tabs>
+        <w:spacing w:line="360" w:lineRule="auto"/>
+        <w:rPr>
+          <w:rFonts w:cstheme="minorHAnsi"/>
+          <w:sz w:val="28"/>
+          <w:szCs w:val="28"/>
+        </w:rPr>
+      </w:pPr>
+      <w:r>
+        <w:rPr>
+          <w:rFonts w:cstheme="minorHAnsi"/>
+          <w:sz w:val="28"/>
+          <w:szCs w:val="28"/>
+        </w:rPr>
+        <w:t>3.</w:t>
+      </w:r>
+      <w:r>
+        <w:rPr>
+          <w:rFonts w:cstheme="minorHAnsi"/>
+          <w:sz w:val="28"/>
+          <w:szCs w:val="28"/>
+        </w:rPr>
+        <w:t xml:space="preserve">  </w:t>
+      </w:r>
+      <w:r>
+        <w:rPr>
+          <w:rFonts w:cstheme="minorHAnsi"/>
+          <w:b/>
+          <w:bCs/>
+          <w:sz w:val="28"/>
+          <w:szCs w:val="28"/>
+        </w:rPr>
+        <w:t>timeout: 5s</w:t>
+      </w:r>
+    </w:p>
+    <w:p>
+      <w:pPr>
+        <w:numPr>
+          <w:ilvl w:val="0"/>
+          <w:numId w:val="20"/>
+        </w:numPr>
+        <w:tabs>
+          <w:tab w:val="num" w:pos="1440"/>
+        </w:tabs>
+        <w:spacing w:line="360" w:lineRule="auto"/>
+        <w:rPr>
+          <w:rFonts w:cstheme="minorHAnsi"/>
+          <w:sz w:val="28"/>
+          <w:szCs w:val="28"/>
+        </w:rPr>
+      </w:pPr>
+      <w:r>
+        <w:rPr>
+          <w:rFonts w:cstheme="minorHAnsi"/>
+          <w:sz w:val="28"/>
+          <w:szCs w:val="28"/>
+        </w:rPr>
+        <w:t>Each health check attempt has a timeout of 5 seconds. If the health check does not complete within this time, Docker marks it as failed.</w:t>
+      </w:r>
+    </w:p>
+    <w:p>
+      <w:pPr>
+        <w:tabs>
+          <w:tab w:val="num" w:pos="1440"/>
+        </w:tabs>
+        <w:spacing w:line="360" w:lineRule="auto"/>
+        <w:rPr>
+          <w:rFonts w:cstheme="minorHAnsi"/>
+          <w:sz w:val="28"/>
+          <w:szCs w:val="28"/>
+        </w:rPr>
+      </w:pPr>
+      <w:r>
+        <w:rPr>
+          <w:rFonts w:cstheme="minorHAnsi"/>
+          <w:sz w:val="28"/>
+          <w:szCs w:val="28"/>
+        </w:rPr>
+        <w:t xml:space="preserve"> </w:t>
+      </w:r>
+      <w:r>
+        <w:rPr>
+          <w:rFonts w:cstheme="minorHAnsi"/>
+          <w:sz w:val="28"/>
+          <w:szCs w:val="28"/>
+        </w:rPr>
+        <w:t>4.</w:t>
+      </w:r>
+      <w:r>
+        <w:rPr>
+          <w:rFonts w:cstheme="minorHAnsi"/>
+          <w:sz w:val="28"/>
+          <w:szCs w:val="28"/>
+        </w:rPr>
+        <w:t xml:space="preserve"> </w:t>
+      </w:r>
+      <w:r>
+        <w:rPr>
+          <w:rFonts w:cstheme="minorHAnsi"/>
+          <w:b/>
+          <w:bCs/>
+          <w:sz w:val="28"/>
+          <w:szCs w:val="28"/>
+        </w:rPr>
+        <w:t>retries: 10</w:t>
+      </w:r>
+    </w:p>
+    <w:p>
+      <w:pPr>
+        <w:numPr>
+          <w:ilvl w:val="0"/>
+          <w:numId w:val="21"/>
+        </w:numPr>
+        <w:tabs>
+          <w:tab w:val="num" w:pos="1440"/>
+        </w:tabs>
+        <w:spacing w:line="360" w:lineRule="auto"/>
+        <w:rPr>
+          <w:rFonts w:cstheme="minorHAnsi"/>
+          <w:sz w:val="28"/>
+          <w:szCs w:val="28"/>
+        </w:rPr>
+      </w:pPr>
+      <w:r>
+        <w:rPr>
+          <w:rFonts w:cstheme="minorHAnsi"/>
+          <w:sz w:val="28"/>
+          <w:szCs w:val="28"/>
+        </w:rPr>
+        <w:t>Docker will retry the health check 10 times before considering the container unhealthy. If the health check fails consecutively 10 times, the container is marked as unhealthy.</w:t>
+      </w:r>
+    </w:p>
+    <w:p>
+      <w:pPr>
+        <w:tabs>
+          <w:tab w:val="num" w:pos="1440"/>
+        </w:tabs>
+        <w:spacing w:line="360" w:lineRule="auto"/>
+        <w:rPr>
+          <w:rFonts w:cstheme="minorHAnsi"/>
+          <w:sz w:val="28"/>
+          <w:szCs w:val="28"/>
+        </w:rPr>
+      </w:pPr>
+      <w:r>
+        <w:rPr>
+          <w:rFonts w:cstheme="minorHAnsi"/>
+          <w:sz w:val="28"/>
+          <w:szCs w:val="28"/>
+        </w:rPr>
+        <w:t xml:space="preserve">5. </w:t>
+      </w:r>
+      <w:proofErr w:type="spellStart"/>
+      <w:r>
+        <w:rPr>
+          <w:rFonts w:cstheme="minorHAnsi"/>
+          <w:b/>
+          <w:bCs/>
+          <w:sz w:val="28"/>
+          <w:szCs w:val="28"/>
+        </w:rPr>
+        <w:t>start_period</w:t>
+      </w:r>
+      <w:proofErr w:type="spellEnd"/>
+      <w:r>
+        <w:rPr>
+          <w:rFonts w:cstheme="minorHAnsi"/>
+          <w:b/>
+          <w:bCs/>
+          <w:sz w:val="28"/>
+          <w:szCs w:val="28"/>
+        </w:rPr>
+        <w:t>: 10s</w:t>
+      </w:r>
+    </w:p>
+    <w:p>
+      <w:pPr>
+        <w:numPr>
+          <w:ilvl w:val="0"/>
+          <w:numId w:val="22"/>
+        </w:numPr>
+        <w:tabs>
+          <w:tab w:val="num" w:pos="1440"/>
+        </w:tabs>
+        <w:spacing w:line="360" w:lineRule="auto"/>
+        <w:rPr>
+          <w:rFonts w:cstheme="minorHAnsi"/>
+          <w:sz w:val="28"/>
+          <w:szCs w:val="28"/>
+        </w:rPr>
+      </w:pPr>
+      <w:r>
+        <w:rPr>
+          <w:rFonts w:cstheme="minorHAnsi"/>
+          <w:sz w:val="28"/>
+          <w:szCs w:val="28"/>
+        </w:rPr>
+        <w:t>This is a grace period of 10 seconds after the container starts, during which Docker will not consider failed health checks as actual failures. This gives the container time to initialize before checks are enforced.</w:t>
+      </w:r>
+    </w:p>
+    <w:p>
+      <w:pPr>
+        <w:tabs>
+          <w:tab w:val="num" w:pos="1440"/>
+        </w:tabs>
+        <w:spacing w:line="360" w:lineRule="auto"/>
+        <w:rPr>
+          <w:rFonts w:cstheme="minorHAnsi"/>
+          <w:sz w:val="28"/>
+          <w:szCs w:val="28"/>
+        </w:rPr>
+      </w:pPr>
+      <w:r>
+        <w:rPr>
+          <w:rFonts w:cstheme="minorHAnsi"/>
+          <w:sz w:val="28"/>
+          <w:szCs w:val="28"/>
+        </w:rPr>
+        <w:t>After configuring and checking all readiness and liveness of the config server, we’ve to specify the condition under other microservice</w:t>
+      </w:r>
+      <w:r>
+        <w:rPr>
+          <w:rFonts w:cstheme="minorHAnsi"/>
+          <w:sz w:val="28"/>
+          <w:szCs w:val="28"/>
+        </w:rPr>
+        <w:t xml:space="preserve"> as below:</w:t>
+      </w:r>
+    </w:p>
+    <w:p>
+      <w:pPr>
+        <w:tabs>
+          <w:tab w:val="num" w:pos="1440"/>
+        </w:tabs>
+        <w:spacing w:line="360" w:lineRule="auto"/>
+        <w:rPr>
+          <w:rFonts w:cstheme="minorHAnsi"/>
+          <w:sz w:val="28"/>
+          <w:szCs w:val="28"/>
+        </w:rPr>
+      </w:pPr>
+      <w:r>
+        <w:rPr>
+          <w:rFonts w:cstheme="minorHAnsi"/>
+          <w:noProof/>
+          <w:sz w:val="28"/>
+          <w:szCs w:val="28"/>
+        </w:rPr>
+        <w:lastRenderedPageBreak/>
+        <w:drawing>
+          <wp:inline distT="0" distB="0" distL="0" distR="0" wp14:anchorId="1458D158" wp14:editId="006A5D84">
+            <wp:extent cx="5731510" cy="3656965"/>
+            <wp:effectExtent l="0" t="0" r="2540" b="635"/>
+            <wp:docPr id="651497131" name="Picture 1"/>
+            <wp:cNvGraphicFramePr>
+              <a:graphicFrameLocks xmlns:a="http://schemas.openxmlformats.org/drawingml/2006/main" noChangeAspect="1"/>
+            </wp:cNvGraphicFramePr>
+            <a:graphic xmlns:a="http://schemas.openxmlformats.org/drawingml/2006/main">
+              <a:graphicData uri="http://schemas.openxmlformats.org/drawingml/2006/picture">
+                <pic:pic xmlns:pic="http://schemas.openxmlformats.org/drawingml/2006/picture">
+                  <pic:nvPicPr>
+                    <pic:cNvPr id="651497131" name=""/>
+                    <pic:cNvPicPr/>
+                  </pic:nvPicPr>
+                  <pic:blipFill>
+                    <a:blip r:embed="rId19"/>
+                    <a:stretch>
+                      <a:fillRect/>
+                    </a:stretch>
+                  </pic:blipFill>
+                  <pic:spPr>
+                    <a:xfrm>
+                      <a:off x="0" y="0"/>
+                      <a:ext cx="5731510" cy="3656965"/>
+                    </a:xfrm>
+                    <a:prstGeom prst="rect">
+                      <a:avLst/>
+                    </a:prstGeom>
+                  </pic:spPr>
+                </pic:pic>
+              </a:graphicData>
+            </a:graphic>
+          </wp:inline>
+        </w:drawing>
+      </w:r>
+    </w:p>
+    <w:p>
+      <w:pPr>
+        <w:tabs>
+          <w:tab w:val="num" w:pos="1440"/>
+        </w:tabs>
+        <w:spacing w:line="360" w:lineRule="auto"/>
+        <w:rPr>
+          <w:rFonts w:cstheme="minorHAnsi"/>
+          <w:sz w:val="28"/>
+          <w:szCs w:val="28"/>
+        </w:rPr>
+      </w:pPr>
+      <w:r>
+        <w:rPr>
+          <w:rFonts w:cstheme="minorHAnsi"/>
+          <w:sz w:val="28"/>
+          <w:szCs w:val="28"/>
+        </w:rPr>
+        <w:t xml:space="preserve">With the health check in place, you can configure the accounts service to wait for </w:t>
+      </w:r>
+      <w:proofErr w:type="spellStart"/>
+      <w:r>
+        <w:rPr>
+          <w:rFonts w:cstheme="minorHAnsi"/>
+          <w:sz w:val="28"/>
+          <w:szCs w:val="28"/>
+        </w:rPr>
+        <w:t>configserver</w:t>
+      </w:r>
+      <w:proofErr w:type="spellEnd"/>
+      <w:r>
+        <w:rPr>
+          <w:rFonts w:cstheme="minorHAnsi"/>
+          <w:sz w:val="28"/>
+          <w:szCs w:val="28"/>
+        </w:rPr>
+        <w:t xml:space="preserve"> to be healthy before starting. This is done using the </w:t>
+      </w:r>
+      <w:proofErr w:type="spellStart"/>
+      <w:r>
+        <w:rPr>
+          <w:rFonts w:cstheme="minorHAnsi"/>
+          <w:sz w:val="28"/>
+          <w:szCs w:val="28"/>
+        </w:rPr>
+        <w:t>depends_on</w:t>
+      </w:r>
+      <w:proofErr w:type="spellEnd"/>
+      <w:r>
+        <w:rPr>
+          <w:rFonts w:cstheme="minorHAnsi"/>
+          <w:sz w:val="28"/>
+          <w:szCs w:val="28"/>
+        </w:rPr>
+        <w:t xml:space="preserve"> configuration with the condition: </w:t>
+      </w:r>
+      <w:proofErr w:type="spellStart"/>
+      <w:r>
+        <w:rPr>
+          <w:rFonts w:cstheme="minorHAnsi"/>
+          <w:sz w:val="28"/>
+          <w:szCs w:val="28"/>
+        </w:rPr>
+        <w:t>service_healthy</w:t>
+      </w:r>
+      <w:proofErr w:type="spellEnd"/>
+      <w:r>
+        <w:rPr>
+          <w:rFonts w:cstheme="minorHAnsi"/>
+          <w:sz w:val="28"/>
+          <w:szCs w:val="28"/>
+        </w:rPr>
+        <w:t>.</w:t>
+      </w:r>
+    </w:p>
+    <w:p>
+      <w:pPr>
+        <w:tabs>
+          <w:tab w:val="num" w:pos="1440"/>
+        </w:tabs>
+        <w:spacing w:line="360" w:lineRule="auto"/>
+        <w:rPr>
+          <w:rFonts w:cstheme="minorHAnsi"/>
+          <w:sz w:val="28"/>
+          <w:szCs w:val="28"/>
+        </w:rPr>
+      </w:pPr>
+    </w:p>
+    <w:p>
+      <w:pPr>
+        <w:tabs>
+          <w:tab w:val="num" w:pos="1440"/>
+        </w:tabs>
+        <w:spacing w:line="360" w:lineRule="auto"/>
+        <w:rPr>
+          <w:rFonts w:cstheme="minorHAnsi"/>
+          <w:sz w:val="28"/>
+          <w:szCs w:val="28"/>
+        </w:rPr>
+      </w:pPr>
+      <w:r>
+        <w:rPr>
+          <w:rFonts w:cstheme="minorHAnsi"/>
+          <w:sz w:val="28"/>
+          <w:szCs w:val="28"/>
+        </w:rPr>
+        <w:t>To optimize your Docker</w:t>
+      </w:r>
+      <w:r>
+        <w:rPr>
+          <w:rFonts w:cstheme="minorHAnsi"/>
+          <w:sz w:val="28"/>
+          <w:szCs w:val="28"/>
+        </w:rPr>
+        <w:t>-</w:t>
+      </w:r>
+      <w:r>
+        <w:rPr>
+          <w:rFonts w:cstheme="minorHAnsi"/>
+          <w:sz w:val="28"/>
+          <w:szCs w:val="28"/>
+        </w:rPr>
+        <w:t xml:space="preserve">Compose setup, you can use a </w:t>
+      </w:r>
+      <w:proofErr w:type="spellStart"/>
+      <w:r>
+        <w:rPr>
+          <w:rFonts w:cstheme="minorHAnsi"/>
+          <w:sz w:val="28"/>
+          <w:szCs w:val="28"/>
+        </w:rPr>
+        <w:t>common_config.yml</w:t>
+      </w:r>
+      <w:proofErr w:type="spellEnd"/>
+      <w:r>
+        <w:rPr>
+          <w:rFonts w:cstheme="minorHAnsi"/>
+          <w:sz w:val="28"/>
+          <w:szCs w:val="28"/>
+        </w:rPr>
+        <w:t xml:space="preserve"> file to define shared configurations like networks, </w:t>
+      </w:r>
+      <w:proofErr w:type="spellStart"/>
+      <w:r>
+        <w:rPr>
+          <w:rFonts w:cstheme="minorHAnsi"/>
+          <w:sz w:val="28"/>
+          <w:szCs w:val="28"/>
+        </w:rPr>
+        <w:t>depends_on</w:t>
+      </w:r>
+      <w:proofErr w:type="spellEnd"/>
+      <w:r>
+        <w:rPr>
+          <w:rFonts w:cstheme="minorHAnsi"/>
+          <w:sz w:val="28"/>
+          <w:szCs w:val="28"/>
+        </w:rPr>
+        <w:t xml:space="preserve">, </w:t>
+      </w:r>
+      <w:proofErr w:type="spellStart"/>
+      <w:r>
+        <w:rPr>
+          <w:rFonts w:cstheme="minorHAnsi"/>
+          <w:sz w:val="28"/>
+          <w:szCs w:val="28"/>
+        </w:rPr>
+        <w:t>memory_size</w:t>
+      </w:r>
+      <w:proofErr w:type="spellEnd"/>
+      <w:r>
+        <w:rPr>
+          <w:rFonts w:cstheme="minorHAnsi"/>
+          <w:sz w:val="28"/>
+          <w:szCs w:val="28"/>
+        </w:rPr>
+        <w:t>, etc., which can then be referenced in docker-</w:t>
+      </w:r>
+      <w:proofErr w:type="spellStart"/>
+      <w:r>
+        <w:rPr>
+          <w:rFonts w:cstheme="minorHAnsi"/>
+          <w:sz w:val="28"/>
+          <w:szCs w:val="28"/>
+        </w:rPr>
+        <w:t>compose.yml</w:t>
+      </w:r>
+      <w:proofErr w:type="spellEnd"/>
+      <w:r>
+        <w:rPr>
+          <w:rFonts w:cstheme="minorHAnsi"/>
+          <w:sz w:val="28"/>
+          <w:szCs w:val="28"/>
+        </w:rPr>
+        <w:t>. This reduces redundancy and makes your configuration cleaner.</w:t>
+      </w:r>
+    </w:p>
+    <w:p>
+      <w:pPr>
+        <w:tabs>
+          <w:tab w:val="num" w:pos="1440"/>
+        </w:tabs>
+        <w:spacing w:line="360" w:lineRule="auto"/>
+        <w:rPr>
+          <w:rFonts w:cstheme="minorHAnsi"/>
+          <w:sz w:val="28"/>
+          <w:szCs w:val="28"/>
+        </w:rPr>
+      </w:pPr>
+      <w:r>
+        <w:rPr>
+          <w:rFonts w:cstheme="minorHAnsi"/>
+          <w:sz w:val="28"/>
+          <w:szCs w:val="28"/>
+        </w:rPr>
+        <w:t>Here’s how to set this up:</w:t>
+      </w:r>
+    </w:p>
+    <w:p>
+      <w:pPr>
+        <w:tabs>
+          <w:tab w:val="num" w:pos="1440"/>
+        </w:tabs>
+        <w:spacing w:line="360" w:lineRule="auto"/>
+        <w:rPr>
+          <w:rFonts w:cstheme="minorHAnsi"/>
+          <w:b/>
+          <w:bCs/>
+          <w:sz w:val="28"/>
+          <w:szCs w:val="28"/>
+        </w:rPr>
+      </w:pPr>
+      <w:r>
+        <w:rPr>
+          <w:rFonts w:cstheme="minorHAnsi"/>
+          <w:b/>
+          <w:bCs/>
+          <w:sz w:val="28"/>
+          <w:szCs w:val="28"/>
+        </w:rPr>
+        <w:t xml:space="preserve">Step 1: Create </w:t>
+      </w:r>
+      <w:proofErr w:type="spellStart"/>
+      <w:r>
+        <w:rPr>
+          <w:rFonts w:cstheme="minorHAnsi"/>
+          <w:b/>
+          <w:bCs/>
+          <w:sz w:val="28"/>
+          <w:szCs w:val="28"/>
+        </w:rPr>
+        <w:t>common_config.yml</w:t>
+      </w:r>
+      <w:proofErr w:type="spellEnd"/>
+    </w:p>
+    <w:p>
+      <w:pPr>
+        <w:tabs>
+          <w:tab w:val="num" w:pos="1440"/>
+        </w:tabs>
+        <w:spacing w:line="360" w:lineRule="auto"/>
+        <w:rPr>
+          <w:rFonts w:cstheme="minorHAnsi"/>
+          <w:sz w:val="28"/>
+          <w:szCs w:val="28"/>
+        </w:rPr>
+      </w:pPr>
+      <w:r>
+        <w:rPr>
+          <w:rFonts w:cstheme="minorHAnsi"/>
+          <w:sz w:val="28"/>
+          <w:szCs w:val="28"/>
+        </w:rPr>
+        <w:t xml:space="preserve">In </w:t>
+      </w:r>
+      <w:proofErr w:type="spellStart"/>
+      <w:r>
+        <w:rPr>
+          <w:rFonts w:cstheme="minorHAnsi"/>
+          <w:sz w:val="28"/>
+          <w:szCs w:val="28"/>
+        </w:rPr>
+        <w:t>common_config.yml</w:t>
+      </w:r>
+      <w:proofErr w:type="spellEnd"/>
+      <w:r>
+        <w:rPr>
+          <w:rFonts w:cstheme="minorHAnsi"/>
+          <w:sz w:val="28"/>
+          <w:szCs w:val="28"/>
+        </w:rPr>
+        <w:t>, define common settings for each service that should be reused. You can also use YAML anchors (&amp; for anchor and * for referencing) to define configurations once and reuse them.</w:t>
+      </w:r>
+    </w:p>
+    <w:p>
+      <w:pPr>
+        <w:tabs>
+          <w:tab w:val="num" w:pos="1440"/>
+        </w:tabs>
+        <w:spacing w:line="360" w:lineRule="auto"/>
+        <w:rPr>
+          <w:rFonts w:cstheme="minorHAnsi"/>
+          <w:sz w:val="28"/>
+          <w:szCs w:val="28"/>
+        </w:rPr>
+      </w:pPr>
+      <w:r>
+        <w:rPr>
+          <w:rFonts w:cstheme="minorHAnsi"/>
+          <w:sz w:val="28"/>
+          <w:szCs w:val="28"/>
+        </w:rPr>
+        <w:lastRenderedPageBreak/>
+        <w:t>This file defines:</w:t>
+      </w:r>
+    </w:p>
+    <w:p>
+      <w:pPr>
+        <w:numPr>
+          <w:ilvl w:val="0"/>
+          <w:numId w:val="25"/>
+        </w:numPr>
+        <w:tabs>
+          <w:tab w:val="num" w:pos="1440"/>
+        </w:tabs>
+        <w:spacing w:line="360" w:lineRule="auto"/>
+        <w:rPr>
+          <w:rFonts w:cstheme="minorHAnsi"/>
+          <w:sz w:val="28"/>
+          <w:szCs w:val="28"/>
+        </w:rPr>
+      </w:pPr>
+      <w:r>
+        <w:rPr>
+          <w:rFonts w:cstheme="minorHAnsi"/>
+          <w:sz w:val="28"/>
+          <w:szCs w:val="28"/>
+        </w:rPr>
+        <w:t>A common network (</w:t>
+      </w:r>
+      <w:proofErr w:type="spellStart"/>
+      <w:r>
+        <w:rPr>
+          <w:rFonts w:cstheme="minorHAnsi"/>
+          <w:sz w:val="28"/>
+          <w:szCs w:val="28"/>
+        </w:rPr>
+        <w:t>app_network</w:t>
+      </w:r>
+      <w:proofErr w:type="spellEnd"/>
+      <w:r>
+        <w:rPr>
+          <w:rFonts w:cstheme="minorHAnsi"/>
+          <w:sz w:val="28"/>
+          <w:szCs w:val="28"/>
+        </w:rPr>
+        <w:t>) shared by all services.</w:t>
+      </w:r>
+    </w:p>
+    <w:p>
+      <w:pPr>
+        <w:numPr>
+          <w:ilvl w:val="0"/>
+          <w:numId w:val="25"/>
+        </w:numPr>
+        <w:tabs>
+          <w:tab w:val="num" w:pos="1440"/>
+        </w:tabs>
+        <w:spacing w:line="360" w:lineRule="auto"/>
+        <w:rPr>
+          <w:rFonts w:cstheme="minorHAnsi"/>
+          <w:sz w:val="28"/>
+          <w:szCs w:val="28"/>
+        </w:rPr>
+      </w:pPr>
+      <w:r>
+        <w:rPr>
+          <w:rFonts w:cstheme="minorHAnsi"/>
+          <w:sz w:val="28"/>
+          <w:szCs w:val="28"/>
+        </w:rPr>
+        <w:t>Common resource limits and memory reservations.</w:t>
+      </w:r>
+    </w:p>
+    <w:p>
+      <w:pPr>
+        <w:numPr>
+          <w:ilvl w:val="0"/>
+          <w:numId w:val="25"/>
+        </w:numPr>
+        <w:tabs>
+          <w:tab w:val="num" w:pos="1440"/>
+        </w:tabs>
+        <w:spacing w:line="360" w:lineRule="auto"/>
+        <w:rPr>
+          <w:rFonts w:cstheme="minorHAnsi"/>
+          <w:sz w:val="28"/>
+          <w:szCs w:val="28"/>
+        </w:rPr>
+      </w:pPr>
+      <w:r>
+        <w:rPr>
+          <w:rFonts w:cstheme="minorHAnsi"/>
+          <w:sz w:val="28"/>
+          <w:szCs w:val="28"/>
+        </w:rPr>
+        <w:t xml:space="preserve">A </w:t>
+      </w:r>
+      <w:proofErr w:type="spellStart"/>
+      <w:r>
+        <w:rPr>
+          <w:rFonts w:cstheme="minorHAnsi"/>
+          <w:sz w:val="28"/>
+          <w:szCs w:val="28"/>
+        </w:rPr>
+        <w:t>depends_on</w:t>
+      </w:r>
+      <w:proofErr w:type="spellEnd"/>
+      <w:r>
+        <w:rPr>
+          <w:rFonts w:cstheme="minorHAnsi"/>
+          <w:sz w:val="28"/>
+          <w:szCs w:val="28"/>
+        </w:rPr>
+        <w:t xml:space="preserve"> condition that references </w:t>
+      </w:r>
+      <w:proofErr w:type="spellStart"/>
+      <w:r>
+        <w:rPr>
+          <w:rFonts w:cstheme="minorHAnsi"/>
+          <w:sz w:val="28"/>
+          <w:szCs w:val="28"/>
+        </w:rPr>
+        <w:t>configserver</w:t>
+      </w:r>
+      <w:proofErr w:type="spellEnd"/>
+      <w:r>
+        <w:rPr>
+          <w:rFonts w:cstheme="minorHAnsi"/>
+          <w:sz w:val="28"/>
+          <w:szCs w:val="28"/>
+        </w:rPr>
+        <w:t xml:space="preserve"> to ensure it is healthy before other services start.</w:t>
+      </w:r>
+    </w:p>
+    <w:p>
+      <w:pPr>
+        <w:spacing w:line="360" w:lineRule="auto"/>
+        <w:rPr>
+          <w:rFonts w:cstheme="minorHAnsi"/>
+          <w:sz w:val="28"/>
+          <w:szCs w:val="28"/>
+        </w:rPr>
+      </w:pPr>
+      <w:r>
+        <w:rPr>
+          <w:rFonts w:eastAsia="Times New Roman" w:cstheme="minorHAnsi"/>
+          <w:b/>
+          <w:bCs/>
+          <w:kern w:val="0"/>
+          <w:sz w:val="28"/>
+          <w:szCs w:val="28"/>
+          <w:lang w:eastAsia="en-IN"/>
+          <w14:ligatures w14:val="none"/>
+        </w:rPr>
+        <w:t xml:space="preserve">Step 2: Reference </w:t>
+      </w:r>
+      <w:proofErr w:type="spellStart"/>
+      <w:r>
+        <w:rPr>
+          <w:rFonts w:eastAsia="Times New Roman" w:cstheme="minorHAnsi"/>
+          <w:b/>
+          <w:bCs/>
+          <w:kern w:val="0"/>
+          <w:sz w:val="28"/>
+          <w:szCs w:val="28"/>
+          <w:lang w:eastAsia="en-IN"/>
+          <w14:ligatures w14:val="none"/>
+        </w:rPr>
+        <w:t>common_config.yml</w:t>
+      </w:r>
+      <w:proofErr w:type="spellEnd"/>
+      <w:r>
+        <w:rPr>
+          <w:rFonts w:eastAsia="Times New Roman" w:cstheme="minorHAnsi"/>
+          <w:b/>
+          <w:bCs/>
+          <w:kern w:val="0"/>
+          <w:sz w:val="28"/>
+          <w:szCs w:val="28"/>
+          <w:lang w:eastAsia="en-IN"/>
+          <w14:ligatures w14:val="none"/>
+        </w:rPr>
+        <w:t xml:space="preserve"> in docker-</w:t>
+      </w:r>
+      <w:proofErr w:type="spellStart"/>
+      <w:r>
+        <w:rPr>
+          <w:rFonts w:eastAsia="Times New Roman" w:cstheme="minorHAnsi"/>
+          <w:b/>
+          <w:bCs/>
+          <w:kern w:val="0"/>
+          <w:sz w:val="28"/>
+          <w:szCs w:val="28"/>
+          <w:lang w:eastAsia="en-IN"/>
+          <w14:ligatures w14:val="none"/>
+        </w:rPr>
+        <w:t>compose.yml</w:t>
+      </w:r>
+      <w:proofErr w:type="spellEnd"/>
+    </w:p>
+    <w:p>
+      <w:pPr>
+        <w:pStyle w:val="ListParagraph"/>
+        <w:numPr>
+          <w:ilvl w:val="0"/>
+          <w:numId w:val="25"/>
+        </w:numPr>
+        <w:spacing w:before="100" w:beforeAutospacing="1" w:after="100" w:afterAutospacing="1" w:line="360" w:lineRule="auto"/>
+        <w:rPr>
+          <w:rFonts w:eastAsia="Times New Roman" w:cstheme="minorHAnsi"/>
+          <w:kern w:val="0"/>
+          <w:sz w:val="28"/>
+          <w:szCs w:val="28"/>
+          <w:lang w:eastAsia="en-IN"/>
+          <w14:ligatures w14:val="none"/>
+        </w:rPr>
+      </w:pPr>
+      <w:r>
+        <w:rPr>
+          <w:rFonts w:eastAsia="Times New Roman" w:cstheme="minorHAnsi"/>
+          <w:kern w:val="0"/>
+          <w:sz w:val="28"/>
+          <w:szCs w:val="28"/>
+          <w:lang w:eastAsia="en-IN"/>
+          <w14:ligatures w14:val="none"/>
+        </w:rPr>
+        <w:t>In docker-</w:t>
+      </w:r>
+      <w:proofErr w:type="spellStart"/>
+      <w:r>
+        <w:rPr>
+          <w:rFonts w:eastAsia="Times New Roman" w:cstheme="minorHAnsi"/>
+          <w:kern w:val="0"/>
+          <w:sz w:val="28"/>
+          <w:szCs w:val="28"/>
+          <w:lang w:eastAsia="en-IN"/>
+          <w14:ligatures w14:val="none"/>
+        </w:rPr>
+        <w:t>compose.yml</w:t>
+      </w:r>
+      <w:proofErr w:type="spellEnd"/>
+      <w:r>
+        <w:rPr>
+          <w:rFonts w:eastAsia="Times New Roman" w:cstheme="minorHAnsi"/>
+          <w:kern w:val="0"/>
+          <w:sz w:val="28"/>
+          <w:szCs w:val="28"/>
+          <w:lang w:eastAsia="en-IN"/>
+          <w14:ligatures w14:val="none"/>
+        </w:rPr>
+        <w:t xml:space="preserve">, you can import and reuse configurations from </w:t>
+      </w:r>
+      <w:proofErr w:type="spellStart"/>
+      <w:r>
+        <w:rPr>
+          <w:rFonts w:eastAsia="Times New Roman" w:cstheme="minorHAnsi"/>
+          <w:kern w:val="0"/>
+          <w:sz w:val="28"/>
+          <w:szCs w:val="28"/>
+          <w:lang w:eastAsia="en-IN"/>
+          <w14:ligatures w14:val="none"/>
+        </w:rPr>
+        <w:t>common_config.yml</w:t>
+      </w:r>
+      <w:proofErr w:type="spellEnd"/>
+      <w:r>
+        <w:rPr>
+          <w:rFonts w:eastAsia="Times New Roman" w:cstheme="minorHAnsi"/>
+          <w:kern w:val="0"/>
+          <w:sz w:val="28"/>
+          <w:szCs w:val="28"/>
+          <w:lang w:eastAsia="en-IN"/>
+          <w14:ligatures w14:val="none"/>
+        </w:rPr>
+        <w:t xml:space="preserve"> to avoid repetition.</w:t>
+      </w:r>
+    </w:p>
+    <w:p>
+      <w:pPr>
+        <w:tabs>
+          <w:tab w:val="num" w:pos="1440"/>
+        </w:tabs>
+        <w:spacing w:line="360" w:lineRule="auto"/>
+        <w:rPr>
+          <w:rFonts w:cstheme="minorHAnsi"/>
+          <w:sz w:val="28"/>
+          <w:szCs w:val="28"/>
+        </w:rPr>
+      </w:pPr>
+      <w:r>
+        <w:rPr>
+          <w:rFonts w:cstheme="minorHAnsi"/>
+          <w:sz w:val="28"/>
+          <w:szCs w:val="28"/>
+        </w:rPr>
+        <w:drawing>
+          <wp:inline distT="0" distB="0" distL="0" distR="0" wp14:anchorId="6CD67FBA" wp14:editId="7F76C34A">
+            <wp:extent cx="5731510" cy="4827270"/>
+            <wp:effectExtent l="0" t="0" r="2540" b="0"/>
+            <wp:docPr id="383243931" name="Picture 1"/>
+            <wp:cNvGraphicFramePr>
+              <a:graphicFrameLocks xmlns:a="http://schemas.openxmlformats.org/drawingml/2006/main" noChangeAspect="1"/>
+            </wp:cNvGraphicFramePr>
+            <a:graphic xmlns:a="http://schemas.openxmlformats.org/drawingml/2006/main">
+              <a:graphicData uri="http://schemas.openxmlformats.org/drawingml/2006/picture">
+                <pic:pic xmlns:pic="http://schemas.openxmlformats.org/drawingml/2006/picture">
+                  <pic:nvPicPr>
+                    <pic:cNvPr id="383243931" name=""/>
+                    <pic:cNvPicPr/>
+                  </pic:nvPicPr>
+                  <pic:blipFill>
+                    <a:blip r:embed="rId20"/>
+                    <a:stretch>
+                      <a:fillRect/>
+                    </a:stretch>
+                  </pic:blipFill>
+                  <pic:spPr>
+                    <a:xfrm>
+                      <a:off x="0" y="0"/>
+                      <a:ext cx="5731510" cy="4827270"/>
+                    </a:xfrm>
+                    <a:prstGeom prst="rect">
+                      <a:avLst/>
+                    </a:prstGeom>
+                  </pic:spPr>
+                </pic:pic>
+              </a:graphicData>
+            </a:graphic>
+          </wp:inline>
+        </w:drawing>
+      </w:r>
+    </w:p>
+    <w:p>
+      <w:pPr>
+        <w:tabs>
+          <w:tab w:val="num" w:pos="1440"/>
+        </w:tabs>
+        <w:spacing w:line="360" w:lineRule="auto"/>
+        <w:jc w:val="center"/>
+        <w:rPr>
+          <w:rFonts w:cstheme="minorHAnsi"/>
+          <w:sz w:val="28"/>
+          <w:szCs w:val="28"/>
+        </w:rPr>
+      </w:pPr>
+      <w:r>
+        <w:rPr>
+          <w:rFonts w:cstheme="minorHAnsi"/>
+          <w:sz w:val="28"/>
+          <w:szCs w:val="28"/>
+        </w:rPr>
+        <w:t xml:space="preserve">Sample </w:t>
+      </w:r>
+      <w:proofErr w:type="spellStart"/>
+      <w:r>
+        <w:rPr>
+          <w:rFonts w:cstheme="minorHAnsi"/>
+          <w:sz w:val="28"/>
+          <w:szCs w:val="28"/>
+        </w:rPr>
+        <w:t>Common_Config.yml</w:t>
+      </w:r>
+      <w:proofErr w:type="spellEnd"/>
+    </w:p>
+    <w:p>
+      <w:pPr>
+        <w:tabs>
+          <w:tab w:val="num" w:pos="1440"/>
+        </w:tabs>
+        <w:spacing w:line="360" w:lineRule="auto"/>
+        <w:rPr>
+          <w:rFonts w:cstheme="minorHAnsi"/>
+          <w:sz w:val="28"/>
+          <w:szCs w:val="28"/>
+        </w:rPr>
+      </w:pPr>
+    </w:p>
+    <w:p>
+      <w:pPr>
+        <w:tabs>
+          <w:tab w:val="num" w:pos="1440"/>
+        </w:tabs>
+        <w:spacing w:line="360" w:lineRule="auto"/>
+        <w:rPr>
+          <w:rFonts w:cstheme="minorHAnsi"/>
+          <w:b/>
+          <w:bCs/>
+          <w:sz w:val="28"/>
+          <w:szCs w:val="28"/>
+        </w:rPr>
+      </w:pPr>
+      <w:r>
+        <w:rPr>
+          <w:rFonts w:cstheme="minorHAnsi"/>
+          <w:b/>
+          <w:bCs/>
+          <w:sz w:val="28"/>
+          <w:szCs w:val="28"/>
+        </w:rPr>
+        <w:t>E</w:t>
+      </w:r>
+      <w:r>
+        <w:rPr>
+          <w:rFonts w:cstheme="minorHAnsi"/>
+          <w:b/>
+          <w:bCs/>
+          <w:sz w:val="28"/>
+          <w:szCs w:val="28"/>
+        </w:rPr>
+        <w:t>xplanation</w:t>
+      </w:r>
+    </w:p>
+    <w:p>
+      <w:pPr>
+        <w:numPr>
+          <w:ilvl w:val="0"/>
+          <w:numId w:val="26"/>
+        </w:numPr>
+        <w:tabs>
+          <w:tab w:val="num" w:pos="1440"/>
+        </w:tabs>
+        <w:spacing w:line="360" w:lineRule="auto"/>
+        <w:rPr>
+          <w:rFonts w:cstheme="minorHAnsi"/>
+          <w:sz w:val="28"/>
+          <w:szCs w:val="28"/>
+        </w:rPr>
+      </w:pPr>
+      <w:r>
+        <w:rPr>
+          <w:rFonts w:cstheme="minorHAnsi"/>
+          <w:b/>
+          <w:bCs/>
+          <w:sz w:val="28"/>
+          <w:szCs w:val="28"/>
+        </w:rPr>
+        <w:t>*</w:t>
+      </w:r>
+      <w:proofErr w:type="spellStart"/>
+      <w:proofErr w:type="gramStart"/>
+      <w:r>
+        <w:rPr>
+          <w:rFonts w:cstheme="minorHAnsi"/>
+          <w:b/>
+          <w:bCs/>
+          <w:sz w:val="28"/>
+          <w:szCs w:val="28"/>
+        </w:rPr>
+        <w:t>common</w:t>
+      </w:r>
+      <w:proofErr w:type="gramEnd"/>
+      <w:r>
+        <w:rPr>
+          <w:rFonts w:cstheme="minorHAnsi"/>
+          <w:b/>
+          <w:bCs/>
+          <w:sz w:val="28"/>
+          <w:szCs w:val="28"/>
+        </w:rPr>
+        <w:t>_settings</w:t>
+      </w:r>
+      <w:proofErr w:type="spellEnd"/>
+      <w:r>
+        <w:rPr>
+          <w:rFonts w:cstheme="minorHAnsi"/>
+          <w:sz w:val="28"/>
+          <w:szCs w:val="28"/>
+        </w:rPr>
+        <w:t xml:space="preserve">: Imports all properties defined </w:t>
+      </w:r>
+      <w:r>
+        <w:rPr>
+          <w:rFonts w:cstheme="minorHAnsi"/>
+          <w:sz w:val="28"/>
+          <w:szCs w:val="28"/>
+        </w:rPr>
+        <w:t>as a</w:t>
+      </w:r>
+      <w:r>
+        <w:rPr>
+          <w:rFonts w:cstheme="minorHAnsi"/>
+          <w:sz w:val="28"/>
+          <w:szCs w:val="28"/>
+        </w:rPr>
+        <w:t xml:space="preserve"> common</w:t>
+      </w:r>
+      <w:r>
+        <w:rPr>
+          <w:rFonts w:cstheme="minorHAnsi"/>
+          <w:sz w:val="28"/>
+          <w:szCs w:val="28"/>
+        </w:rPr>
+        <w:t xml:space="preserve"> </w:t>
+      </w:r>
+      <w:r>
+        <w:rPr>
+          <w:rFonts w:cstheme="minorHAnsi"/>
+          <w:sz w:val="28"/>
+          <w:szCs w:val="28"/>
+        </w:rPr>
+        <w:t xml:space="preserve">settings in </w:t>
+      </w:r>
+      <w:proofErr w:type="spellStart"/>
+      <w:r>
+        <w:rPr>
+          <w:rFonts w:cstheme="minorHAnsi"/>
+          <w:sz w:val="28"/>
+          <w:szCs w:val="28"/>
+        </w:rPr>
+        <w:t>common_config.yml</w:t>
+      </w:r>
+      <w:proofErr w:type="spellEnd"/>
+      <w:r>
+        <w:rPr>
+          <w:rFonts w:cstheme="minorHAnsi"/>
+          <w:sz w:val="28"/>
+          <w:szCs w:val="28"/>
+        </w:rPr>
+        <w:t xml:space="preserve">. This means the accounts service will inherit networks, </w:t>
+      </w:r>
+      <w:proofErr w:type="spellStart"/>
+      <w:r>
+        <w:rPr>
+          <w:rFonts w:cstheme="minorHAnsi"/>
+          <w:sz w:val="28"/>
+          <w:szCs w:val="28"/>
+        </w:rPr>
+        <w:t>depends_on</w:t>
+      </w:r>
+      <w:proofErr w:type="spellEnd"/>
+      <w:r>
+        <w:rPr>
+          <w:rFonts w:cstheme="minorHAnsi"/>
+          <w:sz w:val="28"/>
+          <w:szCs w:val="28"/>
+        </w:rPr>
+        <w:t xml:space="preserve">, and memory configurations defined in </w:t>
+      </w:r>
+      <w:proofErr w:type="spellStart"/>
+      <w:r>
+        <w:rPr>
+          <w:rFonts w:cstheme="minorHAnsi"/>
+          <w:sz w:val="28"/>
+          <w:szCs w:val="28"/>
+        </w:rPr>
+        <w:t>common_</w:t>
+      </w:r>
+      <w:r>
+        <w:rPr>
+          <w:rFonts w:cstheme="minorHAnsi"/>
+          <w:sz w:val="28"/>
+          <w:szCs w:val="28"/>
+        </w:rPr>
+        <w:t>config.yml</w:t>
+      </w:r>
+      <w:proofErr w:type="spellEnd"/>
+      <w:r>
+        <w:rPr>
+          <w:rFonts w:cstheme="minorHAnsi"/>
+          <w:sz w:val="28"/>
+          <w:szCs w:val="28"/>
+        </w:rPr>
+        <w:t xml:space="preserve"> file</w:t>
+      </w:r>
+      <w:r>
+        <w:rPr>
+          <w:rFonts w:cstheme="minorHAnsi"/>
+          <w:sz w:val="28"/>
+          <w:szCs w:val="28"/>
+        </w:rPr>
+        <w:t>.</w:t>
+      </w:r>
+    </w:p>
+    <w:p>
+      <w:pPr>
+        <w:numPr>
+          <w:ilvl w:val="0"/>
+          <w:numId w:val="26"/>
+        </w:numPr>
+        <w:tabs>
+          <w:tab w:val="num" w:pos="1440"/>
+        </w:tabs>
+        <w:spacing w:line="360" w:lineRule="auto"/>
+        <w:rPr>
+          <w:rFonts w:cstheme="minorHAnsi"/>
+          <w:sz w:val="28"/>
+          <w:szCs w:val="28"/>
+        </w:rPr>
+      </w:pPr>
+      <w:r>
+        <w:rPr>
+          <w:rFonts w:cstheme="minorHAnsi"/>
+          <w:b/>
+          <w:bCs/>
+          <w:sz w:val="28"/>
+          <w:szCs w:val="28"/>
+        </w:rPr>
+        <w:t>Service-specific properties</w:t>
+      </w:r>
+      <w:r>
+        <w:rPr>
+          <w:rFonts w:cstheme="minorHAnsi"/>
+          <w:sz w:val="28"/>
+          <w:szCs w:val="28"/>
+        </w:rPr>
+        <w:t xml:space="preserve">: Any specific properties, like image, environment, and </w:t>
+      </w:r>
+      <w:proofErr w:type="spellStart"/>
+      <w:r>
+        <w:rPr>
+          <w:rFonts w:cstheme="minorHAnsi"/>
+          <w:sz w:val="28"/>
+          <w:szCs w:val="28"/>
+        </w:rPr>
+        <w:t>healthcheck</w:t>
+      </w:r>
+      <w:proofErr w:type="spellEnd"/>
+      <w:r>
+        <w:rPr>
+          <w:rFonts w:cstheme="minorHAnsi"/>
+          <w:sz w:val="28"/>
+          <w:szCs w:val="28"/>
+        </w:rPr>
+        <w:t>, are defined under each service as needed.</w:t>
+      </w:r>
+    </w:p>
+    <w:p>
+      <w:pPr>
+        <w:tabs>
+          <w:tab w:val="num" w:pos="1440"/>
+        </w:tabs>
+        <w:spacing w:line="360" w:lineRule="auto"/>
+        <w:rPr>
+          <w:rFonts w:cstheme="minorHAnsi"/>
+          <w:sz w:val="28"/>
+          <w:szCs w:val="28"/>
+        </w:rPr>
+      </w:pPr>
+    </w:p>
+    <w:p>
+      <w:pPr>
+        <w:tabs>
+          <w:tab w:val="num" w:pos="1440"/>
+        </w:tabs>
+        <w:spacing w:line="360" w:lineRule="auto"/>
+        <w:rPr>
+          <w:rFonts w:cstheme="minorHAnsi"/>
+          <w:sz w:val="28"/>
+          <w:szCs w:val="28"/>
+        </w:rPr>
+      </w:pPr>
+    </w:p>
+    <w:p>
+      <w:pPr>
+        <w:tabs>
+          <w:tab w:val="num" w:pos="1440"/>
+        </w:tabs>
+        <w:spacing w:line="360" w:lineRule="auto"/>
+        <w:rPr>
+          <w:rFonts w:cstheme="minorHAnsi"/>
+          <w:sz w:val="28"/>
+          <w:szCs w:val="28"/>
+        </w:rPr>
+      </w:pPr>
+    </w:p>
     <w:sectPr>
       <w:pgSz w:w="11906" w:h="16838"/>
       <w:pgMar w:top="1440" w:right="1440" w:bottom="1440" w:left="1440" w:header="708" w:footer="708" w:gutter="0"/>
@@ -2726,6 +5213,155 @@
 <file path=word/numbering.xml><?xml version="1.0" encoding="utf-8"?>
 <w:numbering xmlns:wpc="http://schemas.microsoft.com/office/word/2010/wordprocessingCanvas" xmlns:cx="http://schemas.microsoft.com/office/drawing/2014/chartex" xmlns:cx1="http://schemas.microsoft.com/office/drawing/2015/9/8/chartex" xmlns:cx2="http://schemas.microsoft.com/office/drawing/2015/10/21/chartex" xmlns:cx3="http://schemas.microsoft.com/office/drawing/2016/5/9/chartex" xmlns:cx4="http://schemas.microsoft.com/office/drawing/2016/5/10/chartex" xmlns:cx5="http://schemas.microsoft.com/office/drawing/2016/5/11/chartex" xmlns:cx6="http://schemas.microsoft.com/office/drawing/2016/5/12/chartex" xmlns:cx7="http://schemas.microsoft.com/office/drawing/2016/5/13/chartex" xmlns:cx8="http://schemas.microsoft.com/office/drawing/2016/5/14/chartex" xmlns:mc="http://schemas.openxmlformats.org/markup-compatibility/2006" xmlns:aink="http://schemas.microsoft.com/office/drawing/2016/ink" xmlns:am3d="http://schemas.microsoft.com/office/drawing/2017/model3d" xmlns:o="urn:schemas-microsoft-com:office:office" xmlns:oel="http://schemas.microsoft.com/office/2019/extlst" xmlns:r="http://schemas.openxmlformats.org/officeDocument/2006/relationships" xmlns:m="http://schemas.openxmlformats.org/officeDocument/2006/math" xmlns:v="urn:schemas-microsoft-com:vml" xmlns:wp14="http://schemas.microsoft.com/office/word/2010/wordprocessingDrawing" xmlns:wp="http://schemas.openxmlformats.org/drawingml/2006/wordprocessingDrawing" xmlns:w10="urn:schemas-microsoft-com:office:word" xmlns:w="http://schemas.openxmlformats.org/wordprocessingml/2006/main" xmlns:w14="http://schemas.microsoft.com/office/word/2010/wordml" xmlns:w15="http://schemas.microsoft.com/office/word/2012/wordml" xmlns:w16cex="http://schemas.microsoft.com/office/word/2018/wordml/cex" xmlns:w16cid="http://schemas.microsoft.com/office/word/2016/wordml/cid" xmlns:w16="http://schemas.microsoft.com/office/word/2018/wordml" xmlns:w16du="http://schemas.microsoft.com/office/word/2023/wordml/word16du" xmlns:w16sdtdh="http://schemas.microsoft.com/office/word/2020/wordml/sdtdatahash" xmlns:w16se="http://schemas.microsoft.com/office/word/2015/wordml/symex" xmlns:wpg="http://schemas.microsoft.com/office/word/2010/wordprocessingGroup" xmlns:wpi="http://schemas.microsoft.com/office/word/2010/wordprocessingInk" xmlns:wne="http://schemas.microsoft.com/office/word/2006/wordml" xmlns:wps="http://schemas.microsoft.com/office/word/2010/wordprocessingShape" mc:Ignorable="w14 w15 w16se w16cid w16 w16cex w16sdtdh w16du wp14">
   <w:abstractNum w:abstractNumId="0" w15:restartNumberingAfterBreak="0">
+    <w:nsid w:val="0A840F9E"/>
+    <w:multiLevelType w:val="multilevel"/>
+    <w:tmpl w:val="BB0EB51E"/>
+    <w:lvl w:ilvl="0">
+      <w:start w:val="1"/>
+      <w:numFmt w:val="bullet"/>
+      <w:lvlText w:val=""/>
+      <w:lvlJc w:val="left"/>
+      <w:pPr>
+        <w:tabs>
+          <w:tab w:val="num" w:pos="720"/>
+        </w:tabs>
+        <w:ind w:left="720" w:hanging="360"/>
+      </w:pPr>
+      <w:rPr>
+        <w:rFonts w:ascii="Symbol" w:hAnsi="Symbol" w:hint="default"/>
+        <w:sz w:val="20"/>
+      </w:rPr>
+    </w:lvl>
+    <w:lvl w:ilvl="1" w:tentative="1">
+      <w:start w:val="1"/>
+      <w:numFmt w:val="bullet"/>
+      <w:lvlText w:val="o"/>
+      <w:lvlJc w:val="left"/>
+      <w:pPr>
+        <w:tabs>
+          <w:tab w:val="num" w:pos="1440"/>
+        </w:tabs>
+        <w:ind w:left="1440" w:hanging="360"/>
+      </w:pPr>
+      <w:rPr>
+        <w:rFonts w:ascii="Courier New" w:hAnsi="Courier New" w:hint="default"/>
+        <w:sz w:val="20"/>
+      </w:rPr>
+    </w:lvl>
+    <w:lvl w:ilvl="2" w:tentative="1">
+      <w:start w:val="1"/>
+      <w:numFmt w:val="bullet"/>
+      <w:lvlText w:val=""/>
+      <w:lvlJc w:val="left"/>
+      <w:pPr>
+        <w:tabs>
+          <w:tab w:val="num" w:pos="2160"/>
+        </w:tabs>
+        <w:ind w:left="2160" w:hanging="360"/>
+      </w:pPr>
+      <w:rPr>
+        <w:rFonts w:ascii="Wingdings" w:hAnsi="Wingdings" w:hint="default"/>
+        <w:sz w:val="20"/>
+      </w:rPr>
+    </w:lvl>
+    <w:lvl w:ilvl="3" w:tentative="1">
+      <w:start w:val="1"/>
+      <w:numFmt w:val="bullet"/>
+      <w:lvlText w:val=""/>
+      <w:lvlJc w:val="left"/>
+      <w:pPr>
+        <w:tabs>
+          <w:tab w:val="num" w:pos="2880"/>
+        </w:tabs>
+        <w:ind w:left="2880" w:hanging="360"/>
+      </w:pPr>
+      <w:rPr>
+        <w:rFonts w:ascii="Wingdings" w:hAnsi="Wingdings" w:hint="default"/>
+        <w:sz w:val="20"/>
+      </w:rPr>
+    </w:lvl>
+    <w:lvl w:ilvl="4" w:tentative="1">
+      <w:start w:val="1"/>
+      <w:numFmt w:val="bullet"/>
+      <w:lvlText w:val=""/>
+      <w:lvlJc w:val="left"/>
+      <w:pPr>
+        <w:tabs>
+          <w:tab w:val="num" w:pos="3600"/>
+        </w:tabs>
+        <w:ind w:left="3600" w:hanging="360"/>
+      </w:pPr>
+      <w:rPr>
+        <w:rFonts w:ascii="Wingdings" w:hAnsi="Wingdings" w:hint="default"/>
+        <w:sz w:val="20"/>
+      </w:rPr>
+    </w:lvl>
+    <w:lvl w:ilvl="5" w:tentative="1">
+      <w:start w:val="1"/>
+      <w:numFmt w:val="bullet"/>
+      <w:lvlText w:val=""/>
+      <w:lvlJc w:val="left"/>
+      <w:pPr>
+        <w:tabs>
+          <w:tab w:val="num" w:pos="4320"/>
+        </w:tabs>
+        <w:ind w:left="4320" w:hanging="360"/>
+      </w:pPr>
+      <w:rPr>
+        <w:rFonts w:ascii="Wingdings" w:hAnsi="Wingdings" w:hint="default"/>
+        <w:sz w:val="20"/>
+      </w:rPr>
+    </w:lvl>
+    <w:lvl w:ilvl="6" w:tentative="1">
+      <w:start w:val="1"/>
+      <w:numFmt w:val="bullet"/>
+      <w:lvlText w:val=""/>
+      <w:lvlJc w:val="left"/>
+      <w:pPr>
+        <w:tabs>
+          <w:tab w:val="num" w:pos="5040"/>
+        </w:tabs>
+        <w:ind w:left="5040" w:hanging="360"/>
+      </w:pPr>
+      <w:rPr>
+        <w:rFonts w:ascii="Wingdings" w:hAnsi="Wingdings" w:hint="default"/>
+        <w:sz w:val="20"/>
+      </w:rPr>
+    </w:lvl>
+    <w:lvl w:ilvl="7" w:tentative="1">
+      <w:start w:val="1"/>
+      <w:numFmt w:val="bullet"/>
+      <w:lvlText w:val=""/>
+      <w:lvlJc w:val="left"/>
+      <w:pPr>
+        <w:tabs>
+          <w:tab w:val="num" w:pos="5760"/>
+        </w:tabs>
+        <w:ind w:left="5760" w:hanging="360"/>
+      </w:pPr>
+      <w:rPr>
+        <w:rFonts w:ascii="Wingdings" w:hAnsi="Wingdings" w:hint="default"/>
+        <w:sz w:val="20"/>
+      </w:rPr>
+    </w:lvl>
+    <w:lvl w:ilvl="8" w:tentative="1">
+      <w:start w:val="1"/>
+      <w:numFmt w:val="bullet"/>
+      <w:lvlText w:val=""/>
+      <w:lvlJc w:val="left"/>
+      <w:pPr>
+        <w:tabs>
+          <w:tab w:val="num" w:pos="6480"/>
+        </w:tabs>
+        <w:ind w:left="6480" w:hanging="360"/>
+      </w:pPr>
+      <w:rPr>
+        <w:rFonts w:ascii="Wingdings" w:hAnsi="Wingdings" w:hint="default"/>
+        <w:sz w:val="20"/>
+      </w:rPr>
+    </w:lvl>
+  </w:abstractNum>
+  <w:abstractNum w:abstractNumId="1" w15:restartNumberingAfterBreak="0">
     <w:nsid w:val="0CDC0E64"/>
     <w:multiLevelType w:val="multilevel"/>
     <w:tmpl w:val="F078EF34"/>
@@ -2842,7 +5478,305 @@
       </w:pPr>
     </w:lvl>
   </w:abstractNum>
-  <w:abstractNum w:abstractNumId="1" w15:restartNumberingAfterBreak="0">
+  <w:abstractNum w:abstractNumId="2" w15:restartNumberingAfterBreak="0">
+    <w:nsid w:val="0E0C0D09"/>
+    <w:multiLevelType w:val="multilevel"/>
+    <w:tmpl w:val="A0C06326"/>
+    <w:lvl w:ilvl="0">
+      <w:start w:val="1"/>
+      <w:numFmt w:val="bullet"/>
+      <w:lvlText w:val=""/>
+      <w:lvlJc w:val="left"/>
+      <w:pPr>
+        <w:tabs>
+          <w:tab w:val="num" w:pos="720"/>
+        </w:tabs>
+        <w:ind w:left="720" w:hanging="360"/>
+      </w:pPr>
+      <w:rPr>
+        <w:rFonts w:ascii="Symbol" w:hAnsi="Symbol" w:hint="default"/>
+        <w:sz w:val="20"/>
+      </w:rPr>
+    </w:lvl>
+    <w:lvl w:ilvl="1" w:tentative="1">
+      <w:start w:val="1"/>
+      <w:numFmt w:val="bullet"/>
+      <w:lvlText w:val="o"/>
+      <w:lvlJc w:val="left"/>
+      <w:pPr>
+        <w:tabs>
+          <w:tab w:val="num" w:pos="1440"/>
+        </w:tabs>
+        <w:ind w:left="1440" w:hanging="360"/>
+      </w:pPr>
+      <w:rPr>
+        <w:rFonts w:ascii="Courier New" w:hAnsi="Courier New" w:hint="default"/>
+        <w:sz w:val="20"/>
+      </w:rPr>
+    </w:lvl>
+    <w:lvl w:ilvl="2" w:tentative="1">
+      <w:start w:val="1"/>
+      <w:numFmt w:val="bullet"/>
+      <w:lvlText w:val=""/>
+      <w:lvlJc w:val="left"/>
+      <w:pPr>
+        <w:tabs>
+          <w:tab w:val="num" w:pos="2160"/>
+        </w:tabs>
+        <w:ind w:left="2160" w:hanging="360"/>
+      </w:pPr>
+      <w:rPr>
+        <w:rFonts w:ascii="Wingdings" w:hAnsi="Wingdings" w:hint="default"/>
+        <w:sz w:val="20"/>
+      </w:rPr>
+    </w:lvl>
+    <w:lvl w:ilvl="3" w:tentative="1">
+      <w:start w:val="1"/>
+      <w:numFmt w:val="bullet"/>
+      <w:lvlText w:val=""/>
+      <w:lvlJc w:val="left"/>
+      <w:pPr>
+        <w:tabs>
+          <w:tab w:val="num" w:pos="2880"/>
+        </w:tabs>
+        <w:ind w:left="2880" w:hanging="360"/>
+      </w:pPr>
+      <w:rPr>
+        <w:rFonts w:ascii="Wingdings" w:hAnsi="Wingdings" w:hint="default"/>
+        <w:sz w:val="20"/>
+      </w:rPr>
+    </w:lvl>
+    <w:lvl w:ilvl="4" w:tentative="1">
+      <w:start w:val="1"/>
+      <w:numFmt w:val="bullet"/>
+      <w:lvlText w:val=""/>
+      <w:lvlJc w:val="left"/>
+      <w:pPr>
+        <w:tabs>
+          <w:tab w:val="num" w:pos="3600"/>
+        </w:tabs>
+        <w:ind w:left="3600" w:hanging="360"/>
+      </w:pPr>
+      <w:rPr>
+        <w:rFonts w:ascii="Wingdings" w:hAnsi="Wingdings" w:hint="default"/>
+        <w:sz w:val="20"/>
+      </w:rPr>
+    </w:lvl>
+    <w:lvl w:ilvl="5" w:tentative="1">
+      <w:start w:val="1"/>
+      <w:numFmt w:val="bullet"/>
+      <w:lvlText w:val=""/>
+      <w:lvlJc w:val="left"/>
+      <w:pPr>
+        <w:tabs>
+          <w:tab w:val="num" w:pos="4320"/>
+        </w:tabs>
+        <w:ind w:left="4320" w:hanging="360"/>
+      </w:pPr>
+      <w:rPr>
+        <w:rFonts w:ascii="Wingdings" w:hAnsi="Wingdings" w:hint="default"/>
+        <w:sz w:val="20"/>
+      </w:rPr>
+    </w:lvl>
+    <w:lvl w:ilvl="6" w:tentative="1">
+      <w:start w:val="1"/>
+      <w:numFmt w:val="bullet"/>
+      <w:lvlText w:val=""/>
+      <w:lvlJc w:val="left"/>
+      <w:pPr>
+        <w:tabs>
+          <w:tab w:val="num" w:pos="5040"/>
+        </w:tabs>
+        <w:ind w:left="5040" w:hanging="360"/>
+      </w:pPr>
+      <w:rPr>
+        <w:rFonts w:ascii="Wingdings" w:hAnsi="Wingdings" w:hint="default"/>
+        <w:sz w:val="20"/>
+      </w:rPr>
+    </w:lvl>
+    <w:lvl w:ilvl="7" w:tentative="1">
+      <w:start w:val="1"/>
+      <w:numFmt w:val="bullet"/>
+      <w:lvlText w:val=""/>
+      <w:lvlJc w:val="left"/>
+      <w:pPr>
+        <w:tabs>
+          <w:tab w:val="num" w:pos="5760"/>
+        </w:tabs>
+        <w:ind w:left="5760" w:hanging="360"/>
+      </w:pPr>
+      <w:rPr>
+        <w:rFonts w:ascii="Wingdings" w:hAnsi="Wingdings" w:hint="default"/>
+        <w:sz w:val="20"/>
+      </w:rPr>
+    </w:lvl>
+    <w:lvl w:ilvl="8" w:tentative="1">
+      <w:start w:val="1"/>
+      <w:numFmt w:val="bullet"/>
+      <w:lvlText w:val=""/>
+      <w:lvlJc w:val="left"/>
+      <w:pPr>
+        <w:tabs>
+          <w:tab w:val="num" w:pos="6480"/>
+        </w:tabs>
+        <w:ind w:left="6480" w:hanging="360"/>
+      </w:pPr>
+      <w:rPr>
+        <w:rFonts w:ascii="Wingdings" w:hAnsi="Wingdings" w:hint="default"/>
+        <w:sz w:val="20"/>
+      </w:rPr>
+    </w:lvl>
+  </w:abstractNum>
+  <w:abstractNum w:abstractNumId="3" w15:restartNumberingAfterBreak="0">
+    <w:nsid w:val="11924A0E"/>
+    <w:multiLevelType w:val="multilevel"/>
+    <w:tmpl w:val="8706627E"/>
+    <w:lvl w:ilvl="0">
+      <w:start w:val="1"/>
+      <w:numFmt w:val="bullet"/>
+      <w:lvlText w:val=""/>
+      <w:lvlJc w:val="left"/>
+      <w:pPr>
+        <w:tabs>
+          <w:tab w:val="num" w:pos="720"/>
+        </w:tabs>
+        <w:ind w:left="720" w:hanging="360"/>
+      </w:pPr>
+      <w:rPr>
+        <w:rFonts w:ascii="Symbol" w:hAnsi="Symbol" w:hint="default"/>
+        <w:sz w:val="20"/>
+      </w:rPr>
+    </w:lvl>
+    <w:lvl w:ilvl="1" w:tentative="1">
+      <w:start w:val="1"/>
+      <w:numFmt w:val="bullet"/>
+      <w:lvlText w:val="o"/>
+      <w:lvlJc w:val="left"/>
+      <w:pPr>
+        <w:tabs>
+          <w:tab w:val="num" w:pos="1440"/>
+        </w:tabs>
+        <w:ind w:left="1440" w:hanging="360"/>
+      </w:pPr>
+      <w:rPr>
+        <w:rFonts w:ascii="Courier New" w:hAnsi="Courier New" w:hint="default"/>
+        <w:sz w:val="20"/>
+      </w:rPr>
+    </w:lvl>
+    <w:lvl w:ilvl="2" w:tentative="1">
+      <w:start w:val="1"/>
+      <w:numFmt w:val="bullet"/>
+      <w:lvlText w:val=""/>
+      <w:lvlJc w:val="left"/>
+      <w:pPr>
+        <w:tabs>
+          <w:tab w:val="num" w:pos="2160"/>
+        </w:tabs>
+        <w:ind w:left="2160" w:hanging="360"/>
+      </w:pPr>
+      <w:rPr>
+        <w:rFonts w:ascii="Wingdings" w:hAnsi="Wingdings" w:hint="default"/>
+        <w:sz w:val="20"/>
+      </w:rPr>
+    </w:lvl>
+    <w:lvl w:ilvl="3" w:tentative="1">
+      <w:start w:val="1"/>
+      <w:numFmt w:val="bullet"/>
+      <w:lvlText w:val=""/>
+      <w:lvlJc w:val="left"/>
+      <w:pPr>
+        <w:tabs>
+          <w:tab w:val="num" w:pos="2880"/>
+        </w:tabs>
+        <w:ind w:left="2880" w:hanging="360"/>
+      </w:pPr>
+      <w:rPr>
+        <w:rFonts w:ascii="Wingdings" w:hAnsi="Wingdings" w:hint="default"/>
+        <w:sz w:val="20"/>
+      </w:rPr>
+    </w:lvl>
+    <w:lvl w:ilvl="4" w:tentative="1">
+      <w:start w:val="1"/>
+      <w:numFmt w:val="bullet"/>
+      <w:lvlText w:val=""/>
+      <w:lvlJc w:val="left"/>
+      <w:pPr>
+        <w:tabs>
+          <w:tab w:val="num" w:pos="3600"/>
+        </w:tabs>
+        <w:ind w:left="3600" w:hanging="360"/>
+      </w:pPr>
+      <w:rPr>
+        <w:rFonts w:ascii="Wingdings" w:hAnsi="Wingdings" w:hint="default"/>
+        <w:sz w:val="20"/>
+      </w:rPr>
+    </w:lvl>
+    <w:lvl w:ilvl="5" w:tentative="1">
+      <w:start w:val="1"/>
+      <w:numFmt w:val="bullet"/>
+      <w:lvlText w:val=""/>
+      <w:lvlJc w:val="left"/>
+      <w:pPr>
+        <w:tabs>
+          <w:tab w:val="num" w:pos="4320"/>
+        </w:tabs>
+        <w:ind w:left="4320" w:hanging="360"/>
+      </w:pPr>
+      <w:rPr>
+        <w:rFonts w:ascii="Wingdings" w:hAnsi="Wingdings" w:hint="default"/>
+        <w:sz w:val="20"/>
+      </w:rPr>
+    </w:lvl>
+    <w:lvl w:ilvl="6" w:tentative="1">
+      <w:start w:val="1"/>
+      <w:numFmt w:val="bullet"/>
+      <w:lvlText w:val=""/>
+      <w:lvlJc w:val="left"/>
+      <w:pPr>
+        <w:tabs>
+          <w:tab w:val="num" w:pos="5040"/>
+        </w:tabs>
+        <w:ind w:left="5040" w:hanging="360"/>
+      </w:pPr>
+      <w:rPr>
+        <w:rFonts w:ascii="Wingdings" w:hAnsi="Wingdings" w:hint="default"/>
+        <w:sz w:val="20"/>
+      </w:rPr>
+    </w:lvl>
+    <w:lvl w:ilvl="7" w:tentative="1">
+      <w:start w:val="1"/>
+      <w:numFmt w:val="bullet"/>
+      <w:lvlText w:val=""/>
+      <w:lvlJc w:val="left"/>
+      <w:pPr>
+        <w:tabs>
+          <w:tab w:val="num" w:pos="5760"/>
+        </w:tabs>
+        <w:ind w:left="5760" w:hanging="360"/>
+      </w:pPr>
+      <w:rPr>
+        <w:rFonts w:ascii="Wingdings" w:hAnsi="Wingdings" w:hint="default"/>
+        <w:sz w:val="20"/>
+      </w:rPr>
+    </w:lvl>
+    <w:lvl w:ilvl="8" w:tentative="1">
+      <w:start w:val="1"/>
+      <w:numFmt w:val="bullet"/>
+      <w:lvlText w:val=""/>
+      <w:lvlJc w:val="left"/>
+      <w:pPr>
+        <w:tabs>
+          <w:tab w:val="num" w:pos="6480"/>
+        </w:tabs>
+        <w:ind w:left="6480" w:hanging="360"/>
+      </w:pPr>
+      <w:rPr>
+        <w:rFonts w:ascii="Wingdings" w:hAnsi="Wingdings" w:hint="default"/>
+        <w:sz w:val="20"/>
+      </w:rPr>
+    </w:lvl>
+  </w:abstractNum>
+  <w:abstractNum w:abstractNumId="4" w15:restartNumberingAfterBreak="0">
     <w:nsid w:val="121F6F54"/>
     <w:multiLevelType w:val="multilevel"/>
     <w:tmpl w:val="69264068"/>
@@ -2991,7 +5925,7 @@
       </w:rPr>
     </w:lvl>
   </w:abstractNum>
-  <w:abstractNum w:abstractNumId="2" w15:restartNumberingAfterBreak="0">
+  <w:abstractNum w:abstractNumId="5" w15:restartNumberingAfterBreak="0">
     <w:nsid w:val="13927245"/>
     <w:multiLevelType w:val="multilevel"/>
     <w:tmpl w:val="C382F58E"/>
@@ -3108,7 +6042,7 @@
       </w:pPr>
     </w:lvl>
   </w:abstractNum>
-  <w:abstractNum w:abstractNumId="3" w15:restartNumberingAfterBreak="0">
+  <w:abstractNum w:abstractNumId="6" w15:restartNumberingAfterBreak="0">
     <w:nsid w:val="16CA7C78"/>
     <w:multiLevelType w:val="multilevel"/>
     <w:tmpl w:val="B7942ABA"/>
@@ -3221,7 +6155,156 @@
       </w:pPr>
     </w:lvl>
   </w:abstractNum>
-  <w:abstractNum w:abstractNumId="4" w15:restartNumberingAfterBreak="0">
+  <w:abstractNum w:abstractNumId="7" w15:restartNumberingAfterBreak="0">
+    <w:nsid w:val="16F72479"/>
+    <w:multiLevelType w:val="multilevel"/>
+    <w:tmpl w:val="E5C08190"/>
+    <w:lvl w:ilvl="0">
+      <w:start w:val="1"/>
+      <w:numFmt w:val="bullet"/>
+      <w:lvlText w:val=""/>
+      <w:lvlJc w:val="left"/>
+      <w:pPr>
+        <w:tabs>
+          <w:tab w:val="num" w:pos="720"/>
+        </w:tabs>
+        <w:ind w:left="720" w:hanging="360"/>
+      </w:pPr>
+      <w:rPr>
+        <w:rFonts w:ascii="Symbol" w:hAnsi="Symbol" w:hint="default"/>
+        <w:sz w:val="20"/>
+      </w:rPr>
+    </w:lvl>
+    <w:lvl w:ilvl="1" w:tentative="1">
+      <w:start w:val="1"/>
+      <w:numFmt w:val="bullet"/>
+      <w:lvlText w:val="o"/>
+      <w:lvlJc w:val="left"/>
+      <w:pPr>
+        <w:tabs>
+          <w:tab w:val="num" w:pos="1440"/>
+        </w:tabs>
+        <w:ind w:left="1440" w:hanging="360"/>
+      </w:pPr>
+      <w:rPr>
+        <w:rFonts w:ascii="Courier New" w:hAnsi="Courier New" w:hint="default"/>
+        <w:sz w:val="20"/>
+      </w:rPr>
+    </w:lvl>
+    <w:lvl w:ilvl="2" w:tentative="1">
+      <w:start w:val="1"/>
+      <w:numFmt w:val="bullet"/>
+      <w:lvlText w:val=""/>
+      <w:lvlJc w:val="left"/>
+      <w:pPr>
+        <w:tabs>
+          <w:tab w:val="num" w:pos="2160"/>
+        </w:tabs>
+        <w:ind w:left="2160" w:hanging="360"/>
+      </w:pPr>
+      <w:rPr>
+        <w:rFonts w:ascii="Wingdings" w:hAnsi="Wingdings" w:hint="default"/>
+        <w:sz w:val="20"/>
+      </w:rPr>
+    </w:lvl>
+    <w:lvl w:ilvl="3" w:tentative="1">
+      <w:start w:val="1"/>
+      <w:numFmt w:val="bullet"/>
+      <w:lvlText w:val=""/>
+      <w:lvlJc w:val="left"/>
+      <w:pPr>
+        <w:tabs>
+          <w:tab w:val="num" w:pos="2880"/>
+        </w:tabs>
+        <w:ind w:left="2880" w:hanging="360"/>
+      </w:pPr>
+      <w:rPr>
+        <w:rFonts w:ascii="Wingdings" w:hAnsi="Wingdings" w:hint="default"/>
+        <w:sz w:val="20"/>
+      </w:rPr>
+    </w:lvl>
+    <w:lvl w:ilvl="4" w:tentative="1">
+      <w:start w:val="1"/>
+      <w:numFmt w:val="bullet"/>
+      <w:lvlText w:val=""/>
+      <w:lvlJc w:val="left"/>
+      <w:pPr>
+        <w:tabs>
+          <w:tab w:val="num" w:pos="3600"/>
+        </w:tabs>
+        <w:ind w:left="3600" w:hanging="360"/>
+      </w:pPr>
+      <w:rPr>
+        <w:rFonts w:ascii="Wingdings" w:hAnsi="Wingdings" w:hint="default"/>
+        <w:sz w:val="20"/>
+      </w:rPr>
+    </w:lvl>
+    <w:lvl w:ilvl="5" w:tentative="1">
+      <w:start w:val="1"/>
+      <w:numFmt w:val="bullet"/>
+      <w:lvlText w:val=""/>
+      <w:lvlJc w:val="left"/>
+      <w:pPr>
+        <w:tabs>
+          <w:tab w:val="num" w:pos="4320"/>
+        </w:tabs>
+        <w:ind w:left="4320" w:hanging="360"/>
+      </w:pPr>
+      <w:rPr>
+        <w:rFonts w:ascii="Wingdings" w:hAnsi="Wingdings" w:hint="default"/>
+        <w:sz w:val="20"/>
+      </w:rPr>
+    </w:lvl>
+    <w:lvl w:ilvl="6" w:tentative="1">
+      <w:start w:val="1"/>
+      <w:numFmt w:val="bullet"/>
+      <w:lvlText w:val=""/>
+      <w:lvlJc w:val="left"/>
+      <w:pPr>
+        <w:tabs>
+          <w:tab w:val="num" w:pos="5040"/>
+        </w:tabs>
+        <w:ind w:left="5040" w:hanging="360"/>
+      </w:pPr>
+      <w:rPr>
+        <w:rFonts w:ascii="Wingdings" w:hAnsi="Wingdings" w:hint="default"/>
+        <w:sz w:val="20"/>
+      </w:rPr>
+    </w:lvl>
+    <w:lvl w:ilvl="7" w:tentative="1">
+      <w:start w:val="1"/>
+      <w:numFmt w:val="bullet"/>
+      <w:lvlText w:val=""/>
+      <w:lvlJc w:val="left"/>
+      <w:pPr>
+        <w:tabs>
+          <w:tab w:val="num" w:pos="5760"/>
+        </w:tabs>
+        <w:ind w:left="5760" w:hanging="360"/>
+      </w:pPr>
+      <w:rPr>
+        <w:rFonts w:ascii="Wingdings" w:hAnsi="Wingdings" w:hint="default"/>
+        <w:sz w:val="20"/>
+      </w:rPr>
+    </w:lvl>
+    <w:lvl w:ilvl="8" w:tentative="1">
+      <w:start w:val="1"/>
+      <w:numFmt w:val="bullet"/>
+      <w:lvlText w:val=""/>
+      <w:lvlJc w:val="left"/>
+      <w:pPr>
+        <w:tabs>
+          <w:tab w:val="num" w:pos="6480"/>
+        </w:tabs>
+        <w:ind w:left="6480" w:hanging="360"/>
+      </w:pPr>
+      <w:rPr>
+        <w:rFonts w:ascii="Wingdings" w:hAnsi="Wingdings" w:hint="default"/>
+        <w:sz w:val="20"/>
+      </w:rPr>
+    </w:lvl>
+  </w:abstractNum>
+  <w:abstractNum w:abstractNumId="8" w15:restartNumberingAfterBreak="0">
     <w:nsid w:val="233157B4"/>
     <w:multiLevelType w:val="multilevel"/>
     <w:tmpl w:val="A6A478C4"/>
@@ -3366,7 +6449,128 @@
       </w:rPr>
     </w:lvl>
   </w:abstractNum>
-  <w:abstractNum w:abstractNumId="5" w15:restartNumberingAfterBreak="0">
+  <w:abstractNum w:abstractNumId="9" w15:restartNumberingAfterBreak="0">
+    <w:nsid w:val="275C3CA1"/>
+    <w:multiLevelType w:val="multilevel"/>
+    <w:tmpl w:val="6D689D44"/>
+    <w:lvl w:ilvl="0">
+      <w:start w:val="1"/>
+      <w:numFmt w:val="decimal"/>
+      <w:lvlText w:val="%1."/>
+      <w:lvlJc w:val="left"/>
+      <w:pPr>
+        <w:tabs>
+          <w:tab w:val="num" w:pos="720"/>
+        </w:tabs>
+        <w:ind w:left="720" w:hanging="360"/>
+      </w:pPr>
+    </w:lvl>
+    <w:lvl w:ilvl="1">
+      <w:start w:val="1"/>
+      <w:numFmt w:val="bullet"/>
+      <w:lvlText w:val="o"/>
+      <w:lvlJc w:val="left"/>
+      <w:pPr>
+        <w:tabs>
+          <w:tab w:val="num" w:pos="1440"/>
+        </w:tabs>
+        <w:ind w:left="1440" w:hanging="360"/>
+      </w:pPr>
+      <w:rPr>
+        <w:rFonts w:ascii="Courier New" w:hAnsi="Courier New" w:hint="default"/>
+        <w:sz w:val="20"/>
+      </w:rPr>
+    </w:lvl>
+    <w:lvl w:ilvl="2">
+      <w:start w:val="1"/>
+      <w:numFmt w:val="bullet"/>
+      <w:lvlText w:val=""/>
+      <w:lvlJc w:val="left"/>
+      <w:pPr>
+        <w:tabs>
+          <w:tab w:val="num" w:pos="2160"/>
+        </w:tabs>
+        <w:ind w:left="2160" w:hanging="360"/>
+      </w:pPr>
+      <w:rPr>
+        <w:rFonts w:ascii="Wingdings" w:hAnsi="Wingdings" w:hint="default"/>
+        <w:sz w:val="20"/>
+      </w:rPr>
+    </w:lvl>
+    <w:lvl w:ilvl="3" w:tentative="1">
+      <w:start w:val="1"/>
+      <w:numFmt w:val="decimal"/>
+      <w:lvlText w:val="%4."/>
+      <w:lvlJc w:val="left"/>
+      <w:pPr>
+        <w:tabs>
+          <w:tab w:val="num" w:pos="2880"/>
+        </w:tabs>
+        <w:ind w:left="2880" w:hanging="360"/>
+      </w:pPr>
+    </w:lvl>
+    <w:lvl w:ilvl="4" w:tentative="1">
+      <w:start w:val="1"/>
+      <w:numFmt w:val="decimal"/>
+      <w:lvlText w:val="%5."/>
+      <w:lvlJc w:val="left"/>
+      <w:pPr>
+        <w:tabs>
+          <w:tab w:val="num" w:pos="3600"/>
+        </w:tabs>
+        <w:ind w:left="3600" w:hanging="360"/>
+      </w:pPr>
+    </w:lvl>
+    <w:lvl w:ilvl="5" w:tentative="1">
+      <w:start w:val="1"/>
+      <w:numFmt w:val="decimal"/>
+      <w:lvlText w:val="%6."/>
+      <w:lvlJc w:val="left"/>
+      <w:pPr>
+        <w:tabs>
+          <w:tab w:val="num" w:pos="4320"/>
+        </w:tabs>
+        <w:ind w:left="4320" w:hanging="360"/>
+      </w:pPr>
+    </w:lvl>
+    <w:lvl w:ilvl="6" w:tentative="1">
+      <w:start w:val="1"/>
+      <w:numFmt w:val="decimal"/>
+      <w:lvlText w:val="%7."/>
+      <w:lvlJc w:val="left"/>
+      <w:pPr>
+        <w:tabs>
+          <w:tab w:val="num" w:pos="5040"/>
+        </w:tabs>
+        <w:ind w:left="5040" w:hanging="360"/>
+      </w:pPr>
+    </w:lvl>
+    <w:lvl w:ilvl="7" w:tentative="1">
+      <w:start w:val="1"/>
+      <w:numFmt w:val="decimal"/>
+      <w:lvlText w:val="%8."/>
+      <w:lvlJc w:val="left"/>
+      <w:pPr>
+        <w:tabs>
+          <w:tab w:val="num" w:pos="5760"/>
+        </w:tabs>
+        <w:ind w:left="5760" w:hanging="360"/>
+      </w:pPr>
+    </w:lvl>
+    <w:lvl w:ilvl="8" w:tentative="1">
+      <w:start w:val="1"/>
+      <w:numFmt w:val="decimal"/>
+      <w:lvlText w:val="%9."/>
+      <w:lvlJc w:val="left"/>
+      <w:pPr>
+        <w:tabs>
+          <w:tab w:val="num" w:pos="6480"/>
+        </w:tabs>
+        <w:ind w:left="6480" w:hanging="360"/>
+      </w:pPr>
+    </w:lvl>
+  </w:abstractNum>
+  <w:abstractNum w:abstractNumId="10" w15:restartNumberingAfterBreak="0">
     <w:nsid w:val="282F539F"/>
     <w:multiLevelType w:val="multilevel"/>
     <w:tmpl w:val="68E0FB54"/>
@@ -3515,7 +6719,156 @@
       </w:rPr>
     </w:lvl>
   </w:abstractNum>
-  <w:abstractNum w:abstractNumId="6" w15:restartNumberingAfterBreak="0">
+  <w:abstractNum w:abstractNumId="11" w15:restartNumberingAfterBreak="0">
+    <w:nsid w:val="2E3D04CB"/>
+    <w:multiLevelType w:val="multilevel"/>
+    <w:tmpl w:val="FB1AD04C"/>
+    <w:lvl w:ilvl="0">
+      <w:start w:val="1"/>
+      <w:numFmt w:val="bullet"/>
+      <w:lvlText w:val=""/>
+      <w:lvlJc w:val="left"/>
+      <w:pPr>
+        <w:tabs>
+          <w:tab w:val="num" w:pos="720"/>
+        </w:tabs>
+        <w:ind w:left="720" w:hanging="360"/>
+      </w:pPr>
+      <w:rPr>
+        <w:rFonts w:ascii="Symbol" w:hAnsi="Symbol" w:hint="default"/>
+        <w:sz w:val="20"/>
+      </w:rPr>
+    </w:lvl>
+    <w:lvl w:ilvl="1" w:tentative="1">
+      <w:start w:val="1"/>
+      <w:numFmt w:val="bullet"/>
+      <w:lvlText w:val="o"/>
+      <w:lvlJc w:val="left"/>
+      <w:pPr>
+        <w:tabs>
+          <w:tab w:val="num" w:pos="1440"/>
+        </w:tabs>
+        <w:ind w:left="1440" w:hanging="360"/>
+      </w:pPr>
+      <w:rPr>
+        <w:rFonts w:ascii="Courier New" w:hAnsi="Courier New" w:hint="default"/>
+        <w:sz w:val="20"/>
+      </w:rPr>
+    </w:lvl>
+    <w:lvl w:ilvl="2" w:tentative="1">
+      <w:start w:val="1"/>
+      <w:numFmt w:val="bullet"/>
+      <w:lvlText w:val=""/>
+      <w:lvlJc w:val="left"/>
+      <w:pPr>
+        <w:tabs>
+          <w:tab w:val="num" w:pos="2160"/>
+        </w:tabs>
+        <w:ind w:left="2160" w:hanging="360"/>
+      </w:pPr>
+      <w:rPr>
+        <w:rFonts w:ascii="Wingdings" w:hAnsi="Wingdings" w:hint="default"/>
+        <w:sz w:val="20"/>
+      </w:rPr>
+    </w:lvl>
+    <w:lvl w:ilvl="3" w:tentative="1">
+      <w:start w:val="1"/>
+      <w:numFmt w:val="bullet"/>
+      <w:lvlText w:val=""/>
+      <w:lvlJc w:val="left"/>
+      <w:pPr>
+        <w:tabs>
+          <w:tab w:val="num" w:pos="2880"/>
+        </w:tabs>
+        <w:ind w:left="2880" w:hanging="360"/>
+      </w:pPr>
+      <w:rPr>
+        <w:rFonts w:ascii="Wingdings" w:hAnsi="Wingdings" w:hint="default"/>
+        <w:sz w:val="20"/>
+      </w:rPr>
+    </w:lvl>
+    <w:lvl w:ilvl="4" w:tentative="1">
+      <w:start w:val="1"/>
+      <w:numFmt w:val="bullet"/>
+      <w:lvlText w:val=""/>
+      <w:lvlJc w:val="left"/>
+      <w:pPr>
+        <w:tabs>
+          <w:tab w:val="num" w:pos="3600"/>
+        </w:tabs>
+        <w:ind w:left="3600" w:hanging="360"/>
+      </w:pPr>
+      <w:rPr>
+        <w:rFonts w:ascii="Wingdings" w:hAnsi="Wingdings" w:hint="default"/>
+        <w:sz w:val="20"/>
+      </w:rPr>
+    </w:lvl>
+    <w:lvl w:ilvl="5" w:tentative="1">
+      <w:start w:val="1"/>
+      <w:numFmt w:val="bullet"/>
+      <w:lvlText w:val=""/>
+      <w:lvlJc w:val="left"/>
+      <w:pPr>
+        <w:tabs>
+          <w:tab w:val="num" w:pos="4320"/>
+        </w:tabs>
+        <w:ind w:left="4320" w:hanging="360"/>
+      </w:pPr>
+      <w:rPr>
+        <w:rFonts w:ascii="Wingdings" w:hAnsi="Wingdings" w:hint="default"/>
+        <w:sz w:val="20"/>
+      </w:rPr>
+    </w:lvl>
+    <w:lvl w:ilvl="6" w:tentative="1">
+      <w:start w:val="1"/>
+      <w:numFmt w:val="bullet"/>
+      <w:lvlText w:val=""/>
+      <w:lvlJc w:val="left"/>
+      <w:pPr>
+        <w:tabs>
+          <w:tab w:val="num" w:pos="5040"/>
+        </w:tabs>
+        <w:ind w:left="5040" w:hanging="360"/>
+      </w:pPr>
+      <w:rPr>
+        <w:rFonts w:ascii="Wingdings" w:hAnsi="Wingdings" w:hint="default"/>
+        <w:sz w:val="20"/>
+      </w:rPr>
+    </w:lvl>
+    <w:lvl w:ilvl="7" w:tentative="1">
+      <w:start w:val="1"/>
+      <w:numFmt w:val="bullet"/>
+      <w:lvlText w:val=""/>
+      <w:lvlJc w:val="left"/>
+      <w:pPr>
+        <w:tabs>
+          <w:tab w:val="num" w:pos="5760"/>
+        </w:tabs>
+        <w:ind w:left="5760" w:hanging="360"/>
+      </w:pPr>
+      <w:rPr>
+        <w:rFonts w:ascii="Wingdings" w:hAnsi="Wingdings" w:hint="default"/>
+        <w:sz w:val="20"/>
+      </w:rPr>
+    </w:lvl>
+    <w:lvl w:ilvl="8" w:tentative="1">
+      <w:start w:val="1"/>
+      <w:numFmt w:val="bullet"/>
+      <w:lvlText w:val=""/>
+      <w:lvlJc w:val="left"/>
+      <w:pPr>
+        <w:tabs>
+          <w:tab w:val="num" w:pos="6480"/>
+        </w:tabs>
+        <w:ind w:left="6480" w:hanging="360"/>
+      </w:pPr>
+      <w:rPr>
+        <w:rFonts w:ascii="Wingdings" w:hAnsi="Wingdings" w:hint="default"/>
+        <w:sz w:val="20"/>
+      </w:rPr>
+    </w:lvl>
+  </w:abstractNum>
+  <w:abstractNum w:abstractNumId="12" w15:restartNumberingAfterBreak="0">
     <w:nsid w:val="38794202"/>
     <w:multiLevelType w:val="multilevel"/>
     <w:tmpl w:val="0EA4F932"/>
@@ -3664,7 +7017,7 @@
       </w:rPr>
     </w:lvl>
   </w:abstractNum>
-  <w:abstractNum w:abstractNumId="7" w15:restartNumberingAfterBreak="0">
+  <w:abstractNum w:abstractNumId="13" w15:restartNumberingAfterBreak="0">
     <w:nsid w:val="3A7C7733"/>
     <w:multiLevelType w:val="multilevel"/>
     <w:tmpl w:val="6C6E3ABA"/>
@@ -3813,7 +7166,7 @@
       </w:rPr>
     </w:lvl>
   </w:abstractNum>
-  <w:abstractNum w:abstractNumId="8" w15:restartNumberingAfterBreak="0">
+  <w:abstractNum w:abstractNumId="14" w15:restartNumberingAfterBreak="0">
     <w:nsid w:val="3F97331A"/>
     <w:multiLevelType w:val="multilevel"/>
     <w:tmpl w:val="32321BA6"/>
@@ -3930,7 +7283,156 @@
       </w:pPr>
     </w:lvl>
   </w:abstractNum>
-  <w:abstractNum w:abstractNumId="9" w15:restartNumberingAfterBreak="0">
+  <w:abstractNum w:abstractNumId="15" w15:restartNumberingAfterBreak="0">
+    <w:nsid w:val="41E24E32"/>
+    <w:multiLevelType w:val="multilevel"/>
+    <w:tmpl w:val="14B816AA"/>
+    <w:lvl w:ilvl="0">
+      <w:start w:val="1"/>
+      <w:numFmt w:val="bullet"/>
+      <w:lvlText w:val=""/>
+      <w:lvlJc w:val="left"/>
+      <w:pPr>
+        <w:tabs>
+          <w:tab w:val="num" w:pos="720"/>
+        </w:tabs>
+        <w:ind w:left="720" w:hanging="360"/>
+      </w:pPr>
+      <w:rPr>
+        <w:rFonts w:ascii="Symbol" w:hAnsi="Symbol" w:hint="default"/>
+        <w:sz w:val="20"/>
+      </w:rPr>
+    </w:lvl>
+    <w:lvl w:ilvl="1" w:tentative="1">
+      <w:start w:val="1"/>
+      <w:numFmt w:val="bullet"/>
+      <w:lvlText w:val="o"/>
+      <w:lvlJc w:val="left"/>
+      <w:pPr>
+        <w:tabs>
+          <w:tab w:val="num" w:pos="1440"/>
+        </w:tabs>
+        <w:ind w:left="1440" w:hanging="360"/>
+      </w:pPr>
+      <w:rPr>
+        <w:rFonts w:ascii="Courier New" w:hAnsi="Courier New" w:hint="default"/>
+        <w:sz w:val="20"/>
+      </w:rPr>
+    </w:lvl>
+    <w:lvl w:ilvl="2" w:tentative="1">
+      <w:start w:val="1"/>
+      <w:numFmt w:val="bullet"/>
+      <w:lvlText w:val=""/>
+      <w:lvlJc w:val="left"/>
+      <w:pPr>
+        <w:tabs>
+          <w:tab w:val="num" w:pos="2160"/>
+        </w:tabs>
+        <w:ind w:left="2160" w:hanging="360"/>
+      </w:pPr>
+      <w:rPr>
+        <w:rFonts w:ascii="Wingdings" w:hAnsi="Wingdings" w:hint="default"/>
+        <w:sz w:val="20"/>
+      </w:rPr>
+    </w:lvl>
+    <w:lvl w:ilvl="3" w:tentative="1">
+      <w:start w:val="1"/>
+      <w:numFmt w:val="bullet"/>
+      <w:lvlText w:val=""/>
+      <w:lvlJc w:val="left"/>
+      <w:pPr>
+        <w:tabs>
+          <w:tab w:val="num" w:pos="2880"/>
+        </w:tabs>
+        <w:ind w:left="2880" w:hanging="360"/>
+      </w:pPr>
+      <w:rPr>
+        <w:rFonts w:ascii="Wingdings" w:hAnsi="Wingdings" w:hint="default"/>
+        <w:sz w:val="20"/>
+      </w:rPr>
+    </w:lvl>
+    <w:lvl w:ilvl="4" w:tentative="1">
+      <w:start w:val="1"/>
+      <w:numFmt w:val="bullet"/>
+      <w:lvlText w:val=""/>
+      <w:lvlJc w:val="left"/>
+      <w:pPr>
+        <w:tabs>
+          <w:tab w:val="num" w:pos="3600"/>
+        </w:tabs>
+        <w:ind w:left="3600" w:hanging="360"/>
+      </w:pPr>
+      <w:rPr>
+        <w:rFonts w:ascii="Wingdings" w:hAnsi="Wingdings" w:hint="default"/>
+        <w:sz w:val="20"/>
+      </w:rPr>
+    </w:lvl>
+    <w:lvl w:ilvl="5" w:tentative="1">
+      <w:start w:val="1"/>
+      <w:numFmt w:val="bullet"/>
+      <w:lvlText w:val=""/>
+      <w:lvlJc w:val="left"/>
+      <w:pPr>
+        <w:tabs>
+          <w:tab w:val="num" w:pos="4320"/>
+        </w:tabs>
+        <w:ind w:left="4320" w:hanging="360"/>
+      </w:pPr>
+      <w:rPr>
+        <w:rFonts w:ascii="Wingdings" w:hAnsi="Wingdings" w:hint="default"/>
+        <w:sz w:val="20"/>
+      </w:rPr>
+    </w:lvl>
+    <w:lvl w:ilvl="6" w:tentative="1">
+      <w:start w:val="1"/>
+      <w:numFmt w:val="bullet"/>
+      <w:lvlText w:val=""/>
+      <w:lvlJc w:val="left"/>
+      <w:pPr>
+        <w:tabs>
+          <w:tab w:val="num" w:pos="5040"/>
+        </w:tabs>
+        <w:ind w:left="5040" w:hanging="360"/>
+      </w:pPr>
+      <w:rPr>
+        <w:rFonts w:ascii="Wingdings" w:hAnsi="Wingdings" w:hint="default"/>
+        <w:sz w:val="20"/>
+      </w:rPr>
+    </w:lvl>
+    <w:lvl w:ilvl="7" w:tentative="1">
+      <w:start w:val="1"/>
+      <w:numFmt w:val="bullet"/>
+      <w:lvlText w:val=""/>
+      <w:lvlJc w:val="left"/>
+      <w:pPr>
+        <w:tabs>
+          <w:tab w:val="num" w:pos="5760"/>
+        </w:tabs>
+        <w:ind w:left="5760" w:hanging="360"/>
+      </w:pPr>
+      <w:rPr>
+        <w:rFonts w:ascii="Wingdings" w:hAnsi="Wingdings" w:hint="default"/>
+        <w:sz w:val="20"/>
+      </w:rPr>
+    </w:lvl>
+    <w:lvl w:ilvl="8" w:tentative="1">
+      <w:start w:val="1"/>
+      <w:numFmt w:val="bullet"/>
+      <w:lvlText w:val=""/>
+      <w:lvlJc w:val="left"/>
+      <w:pPr>
+        <w:tabs>
+          <w:tab w:val="num" w:pos="6480"/>
+        </w:tabs>
+        <w:ind w:left="6480" w:hanging="360"/>
+      </w:pPr>
+      <w:rPr>
+        <w:rFonts w:ascii="Wingdings" w:hAnsi="Wingdings" w:hint="default"/>
+        <w:sz w:val="20"/>
+      </w:rPr>
+    </w:lvl>
+  </w:abstractNum>
+  <w:abstractNum w:abstractNumId="16" w15:restartNumberingAfterBreak="0">
     <w:nsid w:val="50016E34"/>
     <w:multiLevelType w:val="multilevel"/>
     <w:tmpl w:val="020E417A"/>
@@ -4079,7 +7581,7 @@
       </w:rPr>
     </w:lvl>
   </w:abstractNum>
-  <w:abstractNum w:abstractNumId="10" w15:restartNumberingAfterBreak="0">
+  <w:abstractNum w:abstractNumId="17" w15:restartNumberingAfterBreak="0">
     <w:nsid w:val="51D929C3"/>
     <w:multiLevelType w:val="multilevel"/>
     <w:tmpl w:val="A0B6111C"/>
@@ -4228,7 +7730,7 @@
       </w:rPr>
     </w:lvl>
   </w:abstractNum>
-  <w:abstractNum w:abstractNumId="11" w15:restartNumberingAfterBreak="0">
+  <w:abstractNum w:abstractNumId="18" w15:restartNumberingAfterBreak="0">
     <w:nsid w:val="52D916D8"/>
     <w:multiLevelType w:val="multilevel"/>
     <w:tmpl w:val="2C7282FE"/>
@@ -4377,7 +7879,7 @@
       </w:rPr>
     </w:lvl>
   </w:abstractNum>
-  <w:abstractNum w:abstractNumId="12" w15:restartNumberingAfterBreak="0">
+  <w:abstractNum w:abstractNumId="19" w15:restartNumberingAfterBreak="0">
     <w:nsid w:val="5348351D"/>
     <w:multiLevelType w:val="multilevel"/>
     <w:tmpl w:val="C24452C6"/>
@@ -4526,7 +8028,7 @@
       </w:rPr>
     </w:lvl>
   </w:abstractNum>
-  <w:abstractNum w:abstractNumId="13" w15:restartNumberingAfterBreak="0">
+  <w:abstractNum w:abstractNumId="20" w15:restartNumberingAfterBreak="0">
     <w:nsid w:val="57B0336C"/>
     <w:multiLevelType w:val="multilevel"/>
     <w:tmpl w:val="D83C0492"/>
@@ -4675,7 +8177,7 @@
       </w:rPr>
     </w:lvl>
   </w:abstractNum>
-  <w:abstractNum w:abstractNumId="14" w15:restartNumberingAfterBreak="0">
+  <w:abstractNum w:abstractNumId="21" w15:restartNumberingAfterBreak="0">
     <w:nsid w:val="5A716EEC"/>
     <w:multiLevelType w:val="multilevel"/>
     <w:tmpl w:val="3C6E9388"/>
@@ -4824,7 +8326,7 @@
       </w:rPr>
     </w:lvl>
   </w:abstractNum>
-  <w:abstractNum w:abstractNumId="15" w15:restartNumberingAfterBreak="0">
+  <w:abstractNum w:abstractNumId="22" w15:restartNumberingAfterBreak="0">
     <w:nsid w:val="5E925DD0"/>
     <w:multiLevelType w:val="multilevel"/>
     <w:tmpl w:val="8F0E83C2"/>
@@ -4973,7 +8475,156 @@
       </w:rPr>
     </w:lvl>
   </w:abstractNum>
-  <w:abstractNum w:abstractNumId="16" w15:restartNumberingAfterBreak="0">
+  <w:abstractNum w:abstractNumId="23" w15:restartNumberingAfterBreak="0">
+    <w:nsid w:val="6339600E"/>
+    <w:multiLevelType w:val="multilevel"/>
+    <w:tmpl w:val="8E3296CE"/>
+    <w:lvl w:ilvl="0">
+      <w:start w:val="1"/>
+      <w:numFmt w:val="bullet"/>
+      <w:lvlText w:val=""/>
+      <w:lvlJc w:val="left"/>
+      <w:pPr>
+        <w:tabs>
+          <w:tab w:val="num" w:pos="720"/>
+        </w:tabs>
+        <w:ind w:left="720" w:hanging="360"/>
+      </w:pPr>
+      <w:rPr>
+        <w:rFonts w:ascii="Symbol" w:hAnsi="Symbol" w:hint="default"/>
+        <w:sz w:val="20"/>
+      </w:rPr>
+    </w:lvl>
+    <w:lvl w:ilvl="1" w:tentative="1">
+      <w:start w:val="1"/>
+      <w:numFmt w:val="bullet"/>
+      <w:lvlText w:val="o"/>
+      <w:lvlJc w:val="left"/>
+      <w:pPr>
+        <w:tabs>
+          <w:tab w:val="num" w:pos="1440"/>
+        </w:tabs>
+        <w:ind w:left="1440" w:hanging="360"/>
+      </w:pPr>
+      <w:rPr>
+        <w:rFonts w:ascii="Courier New" w:hAnsi="Courier New" w:hint="default"/>
+        <w:sz w:val="20"/>
+      </w:rPr>
+    </w:lvl>
+    <w:lvl w:ilvl="2" w:tentative="1">
+      <w:start w:val="1"/>
+      <w:numFmt w:val="bullet"/>
+      <w:lvlText w:val=""/>
+      <w:lvlJc w:val="left"/>
+      <w:pPr>
+        <w:tabs>
+          <w:tab w:val="num" w:pos="2160"/>
+        </w:tabs>
+        <w:ind w:left="2160" w:hanging="360"/>
+      </w:pPr>
+      <w:rPr>
+        <w:rFonts w:ascii="Wingdings" w:hAnsi="Wingdings" w:hint="default"/>
+        <w:sz w:val="20"/>
+      </w:rPr>
+    </w:lvl>
+    <w:lvl w:ilvl="3" w:tentative="1">
+      <w:start w:val="1"/>
+      <w:numFmt w:val="bullet"/>
+      <w:lvlText w:val=""/>
+      <w:lvlJc w:val="left"/>
+      <w:pPr>
+        <w:tabs>
+          <w:tab w:val="num" w:pos="2880"/>
+        </w:tabs>
+        <w:ind w:left="2880" w:hanging="360"/>
+      </w:pPr>
+      <w:rPr>
+        <w:rFonts w:ascii="Wingdings" w:hAnsi="Wingdings" w:hint="default"/>
+        <w:sz w:val="20"/>
+      </w:rPr>
+    </w:lvl>
+    <w:lvl w:ilvl="4" w:tentative="1">
+      <w:start w:val="1"/>
+      <w:numFmt w:val="bullet"/>
+      <w:lvlText w:val=""/>
+      <w:lvlJc w:val="left"/>
+      <w:pPr>
+        <w:tabs>
+          <w:tab w:val="num" w:pos="3600"/>
+        </w:tabs>
+        <w:ind w:left="3600" w:hanging="360"/>
+      </w:pPr>
+      <w:rPr>
+        <w:rFonts w:ascii="Wingdings" w:hAnsi="Wingdings" w:hint="default"/>
+        <w:sz w:val="20"/>
+      </w:rPr>
+    </w:lvl>
+    <w:lvl w:ilvl="5" w:tentative="1">
+      <w:start w:val="1"/>
+      <w:numFmt w:val="bullet"/>
+      <w:lvlText w:val=""/>
+      <w:lvlJc w:val="left"/>
+      <w:pPr>
+        <w:tabs>
+          <w:tab w:val="num" w:pos="4320"/>
+        </w:tabs>
+        <w:ind w:left="4320" w:hanging="360"/>
+      </w:pPr>
+      <w:rPr>
+        <w:rFonts w:ascii="Wingdings" w:hAnsi="Wingdings" w:hint="default"/>
+        <w:sz w:val="20"/>
+      </w:rPr>
+    </w:lvl>
+    <w:lvl w:ilvl="6" w:tentative="1">
+      <w:start w:val="1"/>
+      <w:numFmt w:val="bullet"/>
+      <w:lvlText w:val=""/>
+      <w:lvlJc w:val="left"/>
+      <w:pPr>
+        <w:tabs>
+          <w:tab w:val="num" w:pos="5040"/>
+        </w:tabs>
+        <w:ind w:left="5040" w:hanging="360"/>
+      </w:pPr>
+      <w:rPr>
+        <w:rFonts w:ascii="Wingdings" w:hAnsi="Wingdings" w:hint="default"/>
+        <w:sz w:val="20"/>
+      </w:rPr>
+    </w:lvl>
+    <w:lvl w:ilvl="7" w:tentative="1">
+      <w:start w:val="1"/>
+      <w:numFmt w:val="bullet"/>
+      <w:lvlText w:val=""/>
+      <w:lvlJc w:val="left"/>
+      <w:pPr>
+        <w:tabs>
+          <w:tab w:val="num" w:pos="5760"/>
+        </w:tabs>
+        <w:ind w:left="5760" w:hanging="360"/>
+      </w:pPr>
+      <w:rPr>
+        <w:rFonts w:ascii="Wingdings" w:hAnsi="Wingdings" w:hint="default"/>
+        <w:sz w:val="20"/>
+      </w:rPr>
+    </w:lvl>
+    <w:lvl w:ilvl="8" w:tentative="1">
+      <w:start w:val="1"/>
+      <w:numFmt w:val="bullet"/>
+      <w:lvlText w:val=""/>
+      <w:lvlJc w:val="left"/>
+      <w:pPr>
+        <w:tabs>
+          <w:tab w:val="num" w:pos="6480"/>
+        </w:tabs>
+        <w:ind w:left="6480" w:hanging="360"/>
+      </w:pPr>
+      <w:rPr>
+        <w:rFonts w:ascii="Wingdings" w:hAnsi="Wingdings" w:hint="default"/>
+        <w:sz w:val="20"/>
+      </w:rPr>
+    </w:lvl>
+  </w:abstractNum>
+  <w:abstractNum w:abstractNumId="24" w15:restartNumberingAfterBreak="0">
     <w:nsid w:val="74E30C48"/>
     <w:multiLevelType w:val="multilevel"/>
     <w:tmpl w:val="A90A7CCA"/>
@@ -5122,56 +8773,232 @@
       </w:rPr>
     </w:lvl>
   </w:abstractNum>
+  <w:abstractNum w:abstractNumId="25" w15:restartNumberingAfterBreak="0">
+    <w:nsid w:val="7E3E5673"/>
+    <w:multiLevelType w:val="multilevel"/>
+    <w:tmpl w:val="A1AA7AA8"/>
+    <w:lvl w:ilvl="0">
+      <w:start w:val="1"/>
+      <w:numFmt w:val="bullet"/>
+      <w:lvlText w:val=""/>
+      <w:lvlJc w:val="left"/>
+      <w:pPr>
+        <w:tabs>
+          <w:tab w:val="num" w:pos="720"/>
+        </w:tabs>
+        <w:ind w:left="720" w:hanging="360"/>
+      </w:pPr>
+      <w:rPr>
+        <w:rFonts w:ascii="Symbol" w:hAnsi="Symbol" w:hint="default"/>
+        <w:sz w:val="20"/>
+      </w:rPr>
+    </w:lvl>
+    <w:lvl w:ilvl="1" w:tentative="1">
+      <w:start w:val="1"/>
+      <w:numFmt w:val="bullet"/>
+      <w:lvlText w:val="o"/>
+      <w:lvlJc w:val="left"/>
+      <w:pPr>
+        <w:tabs>
+          <w:tab w:val="num" w:pos="1440"/>
+        </w:tabs>
+        <w:ind w:left="1440" w:hanging="360"/>
+      </w:pPr>
+      <w:rPr>
+        <w:rFonts w:ascii="Courier New" w:hAnsi="Courier New" w:hint="default"/>
+        <w:sz w:val="20"/>
+      </w:rPr>
+    </w:lvl>
+    <w:lvl w:ilvl="2" w:tentative="1">
+      <w:start w:val="1"/>
+      <w:numFmt w:val="bullet"/>
+      <w:lvlText w:val=""/>
+      <w:lvlJc w:val="left"/>
+      <w:pPr>
+        <w:tabs>
+          <w:tab w:val="num" w:pos="2160"/>
+        </w:tabs>
+        <w:ind w:left="2160" w:hanging="360"/>
+      </w:pPr>
+      <w:rPr>
+        <w:rFonts w:ascii="Wingdings" w:hAnsi="Wingdings" w:hint="default"/>
+        <w:sz w:val="20"/>
+      </w:rPr>
+    </w:lvl>
+    <w:lvl w:ilvl="3" w:tentative="1">
+      <w:start w:val="1"/>
+      <w:numFmt w:val="bullet"/>
+      <w:lvlText w:val=""/>
+      <w:lvlJc w:val="left"/>
+      <w:pPr>
+        <w:tabs>
+          <w:tab w:val="num" w:pos="2880"/>
+        </w:tabs>
+        <w:ind w:left="2880" w:hanging="360"/>
+      </w:pPr>
+      <w:rPr>
+        <w:rFonts w:ascii="Wingdings" w:hAnsi="Wingdings" w:hint="default"/>
+        <w:sz w:val="20"/>
+      </w:rPr>
+    </w:lvl>
+    <w:lvl w:ilvl="4" w:tentative="1">
+      <w:start w:val="1"/>
+      <w:numFmt w:val="bullet"/>
+      <w:lvlText w:val=""/>
+      <w:lvlJc w:val="left"/>
+      <w:pPr>
+        <w:tabs>
+          <w:tab w:val="num" w:pos="3600"/>
+        </w:tabs>
+        <w:ind w:left="3600" w:hanging="360"/>
+      </w:pPr>
+      <w:rPr>
+        <w:rFonts w:ascii="Wingdings" w:hAnsi="Wingdings" w:hint="default"/>
+        <w:sz w:val="20"/>
+      </w:rPr>
+    </w:lvl>
+    <w:lvl w:ilvl="5" w:tentative="1">
+      <w:start w:val="1"/>
+      <w:numFmt w:val="bullet"/>
+      <w:lvlText w:val=""/>
+      <w:lvlJc w:val="left"/>
+      <w:pPr>
+        <w:tabs>
+          <w:tab w:val="num" w:pos="4320"/>
+        </w:tabs>
+        <w:ind w:left="4320" w:hanging="360"/>
+      </w:pPr>
+      <w:rPr>
+        <w:rFonts w:ascii="Wingdings" w:hAnsi="Wingdings" w:hint="default"/>
+        <w:sz w:val="20"/>
+      </w:rPr>
+    </w:lvl>
+    <w:lvl w:ilvl="6" w:tentative="1">
+      <w:start w:val="1"/>
+      <w:numFmt w:val="bullet"/>
+      <w:lvlText w:val=""/>
+      <w:lvlJc w:val="left"/>
+      <w:pPr>
+        <w:tabs>
+          <w:tab w:val="num" w:pos="5040"/>
+        </w:tabs>
+        <w:ind w:left="5040" w:hanging="360"/>
+      </w:pPr>
+      <w:rPr>
+        <w:rFonts w:ascii="Wingdings" w:hAnsi="Wingdings" w:hint="default"/>
+        <w:sz w:val="20"/>
+      </w:rPr>
+    </w:lvl>
+    <w:lvl w:ilvl="7" w:tentative="1">
+      <w:start w:val="1"/>
+      <w:numFmt w:val="bullet"/>
+      <w:lvlText w:val=""/>
+      <w:lvlJc w:val="left"/>
+      <w:pPr>
+        <w:tabs>
+          <w:tab w:val="num" w:pos="5760"/>
+        </w:tabs>
+        <w:ind w:left="5760" w:hanging="360"/>
+      </w:pPr>
+      <w:rPr>
+        <w:rFonts w:ascii="Wingdings" w:hAnsi="Wingdings" w:hint="default"/>
+        <w:sz w:val="20"/>
+      </w:rPr>
+    </w:lvl>
+    <w:lvl w:ilvl="8" w:tentative="1">
+      <w:start w:val="1"/>
+      <w:numFmt w:val="bullet"/>
+      <w:lvlText w:val=""/>
+      <w:lvlJc w:val="left"/>
+      <w:pPr>
+        <w:tabs>
+          <w:tab w:val="num" w:pos="6480"/>
+        </w:tabs>
+        <w:ind w:left="6480" w:hanging="360"/>
+      </w:pPr>
+      <w:rPr>
+        <w:rFonts w:ascii="Wingdings" w:hAnsi="Wingdings" w:hint="default"/>
+        <w:sz w:val="20"/>
+      </w:rPr>
+    </w:lvl>
+  </w:abstractNum>
   <w:num w:numId="1" w16cid:durableId="1930582642">
+    <w:abstractNumId w:val="18"/>
+  </w:num>
+  <w:num w:numId="2" w16cid:durableId="1769882542">
+    <w:abstractNumId w:val="17"/>
+  </w:num>
+  <w:num w:numId="3" w16cid:durableId="971668531">
+    <w:abstractNumId w:val="13"/>
+  </w:num>
+  <w:num w:numId="4" w16cid:durableId="1032725787">
+    <w:abstractNumId w:val="16"/>
+  </w:num>
+  <w:num w:numId="5" w16cid:durableId="2037344762">
+    <w:abstractNumId w:val="19"/>
+  </w:num>
+  <w:num w:numId="6" w16cid:durableId="322899923">
+    <w:abstractNumId w:val="4"/>
+  </w:num>
+  <w:num w:numId="7" w16cid:durableId="606936184">
+    <w:abstractNumId w:val="22"/>
+  </w:num>
+  <w:num w:numId="8" w16cid:durableId="1513757500">
+    <w:abstractNumId w:val="24"/>
+  </w:num>
+  <w:num w:numId="9" w16cid:durableId="1814717361">
+    <w:abstractNumId w:val="20"/>
+  </w:num>
+  <w:num w:numId="10" w16cid:durableId="1310020153">
+    <w:abstractNumId w:val="12"/>
+  </w:num>
+  <w:num w:numId="11" w16cid:durableId="612136019">
+    <w:abstractNumId w:val="10"/>
+  </w:num>
+  <w:num w:numId="12" w16cid:durableId="451021611">
+    <w:abstractNumId w:val="21"/>
+  </w:num>
+  <w:num w:numId="13" w16cid:durableId="1102992896">
+    <w:abstractNumId w:val="6"/>
+  </w:num>
+  <w:num w:numId="14" w16cid:durableId="886379298">
+    <w:abstractNumId w:val="8"/>
+  </w:num>
+  <w:num w:numId="15" w16cid:durableId="32467885">
+    <w:abstractNumId w:val="14"/>
+  </w:num>
+  <w:num w:numId="16" w16cid:durableId="231699082">
+    <w:abstractNumId w:val="5"/>
+  </w:num>
+  <w:num w:numId="17" w16cid:durableId="1385983069">
+    <w:abstractNumId w:val="1"/>
+  </w:num>
+  <w:num w:numId="18" w16cid:durableId="1614894831">
+    <w:abstractNumId w:val="9"/>
+  </w:num>
+  <w:num w:numId="19" w16cid:durableId="191843145">
+    <w:abstractNumId w:val="7"/>
+  </w:num>
+  <w:num w:numId="20" w16cid:durableId="1751348055">
+    <w:abstractNumId w:val="23"/>
+  </w:num>
+  <w:num w:numId="21" w16cid:durableId="1413232777">
     <w:abstractNumId w:val="11"/>
   </w:num>
-  <w:num w:numId="2" w16cid:durableId="1769882542">
-    <w:abstractNumId w:val="10"/>
+  <w:num w:numId="22" w16cid:durableId="64887959">
+    <w:abstractNumId w:val="3"/>
   </w:num>
-  <w:num w:numId="3" w16cid:durableId="971668531">
-    <w:abstractNumId w:val="7"/>
-  </w:num>
-  <w:num w:numId="4" w16cid:durableId="1032725787">
-    <w:abstractNumId w:val="9"/>
-  </w:num>
-  <w:num w:numId="5" w16cid:durableId="2037344762">
-    <w:abstractNumId w:val="12"/>
-  </w:num>
-  <w:num w:numId="6" w16cid:durableId="322899923">
-    <w:abstractNumId w:val="1"/>
-  </w:num>
-  <w:num w:numId="7" w16cid:durableId="606936184">
+  <w:num w:numId="23" w16cid:durableId="1588884472">
     <w:abstractNumId w:val="15"/>
   </w:num>
-  <w:num w:numId="8" w16cid:durableId="1513757500">
-    <w:abstractNumId w:val="16"/>
+  <w:num w:numId="24" w16cid:durableId="1620062161">
+    <w:abstractNumId w:val="0"/>
   </w:num>
-  <w:num w:numId="9" w16cid:durableId="1814717361">
-    <w:abstractNumId w:val="13"/>
-  </w:num>
-  <w:num w:numId="10" w16cid:durableId="1310020153">
-    <w:abstractNumId w:val="6"/>
-  </w:num>
-  <w:num w:numId="11" w16cid:durableId="612136019">
-    <w:abstractNumId w:val="5"/>
-  </w:num>
-  <w:num w:numId="12" w16cid:durableId="451021611">
-    <w:abstractNumId w:val="14"/>
-  </w:num>
-  <w:num w:numId="13" w16cid:durableId="1102992896">
-    <w:abstractNumId w:val="3"/>
-  </w:num>
-  <w:num w:numId="14" w16cid:durableId="886379298">
-    <w:abstractNumId w:val="4"/>
-  </w:num>
-  <w:num w:numId="15" w16cid:durableId="32467885">
-    <w:abstractNumId w:val="8"/>
-  </w:num>
-  <w:num w:numId="16" w16cid:durableId="231699082">
+  <w:num w:numId="25" w16cid:durableId="318995710">
     <w:abstractNumId w:val="2"/>
   </w:num>
-  <w:num w:numId="17" w16cid:durableId="1385983069">
-    <w:abstractNumId w:val="0"/>
+  <w:num w:numId="26" w16cid:durableId="239876368">
+    <w:abstractNumId w:val="25"/>
   </w:num>
 </w:numbering>
 </file>
@@ -5578,6 +9405,28 @@
     <w:qFormat/>
     <w:rsid w:val="00801671"/>
   </w:style>
+  <w:style w:type="paragraph" w:styleId="Heading3">
+    <w:name w:val="heading 3"/>
+    <w:basedOn w:val="Normal"/>
+    <w:link w:val="Heading3Char"/>
+    <w:uiPriority w:val="9"/>
+    <w:qFormat/>
+    <w:rsid w:val="007C3C44"/>
+    <w:pPr>
+      <w:spacing w:before="100" w:beforeAutospacing="1" w:after="100" w:afterAutospacing="1" w:line="240" w:lineRule="auto"/>
+      <w:outlineLvl w:val="2"/>
+    </w:pPr>
+    <w:rPr>
+      <w:rFonts w:ascii="Times New Roman" w:eastAsia="Times New Roman" w:hAnsi="Times New Roman" w:cs="Times New Roman"/>
+      <w:b/>
+      <w:bCs/>
+      <w:kern w:val="0"/>
+      <w:sz w:val="27"/>
+      <w:szCs w:val="27"/>
+      <w:lang w:eastAsia="en-IN"/>
+      <w14:ligatures w14:val="none"/>
+    </w:rPr>
+  </w:style>
   <w:style w:type="character" w:default="1" w:styleId="DefaultParagraphFont">
     <w:name w:val="Default Paragraph Font"/>
     <w:uiPriority w:val="1"/>
@@ -5673,6 +9522,23 @@
       <w:rFonts w:ascii="Courier New" w:eastAsia="Times New Roman" w:hAnsi="Courier New" w:cs="Courier New"/>
       <w:sz w:val="20"/>
       <w:szCs w:val="20"/>
+    </w:rPr>
+  </w:style>
+  <w:style w:type="character" w:customStyle="1" w:styleId="Heading3Char">
+    <w:name w:val="Heading 3 Char"/>
+    <w:basedOn w:val="DefaultParagraphFont"/>
+    <w:link w:val="Heading3"/>
+    <w:uiPriority w:val="9"/>
+    <w:rsid w:val="007C3C44"/>
+    <w:rPr>
+      <w:rFonts w:ascii="Times New Roman" w:eastAsia="Times New Roman" w:hAnsi="Times New Roman" w:cs="Times New Roman"/>
+      <w:b/>
+      <w:bCs/>
+      <w:kern w:val="0"/>
+      <w:sz w:val="27"/>
+      <w:szCs w:val="27"/>
+      <w:lang w:eastAsia="en-IN"/>
+      <w14:ligatures w14:val="none"/>
     </w:rPr>
   </w:style>
 </w:styles>

</xml_diff>